<commit_message>
Finalize whiteboard 1.0 exports and report guide
</commit_message>
<xml_diff>
--- a/docs/Collaboration_Board_Report_Guide.docx
+++ b/docs/Collaboration_Board_Report_Guide.docx
@@ -4,794 +4,1115 @@
   <w:body>
     <w:p>
       <w:pPr>
-        <w:widowControl/>
-        <w:spacing w:before="0" w:after="60" w:line="240" w:lineRule="auto"/>
+        <w:spacing w:before="160" w:after="60"/>
       </w:pPr>
       <w:r>
         <w:rPr>
-          <w:rFonts w:ascii="Calibri" w:hAnsi="Calibri" w:eastAsia="Calibri"/>
+          <w:rFonts w:ascii="Calibri" w:hAnsi="Calibri"/>
           <w:b/>
-          <w:i w:val="0"/>
-          <w:color w:val="2E74B5"/>
-          <w:sz w:val="42"/>
+          <w:color w:val="000000"/>
+          <w:sz w:val="48"/>
         </w:rPr>
-        <w:t>Collaboration Board: Report Update Guide</w:t>
+        <w:t>COLLABORATION BOARD 1.0</w:t>
       </w:r>
     </w:p>
     <w:p>
       <w:pPr>
-        <w:widowControl/>
-        <w:spacing w:before="0" w:after="200" w:line="240" w:lineRule="auto"/>
+        <w:spacing w:after="260"/>
       </w:pPr>
       <w:r>
         <w:rPr>
-          <w:rFonts w:ascii="Calibri" w:hAnsi="Calibri" w:eastAsia="Calibri"/>
-          <w:b w:val="0"/>
-          <w:i w:val="0"/>
-          <w:color w:val="5B6573"/>
-          <w:sz w:val="18"/>
+          <w:rFonts w:ascii="Calibri" w:hAnsi="Calibri"/>
+          <w:color w:val="3F4850"/>
+          <w:sz w:val="28"/>
         </w:rPr>
-        <w:t>Short technical basis for the group report  |  16 July 2026</w:t>
+        <w:t>Report update guide and technical handover</w:t>
+      </w:r>
+    </w:p>
+    <w:p>
+      <w:pPr>
+        <w:spacing w:after="40"/>
+      </w:pPr>
+      <w:r>
+        <w:rPr>
+          <w:rFonts w:ascii="Calibri" w:hAnsi="Calibri"/>
+          <w:b/>
+          <w:sz w:val="21"/>
+        </w:rPr>
+        <w:t xml:space="preserve">Compared: </w:t>
+      </w:r>
+      <w:r>
+        <w:rPr>
+          <w:rFonts w:ascii="Calibri" w:hAnsi="Calibri"/>
+          <w:sz w:val="21"/>
+        </w:rPr>
+        <w:t>DPI_Report-3.pdf, the earlier report draft, and three example project reports</w:t>
+      </w:r>
+    </w:p>
+    <w:p>
+      <w:pPr>
+        <w:spacing w:after="40"/>
+      </w:pPr>
+      <w:r>
+        <w:rPr>
+          <w:rFonts w:ascii="Calibri" w:hAnsi="Calibri"/>
+          <w:b/>
+          <w:sz w:val="21"/>
+        </w:rPr>
+        <w:t xml:space="preserve">Source of truth: </w:t>
+      </w:r>
+      <w:r>
+        <w:rPr>
+          <w:rFonts w:ascii="Calibri" w:hAnsi="Calibri"/>
+          <w:sz w:val="21"/>
+        </w:rPr>
+        <w:t>current main branch and both Android 1.0 builds</w:t>
+      </w:r>
+    </w:p>
+    <w:p>
+      <w:pPr>
+        <w:spacing w:after="40"/>
+      </w:pPr>
+      <w:r>
+        <w:rPr>
+          <w:rFonts w:ascii="Calibri" w:hAnsi="Calibri"/>
+          <w:b/>
+          <w:sz w:val="21"/>
+        </w:rPr>
+        <w:t xml:space="preserve">Remaining: </w:t>
+      </w:r>
+      <w:r>
+        <w:rPr>
+          <w:rFonts w:ascii="Calibri" w:hAnsi="Calibri"/>
+          <w:sz w:val="21"/>
+        </w:rPr>
+        <w:t>final two-phone BLE acceptance test and the report rewrite</w:t>
+      </w:r>
+    </w:p>
+    <w:p>
+      <w:pPr>
+        <w:spacing w:before="160" w:after="80"/>
+        <w:pBdr>
+          <w:bottom w:val="single" w:sz="10" w:space="1" w:color="2E74B5"/>
+        </w:pBdr>
+      </w:pPr>
+    </w:p>
+    <w:p>
+      <w:pPr>
+        <w:pStyle w:val="Heading1"/>
+      </w:pPr>
+      <w:r>
+        <w:t>1. Fast Update Checklist</w:t>
+      </w:r>
+    </w:p>
+    <w:p>
+      <w:pPr>
+        <w:spacing w:before="80" w:after="200"/>
+        <w:ind w:left="200" w:right="160"/>
+        <w:shd w:fill="EAF1FB"/>
+        <w:pBdr>
+          <w:left w:val="single" w:sz="20" w:space="8" w:color="2E74B5"/>
+        </w:pBdr>
+      </w:pPr>
+      <w:r>
+        <w:rPr>
+          <w:rFonts w:ascii="Calibri" w:hAnsi="Calibri"/>
+          <w:b/>
+          <w:color w:val="1F4D78"/>
+        </w:rPr>
+        <w:t xml:space="preserve">Core message. </w:t>
+      </w:r>
+      <w:r>
+        <w:rPr>
+          <w:rFonts w:ascii="Calibri" w:hAnsi="Calibri"/>
+        </w:rPr>
+        <w:t>This is a Tremola mini-app UI plus native Android storage, identity, security, and BLE code. It is not a standalone webpage and it is not only a manifest integration.</w:t>
+      </w:r>
+    </w:p>
+    <w:p>
+      <w:pPr>
+        <w:numPr>
+          <w:ilvl w:val="0"/>
+          <w:numId w:val="10"/>
+        </w:numPr>
+        <w:spacing w:after="80" w:line="300" w:lineRule="auto"/>
+      </w:pPr>
+      <w:r>
+        <w:rPr>
+          <w:rFonts w:ascii="Calibri" w:hAnsi="Calibri"/>
+        </w:rPr>
+        <w:t>Change “two devices” to “up to four feed identities per board”.</w:t>
+      </w:r>
+    </w:p>
+    <w:p>
+      <w:pPr>
+        <w:numPr>
+          <w:ilvl w:val="0"/>
+          <w:numId w:val="10"/>
+        </w:numPr>
+        <w:spacing w:after="80" w:line="300" w:lineRule="auto"/>
+      </w:pPr>
+      <w:r>
+        <w:rPr>
+          <w:rFonts w:ascii="Calibri" w:hAnsi="Calibri"/>
+        </w:rPr>
+        <w:t>Replace “real time” and “sync seamlessly” with “operation-based, eventually consistent BLE sync”.</w:t>
+      </w:r>
+    </w:p>
+    <w:p>
+      <w:pPr>
+        <w:numPr>
+          <w:ilvl w:val="0"/>
+          <w:numId w:val="10"/>
+        </w:numPr>
+        <w:spacing w:after="80" w:line="300" w:lineRule="auto"/>
+      </w:pPr>
+      <w:r>
+        <w:rPr>
+          <w:rFonts w:ascii="Calibri" w:hAnsi="Calibri"/>
+        </w:rPr>
+        <w:t>State that the Tremola build was much faster in current phone observations; tinySSB was slower and sometimes disconnected. Do not present this as a benchmark without measurements.</w:t>
+      </w:r>
+    </w:p>
+    <w:p>
+      <w:pPr>
+        <w:numPr>
+          <w:ilvl w:val="0"/>
+          <w:numId w:val="10"/>
+        </w:numPr>
+        <w:spacing w:after="80" w:line="300" w:lineRule="auto"/>
+      </w:pPr>
+      <w:r>
+        <w:rPr>
+          <w:rFonts w:ascii="Calibri" w:hAnsi="Calibri"/>
+        </w:rPr>
+        <w:t>Remove Protected Mode, ownership rules, and the old o/p event types. Every accepted member can edit every object.</w:t>
+      </w:r>
+    </w:p>
+    <w:p>
+      <w:pPr>
+        <w:numPr>
+          <w:ilvl w:val="0"/>
+          <w:numId w:val="10"/>
+        </w:numPr>
+        <w:spacing w:after="80" w:line="300" w:lineRule="auto"/>
+      </w:pPr>
+      <w:r>
+        <w:rPr>
+          <w:rFonts w:ascii="Calibri" w:hAnsi="Calibri"/>
+        </w:rPr>
+        <w:t>Use the current events: s stroke, t text, m move/resize, k color, d delete, c clear, n board name. x is legacy input only.</w:t>
+      </w:r>
+    </w:p>
+    <w:p>
+      <w:pPr>
+        <w:numPr>
+          <w:ilvl w:val="0"/>
+          <w:numId w:val="10"/>
+        </w:numPr>
+        <w:spacing w:after="80" w:line="300" w:lineRule="auto"/>
+      </w:pPr>
+      <w:r>
+        <w:rPr>
+          <w:rFonts w:ascii="Calibri" w:hAnsi="Calibri"/>
+        </w:rPr>
+        <w:t>Correct “no Tremola core changes”: the final Tremola APK changes the WebView bridge, Room database, BLE transport, permissions, and Android activity.</w:t>
+      </w:r>
+    </w:p>
+    <w:p>
+      <w:pPr>
+        <w:numPr>
+          <w:ilvl w:val="0"/>
+          <w:numId w:val="10"/>
+        </w:numPr>
+        <w:spacing w:after="80" w:line="300" w:lineRule="auto"/>
+      </w:pPr>
+      <w:r>
+        <w:rPr>
+          <w:rFonts w:ascii="Calibri" w:hAnsi="Calibri"/>
+        </w:rPr>
+        <w:t>Separate the two hosts: Tremola uses a custom reliable board transport; tinySSB uses public WBD feed events and signed contact invitations.</w:t>
+      </w:r>
+    </w:p>
+    <w:p>
+      <w:pPr>
+        <w:numPr>
+          <w:ilvl w:val="0"/>
+          <w:numId w:val="10"/>
+        </w:numPr>
+        <w:spacing w:after="80" w:line="300" w:lineRule="auto"/>
+      </w:pPr>
+      <w:r>
+        <w:rPr>
+          <w:rFonts w:ascii="Calibri" w:hAnsi="Calibri"/>
+        </w:rPr>
+        <w:t>Correct the recovery interval from eight seconds to about five seconds in Tremola.</w:t>
+      </w:r>
+    </w:p>
+    <w:p>
+      <w:pPr>
+        <w:numPr>
+          <w:ilvl w:val="0"/>
+          <w:numId w:val="10"/>
+        </w:numPr>
+        <w:spacing w:after="80" w:line="300" w:lineRule="auto"/>
+      </w:pPr>
+      <w:r>
+        <w:rPr>
+          <w:rFonts w:ascii="Calibri" w:hAnsi="Calibri"/>
+        </w:rPr>
+        <w:t>Describe the six-digit Tremola code as a shared access code, not strong authentication. SHA-256 does not add entropy to six digits.</w:t>
+      </w:r>
+    </w:p>
+    <w:p>
+      <w:pPr>
+        <w:numPr>
+          <w:ilvl w:val="0"/>
+          <w:numId w:val="10"/>
+        </w:numPr>
+        <w:spacing w:after="80" w:line="300" w:lineRule="auto"/>
+      </w:pPr>
+      <w:r>
+        <w:rPr>
+          <w:rFonts w:ascii="Calibri" w:hAnsi="Calibri"/>
+        </w:rPr>
+        <w:t>State that Clear is immediate and has no undo. JPEG/PDF export is local in both variants and does not sync.</w:t>
+      </w:r>
+    </w:p>
+    <w:p>
+      <w:pPr>
+        <w:numPr>
+          <w:ilvl w:val="0"/>
+          <w:numId w:val="10"/>
+        </w:numPr>
+        <w:spacing w:after="80" w:line="300" w:lineRule="auto"/>
+      </w:pPr>
+      <w:r>
+        <w:rPr>
+          <w:rFonts w:ascii="Calibri" w:hAnsi="Calibri"/>
+        </w:rPr>
+        <w:t>Keep automated tests, emulator checks, and real-phone BLE tests as three separate evidence levels.</w:t>
+      </w:r>
+    </w:p>
+    <w:p>
+      <w:pPr>
+        <w:numPr>
+          <w:ilvl w:val="0"/>
+          <w:numId w:val="10"/>
+        </w:numPr>
+        <w:spacing w:after="80" w:line="300" w:lineRule="auto"/>
+      </w:pPr>
+      <w:r>
+        <w:rPr>
+          <w:rFonts w:ascii="Calibri" w:hAnsi="Calibri"/>
+        </w:rPr>
+        <w:t>Do not infer which teammate used an AI tool from code style. List only tools the team actually used and their purpose.</w:t>
+      </w:r>
+    </w:p>
+    <w:p>
+      <w:pPr>
+        <w:pStyle w:val="Heading1"/>
+        <w:pageBreakBefore/>
+      </w:pPr>
+      <w:r>
+        <w:t>2. How to Update the Report</w:t>
+      </w:r>
+    </w:p>
+    <w:p>
+      <w:r>
+        <w:rPr>
+          <w:rFonts w:ascii="Calibri" w:hAnsi="Calibri"/>
+          <w:b/>
+          <w:color w:val="1F4D78"/>
+        </w:rPr>
+        <w:t xml:space="preserve">Introduction. </w:t>
+      </w:r>
+      <w:r>
+        <w:rPr>
+          <w:rFonts w:ascii="Calibri" w:hAnsi="Calibri"/>
+        </w:rPr>
+        <w:t>Describe a collaborative, finite whiteboard inside Tremola for Android. Say that up to four nearby identities can draw, add text, move, resize, recolor, delete, and clear while offline. Avoid promising instant delivery.</w:t>
+      </w:r>
+    </w:p>
+    <w:p>
+      <w:r>
+        <w:rPr>
+          <w:rFonts w:ascii="Calibri" w:hAnsi="Calibri"/>
+          <w:b/>
+          <w:color w:val="1F4D78"/>
+        </w:rPr>
+        <w:t xml:space="preserve">Background. </w:t>
+      </w:r>
+      <w:r>
+        <w:rPr>
+          <w:rFonts w:ascii="Calibri" w:hAnsi="Calibri"/>
+        </w:rPr>
+        <w:t>Keep Tremola, WebView mini-apps, SSB, BLE, and tinySSB separate. Tremola for Chrome was Max's browser prototype and test harness; it was not Google integration and it was not the final Android transport.</w:t>
+      </w:r>
+    </w:p>
+    <w:p>
+      <w:r>
+        <w:rPr>
+          <w:rFonts w:ascii="Calibri" w:hAnsi="Calibri"/>
+          <w:b/>
+          <w:color w:val="1F4D78"/>
+        </w:rPr>
+        <w:t xml:space="preserve">Architecture. </w:t>
+      </w:r>
+      <w:r>
+        <w:rPr>
+          <w:rFonts w:ascii="Calibri" w:hAnsi="Calibri"/>
+        </w:rPr>
+        <w:t>Show two layers: HTML/CSS/JavaScript in the WebView and Kotlin for identity, Room storage, board access, export, and BLE. The current Figure 1 should no longer imply that every board operation is accepted only after a full SSB feed-chain check.</w:t>
+      </w:r>
+    </w:p>
+    <w:p>
+      <w:r>
+        <w:rPr>
+          <w:rFonts w:ascii="Calibri" w:hAnsi="Calibri"/>
+          <w:b/>
+          <w:color w:val="1F4D78"/>
+        </w:rPr>
+        <w:t xml:space="preserve">Data model. </w:t>
+      </w:r>
+      <w:r>
+        <w:rPr>
+          <w:rFonts w:ascii="Calibri" w:hAnsi="Calibri"/>
+        </w:rPr>
+        <w:t>Explain immutable operations and deterministic replay. Add k, d, and n; remove o and p. State that the board is 1800 x 2400 logical units and that pan, zoom, dark view, and export are local UI state.</w:t>
+      </w:r>
+    </w:p>
+    <w:p>
+      <w:r>
+        <w:rPr>
+          <w:rFonts w:ascii="Calibri" w:hAnsi="Calibri"/>
+          <w:b/>
+          <w:color w:val="1F4D78"/>
+        </w:rPr>
+        <w:t xml:space="preserve">Identity and security. </w:t>
+      </w:r>
+      <w:r>
+        <w:rPr>
+          <w:rFonts w:ascii="Calibri" w:hAnsi="Calibri"/>
+        </w:rPr>
+        <w:t>Tremola uses an Ed25519 feed identity. Display names are labels. Tremola board payloads are signed and AES-GCM encrypted, but the six-digit code is weak. tinySSB WBD events are signed but public and not encrypted.</w:t>
+      </w:r>
+    </w:p>
+    <w:p>
+      <w:r>
+        <w:rPr>
+          <w:rFonts w:ascii="Calibri" w:hAnsi="Calibri"/>
+          <w:b/>
+          <w:color w:val="1F4D78"/>
+        </w:rPr>
+        <w:t xml:space="preserve">Conflict resolution. </w:t>
+      </w:r>
+      <w:r>
+        <w:rPr>
+          <w:rFonts w:ascii="Calibri" w:hAnsi="Calibri"/>
+        </w:rPr>
+        <w:t>Duplicates are ignored. Operations may arrive in any order. Lamport order plus event ID resolves competing modifications. Move/resize can wait for a missing target. There is no master phone and no Protected Mode.</w:t>
+      </w:r>
+    </w:p>
+    <w:p>
+      <w:r>
+        <w:rPr>
+          <w:rFonts w:ascii="Calibri" w:hAnsi="Calibri"/>
+          <w:b/>
+          <w:color w:val="1F4D78"/>
+        </w:rPr>
+        <w:t xml:space="preserve">BLE transport. </w:t>
+      </w:r>
+      <w:r>
+        <w:rPr>
+          <w:rFonts w:ascii="Calibri" w:hAnsi="Calibri"/>
+        </w:rPr>
+        <w:t>For Tremola, describe board-only queues, compression, MTU-safe frames, one-at-a-time GATT writes, operation ACK, retry, five-second frontier exchange, WANT ranges, and relay. Explain tinySSB separately.</w:t>
+      </w:r>
+    </w:p>
+    <w:p>
+      <w:r>
+        <w:rPr>
+          <w:rFonts w:ascii="Calibri" w:hAnsi="Calibri"/>
+          <w:b/>
+          <w:color w:val="1F4D78"/>
+        </w:rPr>
+        <w:t xml:space="preserve">Results and conclusion. </w:t>
+      </w:r>
+      <w:r>
+        <w:rPr>
+          <w:rFonts w:ascii="Calibri" w:hAnsi="Calibri"/>
+        </w:rPr>
+        <w:t>Add a small test table with device, Android version, action, expected result, observed result, and wait time. Only claim success for the exact 1.0 APK that passed. Keep remaining tinySSB slowness and the four-phone test gap as limitations.</w:t>
+      </w:r>
+    </w:p>
+    <w:p>
+      <w:pPr>
+        <w:pStyle w:val="Heading2"/>
+      </w:pPr>
+      <w:r>
+        <w:t>3. Methodology That Fits This Project</w:t>
+      </w:r>
+    </w:p>
+    <w:p>
+      <w:pPr>
+        <w:numPr>
+          <w:ilvl w:val="0"/>
+          <w:numId w:val="12"/>
+        </w:numPr>
+        <w:spacing w:after="80" w:line="300" w:lineRule="auto"/>
+      </w:pPr>
+      <w:r>
+        <w:rPr>
+          <w:rFonts w:ascii="Calibri" w:hAnsi="Calibri"/>
+        </w:rPr>
+        <w:t>Requirements: offline BLE, Tremola integration, finite mobile canvas, saved boards, and deterministic merge.</w:t>
+      </w:r>
+    </w:p>
+    <w:p>
+      <w:pPr>
+        <w:numPr>
+          <w:ilvl w:val="0"/>
+          <w:numId w:val="12"/>
+        </w:numPr>
+        <w:spacing w:after="80" w:line="300" w:lineRule="auto"/>
+      </w:pPr>
+      <w:r>
+        <w:rPr>
+          <w:rFonts w:ascii="Calibri" w:hAnsi="Calibri"/>
+        </w:rPr>
+        <w:t>Prototype: use Max's Tremola-for-Chrome version to iterate on drawing, text, drag, resize, and layout.</w:t>
+      </w:r>
+    </w:p>
+    <w:p>
+      <w:pPr>
+        <w:numPr>
+          <w:ilvl w:val="0"/>
+          <w:numId w:val="12"/>
+        </w:numPr>
+        <w:spacing w:after="80" w:line="300" w:lineRule="auto"/>
+      </w:pPr>
+      <w:r>
+        <w:rPr>
+          <w:rFonts w:ascii="Calibri" w:hAnsi="Calibri"/>
+        </w:rPr>
+        <w:t>Android integration: bundle the mini-app, add the JavaScript/Kotlin bridge, Room operations, identities, permissions, and APK packaging.</w:t>
+      </w:r>
+    </w:p>
+    <w:p>
+      <w:pPr>
+        <w:numPr>
+          <w:ilvl w:val="0"/>
+          <w:numId w:val="12"/>
+        </w:numPr>
+        <w:spacing w:after="80" w:line="300" w:lineRule="auto"/>
+      </w:pPr>
+      <w:r>
+        <w:rPr>
+          <w:rFonts w:ascii="Calibri" w:hAnsi="Calibri"/>
+        </w:rPr>
+        <w:t>Failure reproduction: test on real phones and isolate why Clear arrived while large strokes, text, move, and resize were lost.</w:t>
+      </w:r>
+    </w:p>
+    <w:p>
+      <w:pPr>
+        <w:numPr>
+          <w:ilvl w:val="0"/>
+          <w:numId w:val="12"/>
+        </w:numPr>
+        <w:spacing w:after="80" w:line="300" w:lineRule="auto"/>
+      </w:pPr>
+      <w:r>
+        <w:rPr>
+          <w:rFonts w:ascii="Calibri" w:hAnsi="Calibri"/>
+        </w:rPr>
+        <w:t>Reliability redesign: use compact board-only operations, compression, ACK/retry, frontiers, WANT ranges, persistent pending work, and deterministic replay.</w:t>
+      </w:r>
+    </w:p>
+    <w:p>
+      <w:pPr>
+        <w:numPr>
+          <w:ilvl w:val="0"/>
+          <w:numId w:val="12"/>
+        </w:numPr>
+        <w:spacing w:after="80" w:line="300" w:lineRule="auto"/>
+      </w:pPr>
+      <w:r>
+        <w:rPr>
+          <w:rFonts w:ascii="Calibri" w:hAnsi="Calibri"/>
+        </w:rPr>
+        <w:t>Second host: adapt the same UI and merge rules to official tinySSB WBD events, verified-contact invitations, and packet recovery.</w:t>
+      </w:r>
+    </w:p>
+    <w:p>
+      <w:pPr>
+        <w:numPr>
+          <w:ilvl w:val="0"/>
+          <w:numId w:val="12"/>
+        </w:numPr>
+        <w:spacing w:after="80" w:line="300" w:lineRule="auto"/>
+      </w:pPr>
+      <w:r>
+        <w:rPr>
+          <w:rFonts w:ascii="Calibri" w:hAnsi="Calibri"/>
+        </w:rPr>
+        <w:t>Validation: run JavaScript/Kotlin/lint/build checks, then a controlled Galaxy S9/S10 BLE test with Wi-Fi and mobile data off.</w:t>
+      </w:r>
+    </w:p>
+    <w:p>
+      <w:pPr>
+        <w:spacing w:before="80" w:after="200"/>
+        <w:ind w:left="200" w:right="160"/>
+        <w:shd w:fill="EAF1FB"/>
+        <w:pBdr>
+          <w:left w:val="single" w:sz="20" w:space="8" w:color="2E74B5"/>
+        </w:pBdr>
+      </w:pPr>
+      <w:r>
+        <w:rPr>
+          <w:rFonts w:ascii="Calibri" w:hAnsi="Calibri"/>
+          <w:b/>
+          <w:color w:val="1F4D78"/>
+        </w:rPr>
+        <w:t xml:space="preserve">Structure tip. </w:t>
+      </w:r>
+      <w:r>
+        <w:rPr>
+          <w:rFonts w:ascii="Calibri" w:hAnsi="Calibri"/>
+        </w:rPr>
+        <w:t>The example reports separate development process, results, challenges, and lessons learned. Keep Methodology for what you did and how you tested; place measured outcomes in Results/Discussion.</w:t>
+      </w:r>
+    </w:p>
+    <w:p>
+      <w:pPr>
+        <w:pStyle w:val="Heading1"/>
+      </w:pPr>
+      <w:r>
+        <w:t>4. Technical Basis for the Report</w:t>
+      </w:r>
+    </w:p>
+    <w:p>
+      <w:pPr>
+        <w:pStyle w:val="Heading2"/>
+      </w:pPr>
+      <w:r>
+        <w:t>Tremola operation flow</w:t>
+      </w:r>
+    </w:p>
+    <w:p>
+      <w:pPr>
+        <w:numPr>
+          <w:ilvl w:val="0"/>
+          <w:numId w:val="13"/>
+        </w:numPr>
+        <w:spacing w:after="80" w:line="300" w:lineRule="auto"/>
+      </w:pPr>
+      <w:r>
+        <w:rPr>
+          <w:rFonts w:ascii="Calibri" w:hAnsi="Calibri"/>
+        </w:rPr>
+        <w:t>A completed draw, text, edit, delete, color, name, or clear action becomes one JSON operation.</w:t>
+      </w:r>
+    </w:p>
+    <w:p>
+      <w:pPr>
+        <w:numPr>
+          <w:ilvl w:val="0"/>
+          <w:numId w:val="13"/>
+        </w:numPr>
+        <w:spacing w:after="80" w:line="300" w:lineRule="auto"/>
+      </w:pPr>
+      <w:r>
+        <w:rPr>
+          <w:rFonts w:ascii="Calibri" w:hAnsi="Calibri"/>
+        </w:rPr>
+        <w:t>The WebView bridge sends it to Kotlin. Android assigns stable author/sequence data, signs it, and stores it in Room before BLE delivery.</w:t>
+      </w:r>
+    </w:p>
+    <w:p>
+      <w:pPr>
+        <w:numPr>
+          <w:ilvl w:val="0"/>
+          <w:numId w:val="13"/>
+        </w:numPr>
+        <w:spacing w:after="80" w:line="300" w:lineRule="auto"/>
+      </w:pPr>
+      <w:r>
+        <w:rPr>
+          <w:rFonts w:ascii="Calibri" w:hAnsi="Calibri"/>
+        </w:rPr>
+        <w:t>The board payload is compressed when useful, encrypted with the board key, and split into MTU-safe frames.</w:t>
+      </w:r>
+    </w:p>
+    <w:p>
+      <w:pPr>
+        <w:numPr>
+          <w:ilvl w:val="0"/>
+          <w:numId w:val="13"/>
+        </w:numPr>
+        <w:spacing w:after="80" w:line="300" w:lineRule="auto"/>
+      </w:pPr>
+      <w:r>
+        <w:rPr>
+          <w:rFonts w:ascii="Calibri" w:hAnsi="Calibri"/>
+        </w:rPr>
+        <w:t>GATT sends one frame at a time. A complete operation needs an ACK; missing work remains pending and is retried.</w:t>
+      </w:r>
+    </w:p>
+    <w:p>
+      <w:pPr>
+        <w:numPr>
+          <w:ilvl w:val="0"/>
+          <w:numId w:val="13"/>
+        </w:numPr>
+        <w:spacing w:after="80" w:line="300" w:lineRule="auto"/>
+      </w:pPr>
+      <w:r>
+        <w:rPr>
+          <w:rFonts w:ascii="Calibri" w:hAnsi="Calibri"/>
+        </w:rPr>
+        <w:t>Peers compare per-author frontiers about every five seconds and request missing sequence ranges.</w:t>
+      </w:r>
+    </w:p>
+    <w:p>
+      <w:pPr>
+        <w:numPr>
+          <w:ilvl w:val="0"/>
+          <w:numId w:val="13"/>
+        </w:numPr>
+        <w:spacing w:after="80" w:line="300" w:lineRule="auto"/>
+      </w:pPr>
+      <w:r>
+        <w:rPr>
+          <w:rFonts w:ascii="Calibri" w:hAnsi="Calibri"/>
+        </w:rPr>
+        <w:t>The receiver verifies and stores the operation. JavaScript replays the set deterministically and redraws the merged board.</w:t>
+      </w:r>
+    </w:p>
+    <w:p>
+      <w:pPr>
+        <w:pStyle w:val="Heading2"/>
+      </w:pPr>
+      <w:r>
+        <w:t>Why the old mobile sync failed</w:t>
       </w:r>
     </w:p>
     <w:tbl>
       <w:tblPr>
-        <w:tblW w:type="dxa" w:w="9360"/>
-        <w:jc w:val="center"/>
+        <w:tblStyle w:val="TableGrid"/>
+        <w:tblW w:type="dxa" w:w="9026"/>
+        <w:jc w:val="left"/>
+        <w:tblLayout w:type="fixed"/>
         <w:tblLook w:firstColumn="1" w:firstRow="1" w:lastColumn="0" w:lastRow="0" w:noHBand="0" w:noVBand="1" w:val="04A0"/>
-        <w:tblLayout w:type="fixed"/>
+        <w:tblInd w:w="120" w:type="dxa"/>
       </w:tblPr>
       <w:tblGrid>
-        <w:gridCol w:w="9360"/>
+        <w:gridCol w:w="1900"/>
+        <w:gridCol w:w="3450"/>
+        <w:gridCol w:w="3676"/>
       </w:tblGrid>
       <w:tr>
+        <w:trPr>
+          <w:tblHeader w:val="true"/>
+        </w:trPr>
         <w:tc>
           <w:tcPr>
-            <w:tcW w:type="dxa" w:w="5943600"/>
-            <w:shd w:fill="2E74B5"/>
-          </w:tcPr>
-          <w:p>
-            <w:r/>
-          </w:p>
-        </w:tc>
-      </w:tr>
-    </w:tbl>
-    <w:p>
-      <w:pPr>
-        <w:widowControl/>
-        <w:spacing w:before="0" w:after="40" w:line="240" w:lineRule="auto"/>
-      </w:pPr>
-    </w:p>
-    <w:p>
-      <w:pPr>
-        <w:keepNext/>
-        <w:widowControl/>
-        <w:spacing w:before="100" w:after="60" w:line="240" w:lineRule="auto"/>
-      </w:pPr>
-      <w:r>
-        <w:rPr>
-          <w:rFonts w:ascii="Calibri" w:hAnsi="Calibri" w:eastAsia="Calibri"/>
-          <w:b/>
-          <w:i w:val="0"/>
-          <w:color w:val="2E74B5"/>
-          <w:sz w:val="26"/>
-        </w:rPr>
-        <w:t>Current build</w:t>
-      </w:r>
-    </w:p>
-    <w:p>
-      <w:pPr>
-        <w:pStyle w:val="ListBullet"/>
-        <w:widowControl/>
-        <w:spacing w:before="0" w:after="40" w:line="259" w:lineRule="auto"/>
-        <w:ind w:left="360" w:hanging="216"/>
-      </w:pPr>
-      <w:r>
-        <w:rPr>
-          <w:rFonts w:ascii="Calibri" w:hAnsi="Calibri" w:eastAsia="Calibri"/>
-          <w:b w:val="0"/>
-          <w:i w:val="0"/>
-          <w:color w:val="1F2937"/>
-          <w:sz w:val="19"/>
-        </w:rPr>
-        <w:t>The board is a mini-app inside the full Uni Basel Tremola Android app, not a standalone app.</w:t>
-      </w:r>
-    </w:p>
-    <w:p>
-      <w:pPr>
-        <w:pStyle w:val="ListBullet"/>
-        <w:widowControl/>
-        <w:spacing w:before="0" w:after="40" w:line="259" w:lineRule="auto"/>
-        <w:ind w:left="360" w:hanging="216"/>
-      </w:pPr>
-      <w:r>
-        <w:rPr>
-          <w:rFonts w:ascii="Calibri" w:hAnsi="Calibri" w:eastAsia="Calibri"/>
-          <w:b w:val="0"/>
-          <w:i w:val="0"/>
-          <w:color w:val="1F2937"/>
-          <w:sz w:val="19"/>
-        </w:rPr>
-        <w:t>The main APK is Tremola 0.9.6 and supports Android 7.0+. The tinySSB APK is a separate Android 8.0+ experiment.</w:t>
-      </w:r>
-    </w:p>
-    <w:p>
-      <w:pPr>
-        <w:pStyle w:val="ListBullet"/>
-        <w:widowControl/>
-        <w:spacing w:before="0" w:after="40" w:line="259" w:lineRule="auto"/>
-        <w:ind w:left="360" w:hanging="216"/>
-      </w:pPr>
-      <w:r>
-        <w:rPr>
-          <w:rFonts w:ascii="Calibri" w:hAnsi="Calibri" w:eastAsia="Calibri"/>
-          <w:b w:val="0"/>
-          <w:i w:val="0"/>
-          <w:color w:val="1F2937"/>
-          <w:sz w:val="19"/>
-        </w:rPr>
-        <w:t>The finite 1800 x 2400 canvas supports draw, text, move, resize, recolor, delete, clear, pan and pinch zoom.</w:t>
-      </w:r>
-    </w:p>
-    <w:p>
-      <w:pPr>
-        <w:pStyle w:val="ListBullet"/>
-        <w:widowControl/>
-        <w:spacing w:before="0" w:after="40" w:line="259" w:lineRule="auto"/>
-        <w:ind w:left="360" w:hanging="216"/>
-      </w:pPr>
-      <w:r>
-        <w:rPr>
-          <w:rFonts w:ascii="Calibri" w:hAnsi="Calibri" w:eastAsia="Calibri"/>
-          <w:b w:val="0"/>
-          <w:i w:val="0"/>
-          <w:color w:val="1F2937"/>
-          <w:sz w:val="19"/>
-        </w:rPr>
-        <w:t>Boards, operations, names and known members are stored locally and survive closing the app.</w:t>
-      </w:r>
-    </w:p>
-    <w:p>
-      <w:pPr>
-        <w:pStyle w:val="ListBullet"/>
-        <w:widowControl/>
-        <w:spacing w:before="0" w:after="40" w:line="259" w:lineRule="auto"/>
-        <w:ind w:left="360" w:hanging="216"/>
-      </w:pPr>
-      <w:r>
-        <w:rPr>
-          <w:rFonts w:ascii="Calibri" w:hAnsi="Calibri" w:eastAsia="Calibri"/>
-          <w:b w:val="0"/>
-          <w:i w:val="0"/>
-          <w:color w:val="1F2937"/>
-          <w:sz w:val="19"/>
-        </w:rPr>
-        <w:t>Each phone keeps up to four Tremola feed identities for a board. Display names are labels, not identities.</w:t>
-      </w:r>
-    </w:p>
-    <w:p>
-      <w:pPr>
-        <w:pStyle w:val="ListBullet"/>
-        <w:widowControl/>
-        <w:spacing w:before="0" w:after="40" w:line="259" w:lineRule="auto"/>
-        <w:ind w:left="360" w:hanging="216"/>
-      </w:pPr>
-      <w:r>
-        <w:rPr>
-          <w:rFonts w:ascii="Calibri" w:hAnsi="Calibri" w:eastAsia="Calibri"/>
-          <w:b w:val="0"/>
-          <w:i w:val="0"/>
-          <w:color w:val="1F2937"/>
-          <w:sz w:val="19"/>
-        </w:rPr>
-        <w:t>A finished action is stored first, queued immediately, acknowledged, retried and recovered through five-second frontier/WANT exchange.</w:t>
-      </w:r>
-    </w:p>
-    <w:p>
-      <w:pPr>
-        <w:pStyle w:val="ListBullet"/>
-        <w:widowControl/>
-        <w:spacing w:before="0" w:after="40" w:line="259" w:lineRule="auto"/>
-        <w:ind w:left="360" w:hanging="216"/>
-      </w:pPr>
-      <w:r>
-        <w:rPr>
-          <w:rFonts w:ascii="Calibri" w:hAnsi="Calibri" w:eastAsia="Calibri"/>
-          <w:b w:val="0"/>
-          <w:i w:val="0"/>
-          <w:color w:val="1F2937"/>
-          <w:sz w:val="19"/>
-        </w:rPr>
-        <w:t>All phones apply the same operation set with deterministic Lamport-order rules. There is no permanent master phone.</w:t>
-      </w:r>
-    </w:p>
-    <w:p>
-      <w:pPr>
-        <w:pStyle w:val="ListBullet"/>
-        <w:widowControl/>
-        <w:spacing w:before="0" w:after="40" w:line="259" w:lineRule="auto"/>
-        <w:ind w:left="360" w:hanging="216"/>
-      </w:pPr>
-      <w:r>
-        <w:rPr>
-          <w:rFonts w:ascii="Calibri" w:hAnsi="Calibri" w:eastAsia="Calibri"/>
-          <w:b w:val="0"/>
-          <w:i w:val="0"/>
-          <w:color w:val="1F2937"/>
-          <w:sz w:val="19"/>
-        </w:rPr>
-        <w:t>The browser build verifies UI and merge logic only. The final evidence must come from the Galaxy S9/S10 BLE test with Wi-Fi and mobile data off.</w:t>
-      </w:r>
-    </w:p>
-    <w:p>
-      <w:pPr>
-        <w:keepNext/>
-        <w:widowControl/>
-        <w:spacing w:before="100" w:after="60" w:line="240" w:lineRule="auto"/>
-      </w:pPr>
-      <w:r>
-        <w:rPr>
-          <w:rFonts w:ascii="Calibri" w:hAnsi="Calibri" w:eastAsia="Calibri"/>
-          <w:b/>
-          <w:i w:val="0"/>
-          <w:color w:val="2E74B5"/>
-          <w:sz w:val="26"/>
-        </w:rPr>
-        <w:t>Six-digit code</w:t>
-      </w:r>
-    </w:p>
-    <w:p>
-      <w:pPr>
-        <w:pStyle w:val="ListBullet"/>
-        <w:widowControl/>
-        <w:spacing w:before="0" w:after="40" w:line="259" w:lineRule="auto"/>
-        <w:ind w:left="360" w:hanging="216"/>
-      </w:pPr>
-      <w:r>
-        <w:rPr>
-          <w:rFonts w:ascii="Calibri" w:hAnsi="Calibri" w:eastAsia="Calibri"/>
-          <w:b w:val="0"/>
-          <w:i w:val="0"/>
-          <w:color w:val="1F2937"/>
-          <w:sz w:val="19"/>
-        </w:rPr>
-        <w:t>Tremola creates a code from 000000 to 999999. The direct room ID is code-&lt;six digits&gt;-v1.</w:t>
-      </w:r>
-    </w:p>
-    <w:p>
-      <w:pPr>
-        <w:pStyle w:val="ListBullet"/>
-        <w:widowControl/>
-        <w:spacing w:before="0" w:after="40" w:line="259" w:lineRule="auto"/>
-        <w:ind w:left="360" w:hanging="216"/>
-      </w:pPr>
-      <w:r>
-        <w:rPr>
-          <w:rFonts w:ascii="Calibri" w:hAnsi="Calibri" w:eastAsia="Calibri"/>
-          <w:b w:val="0"/>
-          <w:i w:val="0"/>
-          <w:color w:val="1F2937"/>
-          <w:sz w:val="19"/>
-        </w:rPr>
-        <w:t>SHA-256 derives a 32-byte key; AES-256-GCM encrypts payloads; Ed25519 signs every operation.</w:t>
-      </w:r>
-    </w:p>
-    <w:p>
-      <w:pPr>
-        <w:pStyle w:val="ListBullet"/>
-        <w:widowControl/>
-        <w:spacing w:before="0" w:after="40" w:line="259" w:lineRule="auto"/>
-        <w:ind w:left="360" w:hanging="216"/>
-      </w:pPr>
-      <w:r>
-        <w:rPr>
-          <w:rFonts w:ascii="Calibri" w:hAnsi="Calibri" w:eastAsia="Calibri"/>
-          <w:b w:val="0"/>
-          <w:i w:val="0"/>
-          <w:color w:val="1F2937"/>
-          <w:sz w:val="19"/>
-        </w:rPr>
-        <w:t>Six digits still have only one million possibilities, and the room ID contains the code. Describe it as a shared access code, not strong authentication or strong privacy.</w:t>
-      </w:r>
-    </w:p>
-    <w:p>
-      <w:pPr>
-        <w:pStyle w:val="ListBullet"/>
-        <w:widowControl/>
-        <w:spacing w:before="0" w:after="40" w:line="259" w:lineRule="auto"/>
-        <w:ind w:left="360" w:hanging="216"/>
-      </w:pPr>
-      <w:r>
-        <w:rPr>
-          <w:rFonts w:ascii="Calibri" w:hAnsi="Calibri" w:eastAsia="Calibri"/>
-          <w:b w:val="0"/>
-          <w:i w:val="0"/>
-          <w:color w:val="1F2937"/>
-          <w:sz w:val="19"/>
-        </w:rPr>
-        <w:t>tinySSB maps the code with a small deterministic hash. Its WBD events are public and its four-person label is not a hard limit.</w:t>
-      </w:r>
-    </w:p>
-    <w:p>
-      <w:pPr>
-        <w:keepNext/>
-        <w:widowControl/>
-        <w:spacing w:before="100" w:after="60" w:line="240" w:lineRule="auto"/>
-      </w:pPr>
-      <w:r>
-        <w:rPr>
-          <w:rFonts w:ascii="Calibri" w:hAnsi="Calibri" w:eastAsia="Calibri"/>
-          <w:b/>
-          <w:i w:val="0"/>
-          <w:color w:val="2E74B5"/>
-          <w:sz w:val="26"/>
-        </w:rPr>
-        <w:t>What changed from Max's prototype</w:t>
-      </w:r>
-    </w:p>
-    <w:p>
-      <w:pPr>
-        <w:widowControl/>
-        <w:spacing w:before="0" w:after="60" w:line="269" w:lineRule="auto"/>
-      </w:pPr>
-      <w:r>
-        <w:rPr>
-          <w:rFonts w:ascii="Calibri" w:hAnsi="Calibri" w:eastAsia="Calibri"/>
-          <w:b/>
-          <w:i w:val="0"/>
-          <w:color w:val="1F2937"/>
-          <w:sz w:val="20"/>
-        </w:rPr>
-        <w:t>Kept:</w:t>
-      </w:r>
-      <w:r>
-        <w:rPr>
-          <w:rFonts w:ascii="Calibri" w:hAnsi="Calibri" w:eastAsia="Calibri"/>
-          <w:b w:val="0"/>
-          <w:i w:val="0"/>
-          <w:color w:val="1F2937"/>
-          <w:sz w:val="20"/>
-        </w:rPr>
-        <w:t xml:space="preserve"> Tremola-for-Chrome development setup, mini-app structure, basic canvas, draw/text, object IDs, drag, resize and recolor.</w:t>
-      </w:r>
-    </w:p>
-    <w:p>
-      <w:pPr>
-        <w:widowControl/>
-        <w:spacing w:before="0" w:after="60" w:line="269" w:lineRule="auto"/>
-      </w:pPr>
-      <w:r>
-        <w:rPr>
-          <w:rFonts w:ascii="Calibri" w:hAnsi="Calibri" w:eastAsia="Calibri"/>
-          <w:b/>
-          <w:i w:val="0"/>
-          <w:color w:val="1F2937"/>
-          <w:sz w:val="20"/>
-        </w:rPr>
-        <w:t>Added:</w:t>
-      </w:r>
-      <w:r>
-        <w:rPr>
-          <w:rFonts w:ascii="Calibri" w:hAnsi="Calibri" w:eastAsia="Calibri"/>
-          <w:b w:val="0"/>
-          <w:i w:val="0"/>
-          <w:color w:val="1F2937"/>
-          <w:sz w:val="20"/>
-        </w:rPr>
-        <w:t xml:space="preserve"> full Android integration, mobile canvas and gestures, saved boards, codes and identities, Room persistence, signed/encrypted operations, reliable board-only BLE recovery and the separate tinySSB build.</w:t>
-      </w:r>
-    </w:p>
-    <w:p>
-      <w:r>
-        <w:br w:type="page"/>
-      </w:r>
-    </w:p>
-    <w:p>
-      <w:pPr>
-        <w:widowControl/>
-        <w:spacing w:before="0" w:after="60" w:line="240" w:lineRule="auto"/>
-      </w:pPr>
-      <w:r>
-        <w:rPr>
-          <w:rFonts w:ascii="Calibri" w:hAnsi="Calibri" w:eastAsia="Calibri"/>
-          <w:b/>
-          <w:i w:val="0"/>
-          <w:color w:val="2E74B5"/>
-          <w:sz w:val="42"/>
-        </w:rPr>
-        <w:t>What Must Change in the Current PDF</w:t>
-      </w:r>
-    </w:p>
-    <w:p>
-      <w:pPr>
-        <w:widowControl/>
-        <w:spacing w:before="0" w:after="200" w:line="240" w:lineRule="auto"/>
-      </w:pPr>
-      <w:r>
-        <w:rPr>
-          <w:rFonts w:ascii="Calibri" w:hAnsi="Calibri" w:eastAsia="Calibri"/>
-          <w:b w:val="0"/>
-          <w:i w:val="0"/>
-          <w:color w:val="5B6573"/>
-          <w:sz w:val="18"/>
-        </w:rPr>
-        <w:t>Corrections based on the code now present on main</w:t>
-      </w:r>
-    </w:p>
-    <w:tbl>
-      <w:tblPr>
-        <w:tblW w:type="dxa" w:w="9360"/>
-        <w:jc w:val="center"/>
-        <w:tblLook w:firstColumn="1" w:firstRow="1" w:lastColumn="0" w:lastRow="0" w:noHBand="0" w:noVBand="1" w:val="04A0"/>
-        <w:tblLayout w:type="fixed"/>
-      </w:tblPr>
-      <w:tblGrid>
-        <w:gridCol w:w="9360"/>
-      </w:tblGrid>
-      <w:tr>
-        <w:tc>
-          <w:tcPr>
-            <w:tcW w:type="dxa" w:w="5943600"/>
-            <w:shd w:fill="2E74B5"/>
-          </w:tcPr>
-          <w:p>
-            <w:r/>
-          </w:p>
-        </w:tc>
-      </w:tr>
-    </w:tbl>
-    <w:p>
-      <w:pPr>
-        <w:widowControl/>
-        <w:spacing w:before="0" w:after="40" w:line="240" w:lineRule="auto"/>
-      </w:pPr>
-    </w:p>
-    <w:p>
-      <w:pPr>
-        <w:pStyle w:val="ListBullet"/>
-        <w:widowControl/>
-        <w:spacing w:before="0" w:after="40" w:line="259" w:lineRule="auto"/>
-        <w:ind w:left="360" w:hanging="216"/>
-      </w:pPr>
-      <w:r>
-        <w:rPr>
-          <w:rFonts w:ascii="Calibri" w:hAnsi="Calibri" w:eastAsia="Calibri"/>
-          <w:b/>
-          <w:i w:val="0"/>
-          <w:color w:val="1F2937"/>
-          <w:sz w:val="19"/>
-        </w:rPr>
-        <w:t>Introduction:</w:t>
-      </w:r>
-      <w:r>
-        <w:rPr>
-          <w:rFonts w:ascii="Calibri" w:hAnsi="Calibri" w:eastAsia="Calibri"/>
-          <w:b w:val="0"/>
-          <w:i w:val="0"/>
-          <w:color w:val="1F2937"/>
-          <w:sz w:val="19"/>
-        </w:rPr>
-        <w:t xml:space="preserve"> change 'two devices' to 'up to four identities' and replace 'real time' with 'nearby, offline, operation-based synchronization'.</w:t>
-      </w:r>
-    </w:p>
-    <w:p>
-      <w:pPr>
-        <w:pStyle w:val="ListBullet"/>
-        <w:widowControl/>
-        <w:spacing w:before="0" w:after="40" w:line="259" w:lineRule="auto"/>
-        <w:ind w:left="360" w:hanging="216"/>
-      </w:pPr>
-      <w:r>
-        <w:rPr>
-          <w:rFonts w:ascii="Calibri" w:hAnsi="Calibri" w:eastAsia="Calibri"/>
-          <w:b/>
-          <w:i w:val="0"/>
-          <w:color w:val="1F2937"/>
-          <w:sz w:val="19"/>
-        </w:rPr>
-        <w:t>Tremola for Chrome:</w:t>
-      </w:r>
-      <w:r>
-        <w:rPr>
-          <w:rFonts w:ascii="Calibri" w:hAnsi="Calibri" w:eastAsia="Calibri"/>
-          <w:b w:val="0"/>
-          <w:i w:val="0"/>
-          <w:color w:val="1F2937"/>
-          <w:sz w:val="19"/>
-        </w:rPr>
-        <w:t xml:space="preserve"> call it the first prototype and fast UI test harness, not the final Android transport.</w:t>
-      </w:r>
-    </w:p>
-    <w:p>
-      <w:pPr>
-        <w:pStyle w:val="ListBullet"/>
-        <w:widowControl/>
-        <w:spacing w:before="0" w:after="40" w:line="259" w:lineRule="auto"/>
-        <w:ind w:left="360" w:hanging="216"/>
-      </w:pPr>
-      <w:r>
-        <w:rPr>
-          <w:rFonts w:ascii="Calibri" w:hAnsi="Calibri" w:eastAsia="Calibri"/>
-          <w:b/>
-          <w:i w:val="0"/>
-          <w:color w:val="1F2937"/>
-          <w:sz w:val="19"/>
-        </w:rPr>
-        <w:t>Section 3.1:</w:t>
-      </w:r>
-      <w:r>
-        <w:rPr>
-          <w:rFonts w:ascii="Calibri" w:hAnsi="Calibri" w:eastAsia="Calibri"/>
-          <w:b w:val="0"/>
-          <w:i w:val="0"/>
-          <w:color w:val="1F2937"/>
-          <w:sz w:val="19"/>
-        </w:rPr>
-        <w:t xml:space="preserve"> keep the main flow, but remove feed-chain verification for the direct board BLE path. Each operation signature is verified independently.</w:t>
-      </w:r>
-    </w:p>
-    <w:p>
-      <w:pPr>
-        <w:pStyle w:val="ListBullet"/>
-        <w:widowControl/>
-        <w:spacing w:before="0" w:after="40" w:line="259" w:lineRule="auto"/>
-        <w:ind w:left="360" w:hanging="216"/>
-      </w:pPr>
-      <w:r>
-        <w:rPr>
-          <w:rFonts w:ascii="Calibri" w:hAnsi="Calibri" w:eastAsia="Calibri"/>
-          <w:b/>
-          <w:i w:val="0"/>
-          <w:color w:val="1F2937"/>
-          <w:sz w:val="19"/>
-        </w:rPr>
-        <w:t>Section 3.2:</w:t>
-      </w:r>
-      <w:r>
-        <w:rPr>
-          <w:rFonts w:ascii="Calibri" w:hAnsi="Calibri" w:eastAsia="Calibri"/>
-          <w:b w:val="0"/>
-          <w:i w:val="0"/>
-          <w:color w:val="1F2937"/>
-          <w:sz w:val="19"/>
-        </w:rPr>
-        <w:t xml:space="preserve"> correct the claim that no Tremola core changes were needed. The bridge, Room schema and native BLE code were extended.</w:t>
-      </w:r>
-    </w:p>
-    <w:p>
-      <w:pPr>
-        <w:pStyle w:val="ListBullet"/>
-        <w:widowControl/>
-        <w:spacing w:before="0" w:after="40" w:line="259" w:lineRule="auto"/>
-        <w:ind w:left="360" w:hanging="216"/>
-      </w:pPr>
-      <w:r>
-        <w:rPr>
-          <w:rFonts w:ascii="Calibri" w:hAnsi="Calibri" w:eastAsia="Calibri"/>
-          <w:b/>
-          <w:i w:val="0"/>
-          <w:color w:val="1F2937"/>
-          <w:sz w:val="19"/>
-        </w:rPr>
-        <w:t>Section 3.3:</w:t>
-      </w:r>
-      <w:r>
-        <w:rPr>
-          <w:rFonts w:ascii="Calibri" w:hAnsi="Calibri" w:eastAsia="Calibri"/>
-          <w:b w:val="0"/>
-          <w:i w:val="0"/>
-          <w:color w:val="1F2937"/>
-          <w:sz w:val="19"/>
-        </w:rPr>
-        <w:t xml:space="preserve"> remove Protected-mode o/p events. Current shared events are s, t, m, k, d, c and n. Legacy x is accepted but not created by the UI.</w:t>
-      </w:r>
-    </w:p>
-    <w:p>
-      <w:pPr>
-        <w:pStyle w:val="ListBullet"/>
-        <w:widowControl/>
-        <w:spacing w:before="0" w:after="40" w:line="259" w:lineRule="auto"/>
-        <w:ind w:left="360" w:hanging="216"/>
-      </w:pPr>
-      <w:r>
-        <w:rPr>
-          <w:rFonts w:ascii="Calibri" w:hAnsi="Calibri" w:eastAsia="Calibri"/>
-          <w:b/>
-          <w:i w:val="0"/>
-          <w:color w:val="1F2937"/>
-          <w:sz w:val="19"/>
-        </w:rPr>
-        <w:t>Section 3.4:</w:t>
-      </w:r>
-      <w:r>
-        <w:rPr>
-          <w:rFonts w:ascii="Calibri" w:hAnsi="Calibri" w:eastAsia="Calibri"/>
-          <w:b w:val="0"/>
-          <w:i w:val="0"/>
-          <w:color w:val="1F2937"/>
-          <w:sz w:val="19"/>
-        </w:rPr>
-        <w:t xml:space="preserve"> use 'Tremola/SSB feed identity', not 'tinySSB identity'. Tremola board payloads use AES-GCM; display names are not trusted identities.</w:t>
-      </w:r>
-    </w:p>
-    <w:p>
-      <w:pPr>
-        <w:pStyle w:val="ListBullet"/>
-        <w:widowControl/>
-        <w:spacing w:before="0" w:after="40" w:line="259" w:lineRule="auto"/>
-        <w:ind w:left="360" w:hanging="216"/>
-      </w:pPr>
-      <w:r>
-        <w:rPr>
-          <w:rFonts w:ascii="Calibri" w:hAnsi="Calibri" w:eastAsia="Calibri"/>
-          <w:b/>
-          <w:i w:val="0"/>
-          <w:color w:val="1F2937"/>
-          <w:sz w:val="19"/>
-        </w:rPr>
-        <w:t>Section 3.5:</w:t>
-      </w:r>
-      <w:r>
-        <w:rPr>
-          <w:rFonts w:ascii="Calibri" w:hAnsi="Calibri" w:eastAsia="Calibri"/>
-          <w:b w:val="0"/>
-          <w:i w:val="0"/>
-          <w:color w:val="1F2937"/>
-          <w:sz w:val="19"/>
-        </w:rPr>
-        <w:t xml:space="preserve"> remove ownership and separate Protected clears. Everyone may edit every object. New conflicts use Lamport order and event ID.</w:t>
-      </w:r>
-    </w:p>
-    <w:p>
-      <w:pPr>
-        <w:pStyle w:val="ListBullet"/>
-        <w:widowControl/>
-        <w:spacing w:before="0" w:after="40" w:line="259" w:lineRule="auto"/>
-        <w:ind w:left="360" w:hanging="216"/>
-      </w:pPr>
-      <w:r>
-        <w:rPr>
-          <w:rFonts w:ascii="Calibri" w:hAnsi="Calibri" w:eastAsia="Calibri"/>
-          <w:b/>
-          <w:i w:val="0"/>
-          <w:color w:val="1F2937"/>
-          <w:sz w:val="19"/>
-        </w:rPr>
-        <w:t>Section 3.6:</w:t>
-      </w:r>
-      <w:r>
-        <w:rPr>
-          <w:rFonts w:ascii="Calibri" w:hAnsi="Calibri" w:eastAsia="Calibri"/>
-          <w:b w:val="0"/>
-          <w:i w:val="0"/>
-          <w:color w:val="1F2937"/>
-          <w:sz w:val="19"/>
-        </w:rPr>
-        <w:t xml:space="preserve"> change eight seconds to five seconds. Add operation ACK, retry, frontier, WANT ranges, compression and board-only traffic.</w:t>
-      </w:r>
-    </w:p>
-    <w:p>
-      <w:pPr>
-        <w:pStyle w:val="ListBullet"/>
-        <w:widowControl/>
-        <w:spacing w:before="0" w:after="40" w:line="259" w:lineRule="auto"/>
-        <w:ind w:left="360" w:hanging="216"/>
-      </w:pPr>
-      <w:r>
-        <w:rPr>
-          <w:rFonts w:ascii="Calibri" w:hAnsi="Calibri" w:eastAsia="Calibri"/>
-          <w:b/>
-          <w:i w:val="0"/>
-          <w:color w:val="1F2937"/>
-          <w:sz w:val="19"/>
-        </w:rPr>
-        <w:t>Discussion:</w:t>
-      </w:r>
-      <w:r>
-        <w:rPr>
-          <w:rFonts w:ascii="Calibri" w:hAnsi="Calibri" w:eastAsia="Calibri"/>
-          <w:b w:val="0"/>
-          <w:i w:val="0"/>
-          <w:color w:val="1F2937"/>
-          <w:sz w:val="19"/>
-        </w:rPr>
-        <w:t xml:space="preserve"> add measured test results, limits and a clear separation between automated checks, emulator checks and real BLE tests.</w:t>
-      </w:r>
-    </w:p>
-    <w:p>
-      <w:pPr>
-        <w:pStyle w:val="ListBullet"/>
-        <w:widowControl/>
-        <w:spacing w:before="0" w:after="40" w:line="259" w:lineRule="auto"/>
-        <w:ind w:left="360" w:hanging="216"/>
-      </w:pPr>
-      <w:r>
-        <w:rPr>
-          <w:rFonts w:ascii="Calibri" w:hAnsi="Calibri" w:eastAsia="Calibri"/>
-          <w:b/>
-          <w:i w:val="0"/>
-          <w:color w:val="1F2937"/>
-          <w:sz w:val="19"/>
-        </w:rPr>
-        <w:t>Conclusion:</w:t>
-      </w:r>
-      <w:r>
-        <w:rPr>
-          <w:rFonts w:ascii="Calibri" w:hAnsi="Calibri" w:eastAsia="Calibri"/>
-          <w:b w:val="0"/>
-          <w:i w:val="0"/>
-          <w:color w:val="1F2937"/>
-          <w:sz w:val="19"/>
-        </w:rPr>
-        <w:t xml:space="preserve"> finish it after the phone test. Do not write 'all features sync' unless the result table proves it.</w:t>
-      </w:r>
-    </w:p>
-    <w:p>
-      <w:pPr>
-        <w:keepNext/>
-        <w:widowControl/>
-        <w:spacing w:before="100" w:after="60" w:line="240" w:lineRule="auto"/>
-      </w:pPr>
-      <w:r>
-        <w:rPr>
-          <w:rFonts w:ascii="Calibri" w:hAnsi="Calibri" w:eastAsia="Calibri"/>
-          <w:b/>
-          <w:i w:val="0"/>
-          <w:color w:val="2E74B5"/>
-          <w:sz w:val="26"/>
-        </w:rPr>
-        <w:t>Methodology feedback</w:t>
-      </w:r>
-    </w:p>
-    <w:tbl>
-      <w:tblPr>
-        <w:tblW w:type="dxa" w:w="9360"/>
-        <w:jc w:val="center"/>
-        <w:tblLook w:firstColumn="1" w:firstRow="1" w:lastColumn="0" w:lastRow="0" w:noHBand="0" w:noVBand="1" w:val="04A0"/>
-        <w:tblLayout w:type="fixed"/>
-        <w:tblBorders>
-          <w:top w:val="single" w:sz="6" w:color="9DC3E6"/>
-          <w:left w:val="single" w:sz="6" w:color="9DC3E6"/>
-          <w:bottom w:val="single" w:sz="6" w:color="9DC3E6"/>
-          <w:right w:val="single" w:sz="6" w:color="9DC3E6"/>
-          <w:insideH w:val="single" w:sz="6" w:color="9DC3E6"/>
-          <w:insideV w:val="single" w:sz="6" w:color="9DC3E6"/>
-        </w:tblBorders>
-      </w:tblPr>
-      <w:tblGrid>
-        <w:gridCol w:w="9360"/>
-      </w:tblGrid>
-      <w:tr>
-        <w:tc>
-          <w:tcPr>
-            <w:tcW w:type="dxa" w:w="5943600"/>
-            <w:shd w:fill="EAF2F8"/>
+            <w:tcW w:type="dxa" w:w="1900"/>
+            <w:shd w:fill="E8EEF5"/>
+            <w:tcMar>
+              <w:top w:w="80" w:type="dxa"/>
+              <w:start w:w="120" w:type="dxa"/>
+              <w:bottom w:w="80" w:type="dxa"/>
+              <w:end w:w="120" w:type="dxa"/>
+            </w:tcMar>
             <w:vAlign w:val="center"/>
           </w:tcPr>
           <w:p>
             <w:pPr>
-              <w:widowControl/>
-              <w:spacing w:before="40" w:after="40" w:line="259" w:lineRule="auto"/>
+              <w:keepNext/>
+              <w:spacing w:after="0"/>
             </w:pPr>
             <w:r>
               <w:rPr>
-                <w:rFonts w:ascii="Calibri" w:hAnsi="Calibri" w:eastAsia="Calibri"/>
+                <w:rFonts w:ascii="Calibri" w:hAnsi="Calibri"/>
                 <w:b/>
-                <w:i w:val="0"/>
-                <w:color w:val="2E74B5"/>
+                <w:color w:val="1F4D78"/>
                 <w:sz w:val="19"/>
               </w:rPr>
-              <w:t xml:space="preserve">Main point: </w:t>
+              <w:t>Observed problem</w:t>
             </w:r>
+          </w:p>
+        </w:tc>
+        <w:tc>
+          <w:tcPr>
+            <w:tcW w:type="dxa" w:w="3450"/>
+            <w:shd w:fill="E8EEF5"/>
+            <w:tcMar>
+              <w:top w:w="80" w:type="dxa"/>
+              <w:start w:w="120" w:type="dxa"/>
+              <w:bottom w:w="80" w:type="dxa"/>
+              <w:end w:w="120" w:type="dxa"/>
+            </w:tcMar>
+            <w:vAlign w:val="center"/>
+          </w:tcPr>
+          <w:p>
+            <w:pPr>
+              <w:keepNext/>
+              <w:spacing w:after="0"/>
+            </w:pPr>
             <w:r>
               <w:rPr>
-                <w:rFonts w:ascii="Calibri" w:hAnsi="Calibri" w:eastAsia="Calibri"/>
-                <w:b w:val="0"/>
-                <w:i w:val="0"/>
-                <w:color w:val="1F2937"/>
+                <w:rFonts w:ascii="Calibri" w:hAnsi="Calibri"/>
+                <w:b/>
+                <w:color w:val="1F4D78"/>
                 <w:sz w:val="19"/>
               </w:rPr>
-              <w:t>The current chapter is useful system design, but Methodology must also explain how the team built, debugged and evaluated the system.</w:t>
+              <w:t>Cause</w:t>
+            </w:r>
+          </w:p>
+        </w:tc>
+        <w:tc>
+          <w:tcPr>
+            <w:tcW w:type="dxa" w:w="3676"/>
+            <w:shd w:fill="E8EEF5"/>
+            <w:tcMar>
+              <w:top w:w="80" w:type="dxa"/>
+              <w:start w:w="120" w:type="dxa"/>
+              <w:bottom w:w="80" w:type="dxa"/>
+              <w:end w:w="120" w:type="dxa"/>
+            </w:tcMar>
+            <w:vAlign w:val="center"/>
+          </w:tcPr>
+          <w:p>
+            <w:pPr>
+              <w:keepNext/>
+              <w:spacing w:after="0"/>
+            </w:pPr>
+            <w:r>
+              <w:rPr>
+                <w:rFonts w:ascii="Calibri" w:hAnsi="Calibri"/>
+                <w:b/>
+                <w:color w:val="1F4D78"/>
+                <w:sz w:val="19"/>
+              </w:rPr>
+              <w:t>Current answer</w:t>
+            </w:r>
+          </w:p>
+        </w:tc>
+      </w:tr>
+      <w:tr>
+        <w:trPr>
+          <w:cantSplit/>
+        </w:trPr>
+        <w:tc>
+          <w:tcPr>
+            <w:tcW w:type="dxa" w:w="1900"/>
+            <w:tcMar>
+              <w:top w:w="80" w:type="dxa"/>
+              <w:start w:w="120" w:type="dxa"/>
+              <w:bottom w:w="80" w:type="dxa"/>
+              <w:end w:w="120" w:type="dxa"/>
+            </w:tcMar>
+            <w:vAlign w:val="center"/>
+          </w:tcPr>
+          <w:p>
+            <w:pPr>
+              <w:keepNext/>
+              <w:spacing w:after="0" w:line="269" w:lineRule="auto"/>
+            </w:pPr>
+            <w:r>
+              <w:rPr>
+                <w:rFonts w:ascii="Calibri" w:hAnsi="Calibri"/>
+                <w:sz w:val="18"/>
+              </w:rPr>
+              <w:t>Clear arrived; strokes rarely arrived</w:t>
+            </w:r>
+          </w:p>
+        </w:tc>
+        <w:tc>
+          <w:tcPr>
+            <w:tcW w:type="dxa" w:w="3450"/>
+            <w:tcMar>
+              <w:top w:w="80" w:type="dxa"/>
+              <w:start w:w="120" w:type="dxa"/>
+              <w:bottom w:w="80" w:type="dxa"/>
+              <w:end w:w="120" w:type="dxa"/>
+            </w:tcMar>
+            <w:vAlign w:val="center"/>
+          </w:tcPr>
+          <w:p>
+            <w:pPr>
+              <w:keepNext/>
+              <w:spacing w:after="0" w:line="269" w:lineRule="auto"/>
+            </w:pPr>
+            <w:r>
+              <w:rPr>
+                <w:rFonts w:ascii="Calibri" w:hAnsi="Calibri"/>
+                <w:sz w:val="18"/>
+              </w:rPr>
+              <w:t>Clear was small. A long signed/Base64 JSON event needed many BLE fragments; one missing fragment lost the event.</w:t>
+            </w:r>
+          </w:p>
+        </w:tc>
+        <w:tc>
+          <w:tcPr>
+            <w:tcW w:type="dxa" w:w="3676"/>
+            <w:tcMar>
+              <w:top w:w="80" w:type="dxa"/>
+              <w:start w:w="120" w:type="dxa"/>
+              <w:bottom w:w="80" w:type="dxa"/>
+              <w:end w:w="120" w:type="dxa"/>
+            </w:tcMar>
+            <w:vAlign w:val="center"/>
+          </w:tcPr>
+          <w:p>
+            <w:pPr>
+              <w:keepNext/>
+              <w:spacing w:after="0" w:line="269" w:lineRule="auto"/>
+            </w:pPr>
+            <w:r>
+              <w:rPr>
+                <w:rFonts w:ascii="Calibri" w:hAnsi="Calibri"/>
+                <w:sz w:val="18"/>
+              </w:rPr>
+              <w:t>Compact board-only payloads, compression, one-at-a-time frames, ACK, retry, and frontier recovery.</w:t>
+            </w:r>
+          </w:p>
+        </w:tc>
+      </w:tr>
+      <w:tr>
+        <w:trPr>
+          <w:cantSplit/>
+        </w:trPr>
+        <w:tc>
+          <w:tcPr>
+            <w:tcW w:type="dxa" w:w="1900"/>
+            <w:tcMar>
+              <w:top w:w="80" w:type="dxa"/>
+              <w:start w:w="120" w:type="dxa"/>
+              <w:bottom w:w="80" w:type="dxa"/>
+              <w:end w:w="120" w:type="dxa"/>
+            </w:tcMar>
+            <w:vAlign w:val="center"/>
+          </w:tcPr>
+          <w:p>
+            <w:pPr>
+              <w:keepNext/>
+              <w:spacing w:after="0" w:line="269" w:lineRule="auto"/>
+            </w:pPr>
+            <w:r>
+              <w:rPr>
+                <w:rFonts w:ascii="Calibri" w:hAnsi="Calibri"/>
+                <w:sz w:val="18"/>
+              </w:rPr>
+              <w:t>Move/resize never appeared</w:t>
+            </w:r>
+          </w:p>
+        </w:tc>
+        <w:tc>
+          <w:tcPr>
+            <w:tcW w:type="dxa" w:w="3450"/>
+            <w:tcMar>
+              <w:top w:w="80" w:type="dxa"/>
+              <w:start w:w="120" w:type="dxa"/>
+              <w:bottom w:w="80" w:type="dxa"/>
+              <w:end w:w="120" w:type="dxa"/>
+            </w:tcMar>
+            <w:vAlign w:val="center"/>
+          </w:tcPr>
+          <w:p>
+            <w:pPr>
+              <w:keepNext/>
+              <w:spacing w:after="0" w:line="269" w:lineRule="auto"/>
+            </w:pPr>
+            <w:r>
+              <w:rPr>
+                <w:rFonts w:ascii="Calibri" w:hAnsi="Calibri"/>
+                <w:sz w:val="18"/>
+              </w:rPr>
+              <w:t>The transform references the original object. If that object was missing, the transform could not be rendered.</w:t>
+            </w:r>
+          </w:p>
+        </w:tc>
+        <w:tc>
+          <w:tcPr>
+            <w:tcW w:type="dxa" w:w="3676"/>
+            <w:tcMar>
+              <w:top w:w="80" w:type="dxa"/>
+              <w:start w:w="120" w:type="dxa"/>
+              <w:bottom w:w="80" w:type="dxa"/>
+              <w:end w:w="120" w:type="dxa"/>
+            </w:tcMar>
+            <w:vAlign w:val="center"/>
+          </w:tcPr>
+          <w:p>
+            <w:pPr>
+              <w:keepNext/>
+              <w:spacing w:after="0" w:line="269" w:lineRule="auto"/>
+            </w:pPr>
+            <w:r>
+              <w:rPr>
+                <w:rFonts w:ascii="Calibri" w:hAnsi="Calibri"/>
+                <w:sz w:val="18"/>
+              </w:rPr>
+              <w:t>Missing ranges recover the object; transforms may arrive first and are applied later.</w:t>
+            </w:r>
+          </w:p>
+        </w:tc>
+      </w:tr>
+      <w:tr>
+        <w:trPr>
+          <w:cantSplit/>
+        </w:trPr>
+        <w:tc>
+          <w:tcPr>
+            <w:tcW w:type="dxa" w:w="1900"/>
+            <w:tcMar>
+              <w:top w:w="80" w:type="dxa"/>
+              <w:start w:w="120" w:type="dxa"/>
+              <w:bottom w:w="80" w:type="dxa"/>
+              <w:end w:w="120" w:type="dxa"/>
+            </w:tcMar>
+            <w:vAlign w:val="center"/>
+          </w:tcPr>
+          <w:p>
+            <w:pPr>
+              <w:keepNext/>
+              <w:spacing w:after="0" w:line="269" w:lineRule="auto"/>
+            </w:pPr>
+            <w:r>
+              <w:rPr>
+                <w:rFonts w:ascii="Calibri" w:hAnsi="Calibri"/>
+                <w:sz w:val="18"/>
+              </w:rPr>
+              <w:t>Peer count looked too high</w:t>
+            </w:r>
+          </w:p>
+        </w:tc>
+        <w:tc>
+          <w:tcPr>
+            <w:tcW w:type="dxa" w:w="3450"/>
+            <w:tcMar>
+              <w:top w:w="80" w:type="dxa"/>
+              <w:start w:w="120" w:type="dxa"/>
+              <w:bottom w:w="80" w:type="dxa"/>
+              <w:end w:w="120" w:type="dxa"/>
+            </w:tcMar>
+            <w:vAlign w:val="center"/>
+          </w:tcPr>
+          <w:p>
+            <w:pPr>
+              <w:keepNext/>
+              <w:spacing w:after="0" w:line="269" w:lineRule="auto"/>
+            </w:pPr>
+            <w:r>
+              <w:rPr>
+                <w:rFonts w:ascii="Calibri" w:hAnsi="Calibri"/>
+                <w:sz w:val="18"/>
+              </w:rPr>
+              <w:t>One phone could appear through several BLE roles or addresses.</w:t>
+            </w:r>
+          </w:p>
+        </w:tc>
+        <w:tc>
+          <w:tcPr>
+            <w:tcW w:type="dxa" w:w="3676"/>
+            <w:tcMar>
+              <w:top w:w="80" w:type="dxa"/>
+              <w:start w:w="120" w:type="dxa"/>
+              <w:bottom w:w="80" w:type="dxa"/>
+              <w:end w:w="120" w:type="dxa"/>
+            </w:tcMar>
+            <w:vAlign w:val="center"/>
+          </w:tcPr>
+          <w:p>
+            <w:pPr>
+              <w:keepNext/>
+              <w:spacing w:after="0" w:line="269" w:lineRule="auto"/>
+            </w:pPr>
+            <w:r>
+              <w:rPr>
+                <w:rFonts w:ascii="Calibri" w:hAnsi="Calibri"/>
+                <w:sz w:val="18"/>
+              </w:rPr>
+              <w:t>Count authenticated feed identities, not raw Android BLE addresses.</w:t>
+            </w:r>
+          </w:p>
+        </w:tc>
+      </w:tr>
+      <w:tr>
+        <w:trPr>
+          <w:cantSplit/>
+        </w:trPr>
+        <w:tc>
+          <w:tcPr>
+            <w:tcW w:type="dxa" w:w="1900"/>
+            <w:tcMar>
+              <w:top w:w="80" w:type="dxa"/>
+              <w:start w:w="120" w:type="dxa"/>
+              <w:bottom w:w="80" w:type="dxa"/>
+              <w:end w:w="120" w:type="dxa"/>
+            </w:tcMar>
+            <w:vAlign w:val="center"/>
+          </w:tcPr>
+          <w:p>
+            <w:pPr>
+              <w:spacing w:after="0" w:line="269" w:lineRule="auto"/>
+            </w:pPr>
+            <w:r>
+              <w:rPr>
+                <w:rFonts w:ascii="Calibri" w:hAnsi="Calibri"/>
+                <w:sz w:val="18"/>
+              </w:rPr>
+              <w:t>tinySSB did not start BLE reliably</w:t>
+            </w:r>
+          </w:p>
+        </w:tc>
+        <w:tc>
+          <w:tcPr>
+            <w:tcW w:type="dxa" w:w="3450"/>
+            <w:tcMar>
+              <w:top w:w="80" w:type="dxa"/>
+              <w:start w:w="120" w:type="dxa"/>
+              <w:bottom w:w="80" w:type="dxa"/>
+              <w:end w:w="120" w:type="dxa"/>
+            </w:tcMar>
+            <w:vAlign w:val="center"/>
+          </w:tcPr>
+          <w:p>
+            <w:pPr>
+              <w:spacing w:after="0" w:line="269" w:lineRule="auto"/>
+            </w:pPr>
+            <w:r>
+              <w:rPr>
+                <w:rFonts w:ascii="Calibri" w:hAnsi="Calibri"/>
+                <w:sz w:val="18"/>
+              </w:rPr>
+              <w:t>The upstream host handled the first permission result in the wrong callback.</w:t>
+            </w:r>
+          </w:p>
+        </w:tc>
+        <w:tc>
+          <w:tcPr>
+            <w:tcW w:type="dxa" w:w="3676"/>
+            <w:tcMar>
+              <w:top w:w="80" w:type="dxa"/>
+              <w:start w:w="120" w:type="dxa"/>
+              <w:bottom w:w="80" w:type="dxa"/>
+              <w:end w:w="120" w:type="dxa"/>
+            </w:tcMar>
+            <w:vAlign w:val="center"/>
+          </w:tcPr>
+          <w:p>
+            <w:pPr>
+              <w:spacing w:after="0" w:line="269" w:lineRule="auto"/>
+            </w:pPr>
+            <w:r>
+              <w:rPr>
+                <w:rFonts w:ascii="Calibri" w:hAnsi="Calibri"/>
+                <w:sz w:val="18"/>
+              </w:rPr>
+              <w:t>Start BLE after approval and restart it after Bluetooth is enabled.</w:t>
             </w:r>
           </w:p>
         </w:tc>
@@ -799,277 +1120,259 @@
     </w:tbl>
     <w:p>
       <w:pPr>
-        <w:pStyle w:val="ListNumber"/>
-        <w:widowControl/>
-        <w:spacing w:before="0" w:after="40" w:line="259" w:lineRule="auto"/>
-        <w:ind w:left="403" w:hanging="230"/>
+        <w:spacing w:after="40"/>
+      </w:pPr>
+    </w:p>
+    <w:p>
+      <w:pPr>
+        <w:pStyle w:val="Heading2"/>
       </w:pPr>
       <w:r>
+        <w:t>Two access models</w:t>
+      </w:r>
+    </w:p>
+    <w:p>
+      <w:r>
         <w:rPr>
-          <w:rFonts w:ascii="Calibri" w:hAnsi="Calibri" w:eastAsia="Calibri"/>
-          <w:b w:val="0"/>
-          <w:i w:val="0"/>
-          <w:color w:val="1F2937"/>
-          <w:sz w:val="19"/>
+          <w:rFonts w:ascii="Calibri" w:hAnsi="Calibri"/>
+          <w:b/>
+          <w:color w:val="1F4D78"/>
         </w:rPr>
-        <w:t>Requirements and constraints: Tremola mini-app, Android, offline BLE, finite canvas, up to four identities and eventual convergence.</w:t>
+        <w:t xml:space="preserve">Tremola. </w:t>
+      </w:r>
+      <w:r>
+        <w:rPr>
+          <w:rFonts w:ascii="Calibri" w:hAnsi="Calibri"/>
+        </w:rPr>
+        <w:t>A generated six-digit code directly identifies the room and derives its content key. Up to four stable feed IDs are stored. The code is convenient but weak; treat it like a shared password.</w:t>
+      </w:r>
+    </w:p>
+    <w:p>
+      <w:r>
+        <w:rPr>
+          <w:rFonts w:ascii="Calibri" w:hAnsi="Calibri"/>
+          <w:b/>
+          <w:color w:val="1F4D78"/>
+        </w:rPr>
+        <w:t xml:space="preserve">tinySSB. </w:t>
+      </w:r>
+      <w:r>
+        <w:rPr>
+          <w:rFonts w:ascii="Calibri" w:hAnsi="Calibri"/>
+        </w:rPr>
+        <w:t>A board has a random ID. The creator sends signed invitations to verified contacts. Up to eight may be invited; the creator and first three valid acceptances can edit. The short code only selects an invitation already received on that phone.</w:t>
       </w:r>
     </w:p>
     <w:p>
       <w:pPr>
-        <w:pStyle w:val="ListNumber"/>
-        <w:widowControl/>
-        <w:spacing w:before="0" w:after="40" w:line="259" w:lineRule="auto"/>
-        <w:ind w:left="403" w:hanging="230"/>
+        <w:pStyle w:val="Heading1"/>
       </w:pPr>
       <w:r>
-        <w:rPr>
-          <w:rFonts w:ascii="Calibri" w:hAnsi="Calibri" w:eastAsia="Calibri"/>
-          <w:b w:val="0"/>
-          <w:i w:val="0"/>
-          <w:color w:val="1F2937"/>
-          <w:sz w:val="19"/>
-        </w:rPr>
-        <w:t>Prototype: use Max's Chrome version for fast UI and event-model iteration.</w:t>
+        <w:t>5. How the Two Apps Work</w:t>
       </w:r>
     </w:p>
     <w:p>
       <w:pPr>
-        <w:pStyle w:val="ListNumber"/>
-        <w:widowControl/>
-        <w:spacing w:before="0" w:after="40" w:line="259" w:lineRule="auto"/>
-        <w:ind w:left="403" w:hanging="230"/>
+        <w:pStyle w:val="Heading2"/>
       </w:pPr>
       <w:r>
-        <w:rPr>
-          <w:rFonts w:ascii="Calibri" w:hAnsi="Calibri" w:eastAsia="Calibri"/>
-          <w:b w:val="0"/>
-          <w:i w:val="0"/>
-          <w:color w:val="1F2937"/>
-          <w:sz w:val="19"/>
-        </w:rPr>
-        <w:t>Android integration: explain WebView bridge, Room storage, signing/encryption and native BLE.</w:t>
+        <w:t>Tremola 1.0</w:t>
       </w:r>
     </w:p>
     <w:p>
       <w:pPr>
-        <w:pStyle w:val="ListNumber"/>
-        <w:widowControl/>
-        <w:spacing w:before="0" w:after="40" w:line="259" w:lineRule="auto"/>
-        <w:ind w:left="403" w:hanging="230"/>
+        <w:numPr>
+          <w:ilvl w:val="0"/>
+          <w:numId w:val="14"/>
+        </w:numPr>
+        <w:spacing w:after="80" w:line="300" w:lineRule="auto"/>
       </w:pPr>
       <w:r>
         <w:rPr>
-          <w:rFonts w:ascii="Calibri" w:hAnsi="Calibri" w:eastAsia="Calibri"/>
-          <w:b w:val="0"/>
-          <w:i w:val="0"/>
-          <w:color w:val="1F2937"/>
-          <w:sz w:val="19"/>
+          <w:rFonts w:ascii="Calibri" w:hAnsi="Calibri"/>
         </w:rPr>
-        <w:t>Reliability work: reproduce the dropped-message case, compare Clear with long strokes, then explain the selected fixes.</w:t>
+        <w:t>Install install/tremola/whiteboard.apk on every test phone.</w:t>
       </w:r>
     </w:p>
     <w:p>
       <w:pPr>
-        <w:pStyle w:val="ListNumber"/>
-        <w:widowControl/>
-        <w:spacing w:before="0" w:after="40" w:line="259" w:lineRule="auto"/>
-        <w:ind w:left="403" w:hanging="230"/>
+        <w:numPr>
+          <w:ilvl w:val="0"/>
+          <w:numId w:val="14"/>
+        </w:numPr>
+        <w:spacing w:after="80" w:line="300" w:lineRule="auto"/>
       </w:pPr>
       <w:r>
         <w:rPr>
-          <w:rFonts w:ascii="Calibri" w:hAnsi="Calibri" w:eastAsia="Calibri"/>
-          <w:b w:val="0"/>
-          <w:i w:val="0"/>
-          <w:color w:val="1F2937"/>
-          <w:sz w:val="19"/>
+          <w:rFonts w:ascii="Calibri" w:hAnsi="Calibri"/>
         </w:rPr>
-        <w:t>Validation: state device, Android version, radio settings, action, expected result and actual result for every test.</w:t>
+        <w:t>Allow Bluetooth/Nearby Devices and Location. On Android 7–11, keep the Location setting on.</w:t>
       </w:r>
     </w:p>
     <w:p>
       <w:pPr>
-        <w:widowControl/>
-        <w:spacing w:before="0" w:after="60" w:line="269" w:lineRule="auto"/>
+        <w:numPr>
+          <w:ilvl w:val="0"/>
+          <w:numId w:val="14"/>
+        </w:numPr>
+        <w:spacing w:after="80" w:line="300" w:lineRule="auto"/>
       </w:pPr>
       <w:r>
         <w:rPr>
-          <w:rFonts w:ascii="Calibri" w:hAnsi="Calibri" w:eastAsia="Calibri"/>
-          <w:b w:val="0"/>
-          <w:i/>
-          <w:color w:val="1F2937"/>
-          <w:sz w:val="20"/>
+          <w:rFonts w:ascii="Calibri" w:hAnsi="Calibri"/>
         </w:rPr>
-        <w:t>Good wording: 'We used an iterative prototype-and-test process. Browser tests covered UI and deterministic replay; Kotlin tests covered protocol and cryptography; physical phones were used for the final BLE transport evaluation.'</w:t>
-      </w:r>
-    </w:p>
-    <w:p>
-      <w:r>
-        <w:br w:type="page"/>
+        <w:t>Open MiniApps &gt; Collaboration Board, enter a name and board name, then create a board.</w:t>
       </w:r>
     </w:p>
     <w:p>
       <w:pPr>
-        <w:widowControl/>
-        <w:spacing w:before="0" w:after="60" w:line="240" w:lineRule="auto"/>
+        <w:numPr>
+          <w:ilvl w:val="0"/>
+          <w:numId w:val="14"/>
+        </w:numPr>
+        <w:spacing w:after="80" w:line="300" w:lineRule="auto"/>
       </w:pPr>
       <w:r>
         <w:rPr>
-          <w:rFonts w:ascii="Calibri" w:hAnsi="Calibri" w:eastAsia="Calibri"/>
-          <w:b/>
-          <w:i w:val="0"/>
-          <w:color w:val="2E74B5"/>
-          <w:sz w:val="42"/>
+          <w:rFonts w:ascii="Calibri" w:hAnsi="Calibri"/>
         </w:rPr>
-        <w:t>Problems, Solutions and Evidence</w:t>
+        <w:t>Share the six-digit code. Other phones enter a display name and use Join. The board accepts up to four feed identities.</w:t>
       </w:r>
     </w:p>
     <w:p>
       <w:pPr>
-        <w:widowControl/>
-        <w:spacing w:before="0" w:after="200" w:line="240" w:lineRule="auto"/>
+        <w:numPr>
+          <w:ilvl w:val="0"/>
+          <w:numId w:val="14"/>
+        </w:numPr>
+        <w:spacing w:after="80" w:line="300" w:lineRule="auto"/>
       </w:pPr>
       <w:r>
         <w:rPr>
-          <w:rFonts w:ascii="Calibri" w:hAnsi="Calibri" w:eastAsia="Calibri"/>
-          <w:b w:val="0"/>
-          <w:i w:val="0"/>
-          <w:color w:val="5B6573"/>
-          <w:sz w:val="18"/>
+          <w:rFonts w:ascii="Calibri" w:hAnsi="Calibri"/>
         </w:rPr>
-        <w:t>Short explanations that can be adapted for Discussion and Methodology</w:t>
+        <w:t>Use Draw, Text, Edit, color, Delete, Clear all, View, Dark, and Export. Clear is immediate. JPEG follows local Dark; PDF is white.</w:t>
+      </w:r>
+    </w:p>
+    <w:p>
+      <w:pPr>
+        <w:numPr>
+          <w:ilvl w:val="0"/>
+          <w:numId w:val="14"/>
+        </w:numPr>
+        <w:spacing w:after="80" w:line="300" w:lineRule="auto"/>
+      </w:pPr>
+      <w:r>
+        <w:rPr>
+          <w:rFonts w:ascii="Calibri" w:hAnsi="Calibri"/>
+        </w:rPr>
+        <w:t>Use Boards to close and reopen saved boards. Local operations survive app restarts and catch up after reconnecting.</w:t>
+      </w:r>
+    </w:p>
+    <w:p>
+      <w:pPr>
+        <w:pStyle w:val="Heading2"/>
+      </w:pPr>
+      <w:r>
+        <w:t>tinySSB 1.0</w:t>
+      </w:r>
+    </w:p>
+    <w:p>
+      <w:pPr>
+        <w:numPr>
+          <w:ilvl w:val="0"/>
+          <w:numId w:val="15"/>
+        </w:numPr>
+        <w:spacing w:after="80" w:line="300" w:lineRule="auto"/>
+      </w:pPr>
+      <w:r>
+        <w:rPr>
+          <w:rFonts w:ascii="Calibri" w:hAnsi="Calibri"/>
+        </w:rPr>
+        <w:t>Install install/tinyssb/whiteboard.apk on every phone and allow Nearby Devices and Location.</w:t>
+      </w:r>
+    </w:p>
+    <w:p>
+      <w:pPr>
+        <w:numPr>
+          <w:ilvl w:val="0"/>
+          <w:numId w:val="15"/>
+        </w:numPr>
+        <w:spacing w:after="80" w:line="300" w:lineRule="auto"/>
+      </w:pPr>
+      <w:r>
+        <w:rPr>
+          <w:rFonts w:ascii="Calibri" w:hAnsi="Calibri"/>
+        </w:rPr>
+        <w:t>Add and verify contacts in tinySSB first. Open Productivity &gt; Collaboration Board (dpi26.15).</w:t>
+      </w:r>
+    </w:p>
+    <w:p>
+      <w:pPr>
+        <w:numPr>
+          <w:ilvl w:val="0"/>
+          <w:numId w:val="15"/>
+        </w:numPr>
+        <w:spacing w:after="80" w:line="300" w:lineRule="auto"/>
+      </w:pPr>
+      <w:r>
+        <w:rPr>
+          <w:rFonts w:ascii="Calibri" w:hAnsi="Calibri"/>
+        </w:rPr>
+        <w:t>Create and open a board, tap +, and invite a verified contact. The other phone accepts or declines the popup.</w:t>
+      </w:r>
+    </w:p>
+    <w:p>
+      <w:pPr>
+        <w:numPr>
+          <w:ilvl w:val="0"/>
+          <w:numId w:val="15"/>
+        </w:numPr>
+        <w:spacing w:after="80" w:line="300" w:lineRule="auto"/>
+      </w:pPr>
+      <w:r>
+        <w:rPr>
+          <w:rFonts w:ascii="Calibri" w:hAnsi="Calibri"/>
+        </w:rPr>
+        <w:t>Accepted boards stay in the board list. The creator and first three accepted contacts can edit; up to eight contacts may be invited.</w:t>
+      </w:r>
+    </w:p>
+    <w:p>
+      <w:pPr>
+        <w:numPr>
+          <w:ilvl w:val="0"/>
+          <w:numId w:val="15"/>
+        </w:numPr>
+        <w:spacing w:after="80" w:line="300" w:lineRule="auto"/>
+      </w:pPr>
+      <w:r>
+        <w:rPr>
+          <w:rFonts w:ascii="Calibri" w:hAnsi="Calibri"/>
+        </w:rPr>
+        <w:t>Use the same board tools and Export. Clear is immediate. Keep both phones unlocked, nearby, and inside the app while syncing.</w:t>
+      </w:r>
+    </w:p>
+    <w:p>
+      <w:pPr>
+        <w:pStyle w:val="Heading2"/>
+      </w:pPr>
+      <w:r>
+        <w:t>Same UI, different host</w:t>
       </w:r>
     </w:p>
     <w:tbl>
       <w:tblPr>
-        <w:tblW w:type="dxa" w:w="9360"/>
-        <w:jc w:val="center"/>
+        <w:tblStyle w:val="TableGrid"/>
+        <w:tblW w:type="dxa" w:w="9026"/>
+        <w:jc w:val="left"/>
+        <w:tblLayout w:type="fixed"/>
         <w:tblLook w:firstColumn="1" w:firstRow="1" w:lastColumn="0" w:lastRow="0" w:noHBand="0" w:noVBand="1" w:val="04A0"/>
-        <w:tblLayout w:type="fixed"/>
+        <w:tblInd w:w="120" w:type="dxa"/>
       </w:tblPr>
       <w:tblGrid>
-        <w:gridCol w:w="9360"/>
-      </w:tblGrid>
-      <w:tr>
-        <w:tc>
-          <w:tcPr>
-            <w:tcW w:type="dxa" w:w="5943600"/>
-            <w:shd w:fill="2E74B5"/>
-          </w:tcPr>
-          <w:p>
-            <w:r/>
-          </w:p>
-        </w:tc>
-      </w:tr>
-    </w:tbl>
-    <w:p>
-      <w:pPr>
-        <w:widowControl/>
-        <w:spacing w:before="0" w:after="40" w:line="240" w:lineRule="auto"/>
-      </w:pPr>
-    </w:p>
-    <w:p>
-      <w:pPr>
-        <w:keepNext/>
-        <w:widowControl/>
-        <w:spacing w:before="100" w:after="60" w:line="240" w:lineRule="auto"/>
-      </w:pPr>
-      <w:r>
-        <w:rPr>
-          <w:rFonts w:ascii="Calibri" w:hAnsi="Calibri" w:eastAsia="Calibri"/>
-          <w:b/>
-          <w:i w:val="0"/>
-          <w:color w:val="2E74B5"/>
-          <w:sz w:val="26"/>
-        </w:rPr>
-        <w:t>Why the old mobile sync failed</w:t>
-      </w:r>
-    </w:p>
-    <w:p>
-      <w:pPr>
-        <w:widowControl/>
-        <w:spacing w:before="0" w:after="60" w:line="269" w:lineRule="auto"/>
-      </w:pPr>
-      <w:r>
-        <w:rPr>
-          <w:rFonts w:ascii="Calibri" w:hAnsi="Calibri" w:eastAsia="Calibri"/>
-          <w:b w:val="0"/>
-          <w:i w:val="0"/>
-          <w:color w:val="1F2937"/>
-          <w:sz w:val="20"/>
-        </w:rPr>
-        <w:t>The earlier Android path sent long signed JSON events as many BLE fragments. One missing fragment could prevent the complete event from being rebuilt. Clear was much smaller and independent, so it arrived more often. Move and resize also depended on the original draw or text event; if that event was missing, the transformation had no visible target.</w:t>
-      </w:r>
-    </w:p>
-    <w:p>
-      <w:pPr>
-        <w:keepNext/>
-        <w:widowControl/>
-        <w:spacing w:before="100" w:after="60" w:line="240" w:lineRule="auto"/>
-      </w:pPr>
-      <w:r>
-        <w:rPr>
-          <w:rFonts w:ascii="Calibri" w:hAnsi="Calibri" w:eastAsia="Calibri"/>
-          <w:b/>
-          <w:i w:val="0"/>
-          <w:color w:val="2E74B5"/>
-          <w:sz w:val="26"/>
-        </w:rPr>
-        <w:t>What solved it</w:t>
-      </w:r>
-    </w:p>
-    <w:p>
-      <w:pPr>
-        <w:widowControl/>
-        <w:spacing w:before="0" w:after="60" w:line="269" w:lineRule="auto"/>
-      </w:pPr>
-      <w:r>
-        <w:rPr>
-          <w:rFonts w:ascii="Calibri" w:hAnsi="Calibri" w:eastAsia="Calibri"/>
-          <w:b w:val="0"/>
-          <w:i w:val="0"/>
-          <w:color w:val="1F2937"/>
-          <w:sz w:val="20"/>
-        </w:rPr>
-        <w:t>The current path stores every operation before transmission, compresses large payloads, sends one GATT frame at a time, waits for Android callbacks, requires a complete-operation ACK and retries missing delivery. Every five seconds, peers compare per-author frontiers and request missing ranges. Transformations are retained even when their target arrives later.</w:t>
-      </w:r>
-    </w:p>
-    <w:p>
-      <w:pPr>
-        <w:keepNext/>
-        <w:widowControl/>
-        <w:spacing w:before="100" w:after="60" w:line="240" w:lineRule="auto"/>
-      </w:pPr>
-      <w:r>
-        <w:rPr>
-          <w:rFonts w:ascii="Calibri" w:hAnsi="Calibri" w:eastAsia="Calibri"/>
-          <w:b/>
-          <w:i w:val="0"/>
-          <w:color w:val="2E74B5"/>
-          <w:sz w:val="26"/>
-        </w:rPr>
-        <w:t>Tremola and tinySSB are two different builds</w:t>
-      </w:r>
-    </w:p>
-    <w:tbl>
-      <w:tblPr>
-        <w:tblW w:type="dxa" w:w="9360"/>
-        <w:jc w:val="center"/>
-        <w:tblLook w:firstColumn="1" w:firstRow="1" w:lastColumn="0" w:lastRow="0" w:noHBand="0" w:noVBand="1" w:val="04A0"/>
-        <w:tblLayout w:type="fixed"/>
-        <w:tblBorders>
-          <w:top w:val="single" w:sz="4" w:color="D1D5DB"/>
-          <w:left w:val="single" w:sz="4" w:color="D1D5DB"/>
-          <w:bottom w:val="single" w:sz="4" w:color="D1D5DB"/>
-          <w:right w:val="single" w:sz="4" w:color="D1D5DB"/>
-          <w:insideH w:val="single" w:sz="4" w:color="D1D5DB"/>
-          <w:insideV w:val="single" w:sz="4" w:color="D1D5DB"/>
-        </w:tblBorders>
-      </w:tblPr>
-      <w:tblGrid>
-        <w:gridCol w:w="3120"/>
-        <w:gridCol w:w="3120"/>
-        <w:gridCol w:w="3120"/>
+        <w:gridCol w:w="1500"/>
+        <w:gridCol w:w="3763"/>
+        <w:gridCol w:w="3763"/>
       </w:tblGrid>
       <w:tr>
         <w:trPr>
@@ -1077,23 +1380,27 @@
         </w:trPr>
         <w:tc>
           <w:tcPr>
-            <w:tcW w:type="dxa" w:w="1051560"/>
-            <w:shd w:fill="2E74B5"/>
+            <w:tcW w:type="dxa" w:w="1500"/>
+            <w:shd w:fill="E8EEF5"/>
+            <w:tcMar>
+              <w:top w:w="80" w:type="dxa"/>
+              <w:start w:w="120" w:type="dxa"/>
+              <w:bottom w:w="80" w:type="dxa"/>
+              <w:end w:w="120" w:type="dxa"/>
+            </w:tcMar>
             <w:vAlign w:val="center"/>
           </w:tcPr>
           <w:p>
             <w:pPr>
-              <w:widowControl/>
-              <w:spacing w:before="0" w:after="20" w:line="240" w:lineRule="auto"/>
+              <w:keepNext/>
+              <w:spacing w:after="0"/>
             </w:pPr>
-            <w:r/>
             <w:r>
               <w:rPr>
-                <w:rFonts w:ascii="Calibri" w:hAnsi="Calibri" w:eastAsia="Calibri"/>
+                <w:rFonts w:ascii="Calibri" w:hAnsi="Calibri"/>
                 <w:b/>
-                <w:i w:val="0"/>
-                <w:color w:val="FFFFFF"/>
-                <w:sz w:val="18"/>
+                <w:color w:val="1F4D78"/>
+                <w:sz w:val="19"/>
               </w:rPr>
               <w:t>Topic</w:t>
             </w:r>
@@ -1101,23 +1408,27 @@
         </w:tc>
         <w:tc>
           <w:tcPr>
-            <w:tcW w:type="dxa" w:w="2423160"/>
-            <w:shd w:fill="2E74B5"/>
+            <w:tcW w:type="dxa" w:w="3763"/>
+            <w:shd w:fill="E8EEF5"/>
+            <w:tcMar>
+              <w:top w:w="80" w:type="dxa"/>
+              <w:start w:w="120" w:type="dxa"/>
+              <w:bottom w:w="80" w:type="dxa"/>
+              <w:end w:w="120" w:type="dxa"/>
+            </w:tcMar>
             <w:vAlign w:val="center"/>
           </w:tcPr>
           <w:p>
             <w:pPr>
-              <w:widowControl/>
-              <w:spacing w:before="0" w:after="20" w:line="240" w:lineRule="auto"/>
+              <w:keepNext/>
+              <w:spacing w:after="0"/>
             </w:pPr>
-            <w:r/>
             <w:r>
               <w:rPr>
-                <w:rFonts w:ascii="Calibri" w:hAnsi="Calibri" w:eastAsia="Calibri"/>
+                <w:rFonts w:ascii="Calibri" w:hAnsi="Calibri"/>
                 <w:b/>
-                <w:i w:val="0"/>
-                <w:color w:val="FFFFFF"/>
-                <w:sz w:val="18"/>
+                <w:color w:val="1F4D78"/>
+                <w:sz w:val="19"/>
               </w:rPr>
               <w:t>Tremola</w:t>
             </w:r>
@@ -1125,23 +1436,27 @@
         </w:tc>
         <w:tc>
           <w:tcPr>
-            <w:tcW w:type="dxa" w:w="2468880"/>
-            <w:shd w:fill="2E74B5"/>
+            <w:tcW w:type="dxa" w:w="3763"/>
+            <w:shd w:fill="E8EEF5"/>
+            <w:tcMar>
+              <w:top w:w="80" w:type="dxa"/>
+              <w:start w:w="120" w:type="dxa"/>
+              <w:bottom w:w="80" w:type="dxa"/>
+              <w:end w:w="120" w:type="dxa"/>
+            </w:tcMar>
             <w:vAlign w:val="center"/>
           </w:tcPr>
           <w:p>
             <w:pPr>
-              <w:widowControl/>
-              <w:spacing w:before="0" w:after="20" w:line="240" w:lineRule="auto"/>
+              <w:keepNext/>
+              <w:spacing w:after="0"/>
             </w:pPr>
-            <w:r/>
             <w:r>
               <w:rPr>
-                <w:rFonts w:ascii="Calibri" w:hAnsi="Calibri" w:eastAsia="Calibri"/>
+                <w:rFonts w:ascii="Calibri" w:hAnsi="Calibri"/>
                 <w:b/>
-                <w:i w:val="0"/>
-                <w:color w:val="FFFFFF"/>
-                <w:sz w:val="18"/>
+                <w:color w:val="1F4D78"/>
+                <w:sz w:val="19"/>
               </w:rPr>
               <w:t>tinySSB</w:t>
             </w:r>
@@ -1154,70 +1469,76 @@
         </w:trPr>
         <w:tc>
           <w:tcPr>
-            <w:tcW w:type="dxa" w:w="1051560"/>
+            <w:tcW w:type="dxa" w:w="1500"/>
+            <w:tcMar>
+              <w:top w:w="80" w:type="dxa"/>
+              <w:start w:w="120" w:type="dxa"/>
+              <w:bottom w:w="80" w:type="dxa"/>
+              <w:end w:w="120" w:type="dxa"/>
+            </w:tcMar>
             <w:vAlign w:val="center"/>
           </w:tcPr>
           <w:p>
             <w:pPr>
-              <w:widowControl/>
-              <w:spacing w:before="0" w:after="20" w:line="247" w:lineRule="auto"/>
+              <w:keepNext/>
+              <w:spacing w:after="0" w:line="269" w:lineRule="auto"/>
             </w:pPr>
-            <w:r/>
             <w:r>
               <w:rPr>
-                <w:rFonts w:ascii="Calibri" w:hAnsi="Calibri" w:eastAsia="Calibri"/>
-                <w:b/>
-                <w:i w:val="0"/>
-                <w:color w:val="1F2937"/>
-                <w:sz w:val="16"/>
+                <w:rFonts w:ascii="Calibri" w:hAnsi="Calibri"/>
+                <w:sz w:val="18"/>
               </w:rPr>
-              <w:t>Host</w:t>
+              <w:t>Android</w:t>
             </w:r>
           </w:p>
         </w:tc>
         <w:tc>
           <w:tcPr>
-            <w:tcW w:type="dxa" w:w="2423160"/>
+            <w:tcW w:type="dxa" w:w="3763"/>
+            <w:tcMar>
+              <w:top w:w="80" w:type="dxa"/>
+              <w:start w:w="120" w:type="dxa"/>
+              <w:bottom w:w="80" w:type="dxa"/>
+              <w:end w:w="120" w:type="dxa"/>
+            </w:tcMar>
             <w:vAlign w:val="center"/>
           </w:tcPr>
           <w:p>
             <w:pPr>
-              <w:widowControl/>
-              <w:spacing w:before="0" w:after="20" w:line="247" w:lineRule="auto"/>
+              <w:keepNext/>
+              <w:spacing w:after="0" w:line="269" w:lineRule="auto"/>
             </w:pPr>
-            <w:r/>
             <w:r>
               <w:rPr>
-                <w:rFonts w:ascii="Calibri" w:hAnsi="Calibri" w:eastAsia="Calibri"/>
-                <w:b w:val="0"/>
-                <w:i w:val="0"/>
-                <w:color w:val="1F2937"/>
-                <w:sz w:val="16"/>
+                <w:rFonts w:ascii="Calibri" w:hAnsi="Calibri"/>
+                <w:sz w:val="18"/>
               </w:rPr>
-              <w:t>Full Tremola Android app</w:t>
+              <w:t>API 24+ (Android 7+)</w:t>
             </w:r>
           </w:p>
         </w:tc>
         <w:tc>
           <w:tcPr>
-            <w:tcW w:type="dxa" w:w="2468880"/>
+            <w:tcW w:type="dxa" w:w="3763"/>
+            <w:tcMar>
+              <w:top w:w="80" w:type="dxa"/>
+              <w:start w:w="120" w:type="dxa"/>
+              <w:bottom w:w="80" w:type="dxa"/>
+              <w:end w:w="120" w:type="dxa"/>
+            </w:tcMar>
             <w:vAlign w:val="center"/>
           </w:tcPr>
           <w:p>
             <w:pPr>
-              <w:widowControl/>
-              <w:spacing w:before="0" w:after="20" w:line="247" w:lineRule="auto"/>
+              <w:keepNext/>
+              <w:spacing w:after="0" w:line="269" w:lineRule="auto"/>
             </w:pPr>
-            <w:r/>
             <w:r>
               <w:rPr>
-                <w:rFonts w:ascii="Calibri" w:hAnsi="Calibri" w:eastAsia="Calibri"/>
-                <w:b w:val="0"/>
-                <w:i w:val="0"/>
-                <w:color w:val="1F2937"/>
-                <w:sz w:val="16"/>
+                <w:rFonts w:ascii="Calibri" w:hAnsi="Calibri"/>
+                <w:sz w:val="18"/>
               </w:rPr>
-              <w:t>Official tinySSB Android app</w:t>
+              <w:t>API 26+ (Android 8+)</w:t>
             </w:r>
           </w:p>
         </w:tc>
@@ -1228,73 +1549,76 @@
         </w:trPr>
         <w:tc>
           <w:tcPr>
-            <w:tcW w:type="dxa" w:w="1051560"/>
-            <w:shd w:fill="F3F4F6"/>
+            <w:tcW w:type="dxa" w:w="1500"/>
+            <w:tcMar>
+              <w:top w:w="80" w:type="dxa"/>
+              <w:start w:w="120" w:type="dxa"/>
+              <w:bottom w:w="80" w:type="dxa"/>
+              <w:end w:w="120" w:type="dxa"/>
+            </w:tcMar>
             <w:vAlign w:val="center"/>
           </w:tcPr>
           <w:p>
             <w:pPr>
-              <w:widowControl/>
-              <w:spacing w:before="0" w:after="20" w:line="247" w:lineRule="auto"/>
+              <w:keepNext/>
+              <w:spacing w:after="0" w:line="269" w:lineRule="auto"/>
             </w:pPr>
-            <w:r/>
             <w:r>
               <w:rPr>
-                <w:rFonts w:ascii="Calibri" w:hAnsi="Calibri" w:eastAsia="Calibri"/>
-                <w:b/>
-                <w:i w:val="0"/>
-                <w:color w:val="1F2937"/>
-                <w:sz w:val="16"/>
+                <w:rFonts w:ascii="Calibri" w:hAnsi="Calibri"/>
+                <w:sz w:val="18"/>
               </w:rPr>
-              <w:t>Event path</w:t>
+              <w:t>Join</w:t>
             </w:r>
           </w:p>
         </w:tc>
         <w:tc>
           <w:tcPr>
-            <w:tcW w:type="dxa" w:w="2423160"/>
-            <w:shd w:fill="F3F4F6"/>
+            <w:tcW w:type="dxa" w:w="3763"/>
+            <w:tcMar>
+              <w:top w:w="80" w:type="dxa"/>
+              <w:start w:w="120" w:type="dxa"/>
+              <w:bottom w:w="80" w:type="dxa"/>
+              <w:end w:w="120" w:type="dxa"/>
+            </w:tcMar>
             <w:vAlign w:val="center"/>
           </w:tcPr>
           <w:p>
             <w:pPr>
-              <w:widowControl/>
-              <w:spacing w:before="0" w:after="20" w:line="247" w:lineRule="auto"/>
+              <w:keepNext/>
+              <w:spacing w:after="0" w:line="269" w:lineRule="auto"/>
             </w:pPr>
-            <w:r/>
             <w:r>
               <w:rPr>
-                <w:rFonts w:ascii="Calibri" w:hAnsi="Calibri" w:eastAsia="Calibri"/>
-                <w:b w:val="0"/>
-                <w:i w:val="0"/>
-                <w:color w:val="1F2937"/>
-                <w:sz w:val="16"/>
+                <w:rFonts w:ascii="Calibri" w:hAnsi="Calibri"/>
+                <w:sz w:val="18"/>
               </w:rPr>
-              <w:t>Encrypted board operations in Room + local Tremola custom log</w:t>
+              <w:t>Direct six-digit room code</w:t>
             </w:r>
           </w:p>
         </w:tc>
         <w:tc>
           <w:tcPr>
-            <w:tcW w:type="dxa" w:w="2468880"/>
-            <w:shd w:fill="F3F4F6"/>
+            <w:tcW w:type="dxa" w:w="3763"/>
+            <w:tcMar>
+              <w:top w:w="80" w:type="dxa"/>
+              <w:start w:w="120" w:type="dxa"/>
+              <w:bottom w:w="80" w:type="dxa"/>
+              <w:end w:w="120" w:type="dxa"/>
+            </w:tcMar>
             <w:vAlign w:val="center"/>
           </w:tcPr>
           <w:p>
             <w:pPr>
-              <w:widowControl/>
-              <w:spacing w:before="0" w:after="20" w:line="247" w:lineRule="auto"/>
+              <w:keepNext/>
+              <w:spacing w:after="0" w:line="269" w:lineRule="auto"/>
             </w:pPr>
-            <w:r/>
             <w:r>
               <w:rPr>
-                <w:rFonts w:ascii="Calibri" w:hAnsi="Calibri" w:eastAsia="Calibri"/>
-                <w:b w:val="0"/>
-                <w:i w:val="0"/>
-                <w:color w:val="1F2937"/>
-                <w:sz w:val="16"/>
+                <w:rFonts w:ascii="Calibri" w:hAnsi="Calibri"/>
+                <w:sz w:val="18"/>
               </w:rPr>
-              <w:t>Public WBD events in the tinySSB log</w:t>
+              <w:t>Signed invite from a verified contact</w:t>
             </w:r>
           </w:p>
         </w:tc>
@@ -1305,70 +1629,76 @@
         </w:trPr>
         <w:tc>
           <w:tcPr>
-            <w:tcW w:type="dxa" w:w="1051560"/>
+            <w:tcW w:type="dxa" w:w="1500"/>
+            <w:tcMar>
+              <w:top w:w="80" w:type="dxa"/>
+              <w:start w:w="120" w:type="dxa"/>
+              <w:bottom w:w="80" w:type="dxa"/>
+              <w:end w:w="120" w:type="dxa"/>
+            </w:tcMar>
             <w:vAlign w:val="center"/>
           </w:tcPr>
           <w:p>
             <w:pPr>
-              <w:widowControl/>
-              <w:spacing w:before="0" w:after="20" w:line="247" w:lineRule="auto"/>
+              <w:keepNext/>
+              <w:spacing w:after="0" w:line="269" w:lineRule="auto"/>
             </w:pPr>
-            <w:r/>
             <w:r>
               <w:rPr>
-                <w:rFonts w:ascii="Calibri" w:hAnsi="Calibri" w:eastAsia="Calibri"/>
-                <w:b/>
-                <w:i w:val="0"/>
-                <w:color w:val="1F2937"/>
-                <w:sz w:val="16"/>
+                <w:rFonts w:ascii="Calibri" w:hAnsi="Calibri"/>
+                <w:sz w:val="18"/>
               </w:rPr>
-              <w:t>Recovery</w:t>
+              <w:t>Transport</w:t>
             </w:r>
           </w:p>
         </w:tc>
         <w:tc>
           <w:tcPr>
-            <w:tcW w:type="dxa" w:w="2423160"/>
+            <w:tcW w:type="dxa" w:w="3763"/>
+            <w:tcMar>
+              <w:top w:w="80" w:type="dxa"/>
+              <w:start w:w="120" w:type="dxa"/>
+              <w:bottom w:w="80" w:type="dxa"/>
+              <w:end w:w="120" w:type="dxa"/>
+            </w:tcMar>
             <w:vAlign w:val="center"/>
           </w:tcPr>
           <w:p>
             <w:pPr>
-              <w:widowControl/>
-              <w:spacing w:before="0" w:after="20" w:line="247" w:lineRule="auto"/>
+              <w:keepNext/>
+              <w:spacing w:after="0" w:line="269" w:lineRule="auto"/>
             </w:pPr>
-            <w:r/>
             <w:r>
               <w:rPr>
-                <w:rFonts w:ascii="Calibri" w:hAnsi="Calibri" w:eastAsia="Calibri"/>
-                <w:b w:val="0"/>
-                <w:i w:val="0"/>
-                <w:color w:val="1F2937"/>
-                <w:sz w:val="16"/>
+                <w:rFonts w:ascii="Calibri" w:hAnsi="Calibri"/>
+                <w:sz w:val="18"/>
               </w:rPr>
-              <w:t>Operation ACK, retry, frontier and WANT ranges</w:t>
+              <w:t>Custom compact board protocol with ACK/retry/frontier/WANT</w:t>
             </w:r>
           </w:p>
         </w:tc>
         <w:tc>
           <w:tcPr>
-            <w:tcW w:type="dxa" w:w="2468880"/>
+            <w:tcW w:type="dxa" w:w="3763"/>
+            <w:tcMar>
+              <w:top w:w="80" w:type="dxa"/>
+              <w:start w:w="120" w:type="dxa"/>
+              <w:bottom w:w="80" w:type="dxa"/>
+              <w:end w:w="120" w:type="dxa"/>
+            </w:tcMar>
             <w:vAlign w:val="center"/>
           </w:tcPr>
           <w:p>
             <w:pPr>
-              <w:widowControl/>
-              <w:spacing w:before="0" w:after="20" w:line="247" w:lineRule="auto"/>
+              <w:keepNext/>
+              <w:spacing w:after="0" w:line="269" w:lineRule="auto"/>
             </w:pPr>
-            <w:r/>
             <w:r>
               <w:rPr>
-                <w:rFonts w:ascii="Calibri" w:hAnsi="Calibri" w:eastAsia="Calibri"/>
-                <w:b w:val="0"/>
-                <w:i w:val="0"/>
-                <w:color w:val="1F2937"/>
-                <w:sz w:val="16"/>
+                <w:rFonts w:ascii="Calibri" w:hAnsi="Calibri"/>
+                <w:sz w:val="18"/>
               </w:rPr>
-              <w:t>Upstream tinySSB WANT/CHNK packet recovery</w:t>
+              <w:t>Official tinySSB feed packets and chunk recovery</w:t>
             </w:r>
           </w:p>
         </w:tc>
@@ -1379,73 +1709,76 @@
         </w:trPr>
         <w:tc>
           <w:tcPr>
-            <w:tcW w:type="dxa" w:w="1051560"/>
-            <w:shd w:fill="F3F4F6"/>
+            <w:tcW w:type="dxa" w:w="1500"/>
+            <w:tcMar>
+              <w:top w:w="80" w:type="dxa"/>
+              <w:start w:w="120" w:type="dxa"/>
+              <w:bottom w:w="80" w:type="dxa"/>
+              <w:end w:w="120" w:type="dxa"/>
+            </w:tcMar>
             <w:vAlign w:val="center"/>
           </w:tcPr>
           <w:p>
             <w:pPr>
-              <w:widowControl/>
-              <w:spacing w:before="0" w:after="20" w:line="247" w:lineRule="auto"/>
+              <w:keepNext/>
+              <w:spacing w:after="0" w:line="269" w:lineRule="auto"/>
             </w:pPr>
-            <w:r/>
             <w:r>
               <w:rPr>
-                <w:rFonts w:ascii="Calibri" w:hAnsi="Calibri" w:eastAsia="Calibri"/>
-                <w:b/>
-                <w:i w:val="0"/>
-                <w:color w:val="1F2937"/>
-                <w:sz w:val="16"/>
+                <w:rFonts w:ascii="Calibri" w:hAnsi="Calibri"/>
+                <w:sz w:val="18"/>
               </w:rPr>
-              <w:t>Code</w:t>
+              <w:t>Privacy</w:t>
             </w:r>
           </w:p>
         </w:tc>
         <w:tc>
           <w:tcPr>
-            <w:tcW w:type="dxa" w:w="2423160"/>
-            <w:shd w:fill="F3F4F6"/>
+            <w:tcW w:type="dxa" w:w="3763"/>
+            <w:tcMar>
+              <w:top w:w="80" w:type="dxa"/>
+              <w:start w:w="120" w:type="dxa"/>
+              <w:bottom w:w="80" w:type="dxa"/>
+              <w:end w:w="120" w:type="dxa"/>
+            </w:tcMar>
             <w:vAlign w:val="center"/>
           </w:tcPr>
           <w:p>
             <w:pPr>
-              <w:widowControl/>
-              <w:spacing w:before="0" w:after="20" w:line="247" w:lineRule="auto"/>
+              <w:keepNext/>
+              <w:spacing w:after="0" w:line="269" w:lineRule="auto"/>
             </w:pPr>
-            <w:r/>
             <w:r>
               <w:rPr>
-                <w:rFonts w:ascii="Calibri" w:hAnsi="Calibri" w:eastAsia="Calibri"/>
-                <w:b w:val="0"/>
-                <w:i w:val="0"/>
-                <w:color w:val="1F2937"/>
-                <w:sz w:val="16"/>
+                <w:rFonts w:ascii="Calibri" w:hAnsi="Calibri"/>
+                <w:sz w:val="18"/>
               </w:rPr>
-              <w:t>SHA-256-derived key; simple access code</w:t>
+              <w:t>Signed + AES-GCM payload; short code remains weak</w:t>
             </w:r>
           </w:p>
         </w:tc>
         <w:tc>
           <w:tcPr>
-            <w:tcW w:type="dxa" w:w="2468880"/>
-            <w:shd w:fill="F3F4F6"/>
+            <w:tcW w:type="dxa" w:w="3763"/>
+            <w:tcMar>
+              <w:top w:w="80" w:type="dxa"/>
+              <w:start w:w="120" w:type="dxa"/>
+              <w:bottom w:w="80" w:type="dxa"/>
+              <w:end w:w="120" w:type="dxa"/>
+            </w:tcMar>
             <w:vAlign w:val="center"/>
           </w:tcPr>
           <w:p>
             <w:pPr>
-              <w:widowControl/>
-              <w:spacing w:before="0" w:after="20" w:line="247" w:lineRule="auto"/>
+              <w:keepNext/>
+              <w:spacing w:after="0" w:line="269" w:lineRule="auto"/>
             </w:pPr>
-            <w:r/>
             <w:r>
               <w:rPr>
-                <w:rFonts w:ascii="Calibri" w:hAnsi="Calibri" w:eastAsia="Calibri"/>
-                <w:b w:val="0"/>
-                <w:i w:val="0"/>
-                <w:color w:val="1F2937"/>
-                <w:sz w:val="16"/>
+                <w:rFonts w:ascii="Calibri" w:hAnsi="Calibri"/>
+                <w:sz w:val="18"/>
               </w:rPr>
-              <w:t>Deterministic board selector; not encryption</w:t>
+              <w:t>Signed public WBD events; app invitation rule only</w:t>
             </w:r>
           </w:p>
         </w:tc>
@@ -1456,70 +1789,76 @@
         </w:trPr>
         <w:tc>
           <w:tcPr>
-            <w:tcW w:type="dxa" w:w="1051560"/>
+            <w:tcW w:type="dxa" w:w="1500"/>
+            <w:tcMar>
+              <w:top w:w="80" w:type="dxa"/>
+              <w:start w:w="120" w:type="dxa"/>
+              <w:bottom w:w="80" w:type="dxa"/>
+              <w:end w:w="120" w:type="dxa"/>
+            </w:tcMar>
             <w:vAlign w:val="center"/>
           </w:tcPr>
           <w:p>
             <w:pPr>
-              <w:widowControl/>
-              <w:spacing w:before="0" w:after="20" w:line="247" w:lineRule="auto"/>
+              <w:keepNext/>
+              <w:spacing w:after="0" w:line="269" w:lineRule="auto"/>
             </w:pPr>
-            <w:r/>
             <w:r>
               <w:rPr>
-                <w:rFonts w:ascii="Calibri" w:hAnsi="Calibri" w:eastAsia="Calibri"/>
-                <w:b/>
-                <w:i w:val="0"/>
-                <w:color w:val="1F2937"/>
-                <w:sz w:val="16"/>
+                <w:rFonts w:ascii="Calibri" w:hAnsi="Calibri"/>
+                <w:sz w:val="18"/>
               </w:rPr>
-              <w:t>Members</w:t>
+              <w:t>Editors</w:t>
             </w:r>
           </w:p>
         </w:tc>
         <w:tc>
           <w:tcPr>
-            <w:tcW w:type="dxa" w:w="2423160"/>
+            <w:tcW w:type="dxa" w:w="3763"/>
+            <w:tcMar>
+              <w:top w:w="80" w:type="dxa"/>
+              <w:start w:w="120" w:type="dxa"/>
+              <w:bottom w:w="80" w:type="dxa"/>
+              <w:end w:w="120" w:type="dxa"/>
+            </w:tcMar>
             <w:vAlign w:val="center"/>
           </w:tcPr>
           <w:p>
             <w:pPr>
-              <w:widowControl/>
-              <w:spacing w:before="0" w:after="20" w:line="247" w:lineRule="auto"/>
+              <w:keepNext/>
+              <w:spacing w:after="0" w:line="269" w:lineRule="auto"/>
             </w:pPr>
-            <w:r/>
             <w:r>
               <w:rPr>
-                <w:rFonts w:ascii="Calibri" w:hAnsi="Calibri" w:eastAsia="Calibri"/>
-                <w:b w:val="0"/>
-                <w:i w:val="0"/>
-                <w:color w:val="1F2937"/>
-                <w:sz w:val="16"/>
+                <w:rFonts w:ascii="Calibri" w:hAnsi="Calibri"/>
+                <w:sz w:val="18"/>
               </w:rPr>
-              <w:t>At most four known identities per phone</w:t>
+              <w:t>Up to four feed IDs</w:t>
             </w:r>
           </w:p>
         </w:tc>
         <w:tc>
           <w:tcPr>
-            <w:tcW w:type="dxa" w:w="2468880"/>
+            <w:tcW w:type="dxa" w:w="3763"/>
+            <w:tcMar>
+              <w:top w:w="80" w:type="dxa"/>
+              <w:start w:w="120" w:type="dxa"/>
+              <w:bottom w:w="80" w:type="dxa"/>
+              <w:end w:w="120" w:type="dxa"/>
+            </w:tcMar>
             <w:vAlign w:val="center"/>
           </w:tcPr>
           <w:p>
             <w:pPr>
-              <w:widowControl/>
-              <w:spacing w:before="0" w:after="20" w:line="247" w:lineRule="auto"/>
+              <w:keepNext/>
+              <w:spacing w:after="0" w:line="269" w:lineRule="auto"/>
             </w:pPr>
-            <w:r/>
             <w:r>
               <w:rPr>
-                <w:rFonts w:ascii="Calibri" w:hAnsi="Calibri" w:eastAsia="Calibri"/>
-                <w:b w:val="0"/>
-                <w:i w:val="0"/>
-                <w:color w:val="1F2937"/>
-                <w:sz w:val="16"/>
+                <w:rFonts w:ascii="Calibri" w:hAnsi="Calibri"/>
+                <w:sz w:val="18"/>
               </w:rPr>
-              <w:t>Four shown in UI; no hard access limit</w:t>
+              <w:t>Creator + first three accepted contacts</w:t>
             </w:r>
           </w:p>
         </w:tc>
@@ -1530,73 +1869,73 @@
         </w:trPr>
         <w:tc>
           <w:tcPr>
-            <w:tcW w:type="dxa" w:w="1051560"/>
-            <w:shd w:fill="F3F4F6"/>
+            <w:tcW w:type="dxa" w:w="1500"/>
+            <w:tcMar>
+              <w:top w:w="80" w:type="dxa"/>
+              <w:start w:w="120" w:type="dxa"/>
+              <w:bottom w:w="80" w:type="dxa"/>
+              <w:end w:w="120" w:type="dxa"/>
+            </w:tcMar>
             <w:vAlign w:val="center"/>
           </w:tcPr>
           <w:p>
             <w:pPr>
-              <w:widowControl/>
-              <w:spacing w:before="0" w:after="20" w:line="247" w:lineRule="auto"/>
+              <w:spacing w:after="0" w:line="269" w:lineRule="auto"/>
             </w:pPr>
-            <w:r/>
             <w:r>
               <w:rPr>
-                <w:rFonts w:ascii="Calibri" w:hAnsi="Calibri" w:eastAsia="Calibri"/>
-                <w:b/>
-                <w:i w:val="0"/>
-                <w:color w:val="1F2937"/>
-                <w:sz w:val="16"/>
+                <w:rFonts w:ascii="Calibri" w:hAnsi="Calibri"/>
+                <w:sz w:val="18"/>
               </w:rPr>
-              <w:t>Role</w:t>
+              <w:t>Observed sync</w:t>
             </w:r>
           </w:p>
         </w:tc>
         <w:tc>
           <w:tcPr>
-            <w:tcW w:type="dxa" w:w="2423160"/>
-            <w:shd w:fill="F3F4F6"/>
+            <w:tcW w:type="dxa" w:w="3763"/>
+            <w:tcMar>
+              <w:top w:w="80" w:type="dxa"/>
+              <w:start w:w="120" w:type="dxa"/>
+              <w:bottom w:w="80" w:type="dxa"/>
+              <w:end w:w="120" w:type="dxa"/>
+            </w:tcMar>
             <w:vAlign w:val="center"/>
           </w:tcPr>
           <w:p>
             <w:pPr>
-              <w:widowControl/>
-              <w:spacing w:before="0" w:after="20" w:line="247" w:lineRule="auto"/>
+              <w:spacing w:after="0" w:line="269" w:lineRule="auto"/>
             </w:pPr>
-            <w:r/>
             <w:r>
               <w:rPr>
-                <w:rFonts w:ascii="Calibri" w:hAnsi="Calibri" w:eastAsia="Calibri"/>
-                <w:b w:val="0"/>
-                <w:i w:val="0"/>
-                <w:color w:val="1F2937"/>
-                <w:sz w:val="16"/>
+                <w:rFonts w:ascii="Calibri" w:hAnsi="Calibri"/>
+                <w:sz w:val="18"/>
               </w:rPr>
-              <w:t>Main submission and real-phone test</w:t>
+              <w:t>Much faster in current phone observations</w:t>
             </w:r>
           </w:p>
         </w:tc>
         <w:tc>
           <w:tcPr>
-            <w:tcW w:type="dxa" w:w="2468880"/>
-            <w:shd w:fill="F3F4F6"/>
+            <w:tcW w:type="dxa" w:w="3763"/>
+            <w:tcMar>
+              <w:top w:w="80" w:type="dxa"/>
+              <w:start w:w="120" w:type="dxa"/>
+              <w:bottom w:w="80" w:type="dxa"/>
+              <w:end w:w="120" w:type="dxa"/>
+            </w:tcMar>
             <w:vAlign w:val="center"/>
           </w:tcPr>
           <w:p>
             <w:pPr>
-              <w:widowControl/>
-              <w:spacing w:before="0" w:after="20" w:line="247" w:lineRule="auto"/>
+              <w:spacing w:after="0" w:line="269" w:lineRule="auto"/>
             </w:pPr>
-            <w:r/>
             <w:r>
               <w:rPr>
-                <w:rFonts w:ascii="Calibri" w:hAnsi="Calibri" w:eastAsia="Calibri"/>
-                <w:b w:val="0"/>
-                <w:i w:val="0"/>
-                <w:color w:val="1F2937"/>
-                <w:sz w:val="16"/>
+                <w:rFonts w:ascii="Calibri" w:hAnsi="Calibri"/>
+                <w:sz w:val="18"/>
               </w:rPr>
-              <w:t>Experimental comparison build</w:t>
+              <w:t>Slower; sometimes unstable or disconnected</w:t>
             </w:r>
           </w:p>
         </w:tc>
@@ -1604,224 +1943,486 @@
     </w:tbl>
     <w:p>
       <w:pPr>
-        <w:keepNext/>
-        <w:widowControl/>
-        <w:spacing w:before="100" w:after="60" w:line="240" w:lineRule="auto"/>
+        <w:spacing w:after="40"/>
+      </w:pPr>
+    </w:p>
+    <w:p>
+      <w:pPr>
+        <w:spacing w:before="80" w:after="200"/>
+        <w:ind w:left="200" w:right="160"/>
+        <w:shd w:fill="EAF1FB"/>
+        <w:pBdr>
+          <w:left w:val="single" w:sz="20" w:space="8" w:color="2E74B5"/>
+        </w:pBdr>
       </w:pPr>
       <w:r>
         <w:rPr>
-          <w:rFonts w:ascii="Calibri" w:hAnsi="Calibri" w:eastAsia="Calibri"/>
+          <w:rFonts w:ascii="Calibri" w:hAnsi="Calibri"/>
           <w:b/>
-          <w:i w:val="0"/>
-          <w:color w:val="2E74B5"/>
-          <w:sz w:val="26"/>
+          <w:color w:val="1F4D78"/>
         </w:rPr>
-        <w:t>Where the evidence is</w:t>
+        <w:t xml:space="preserve">Important. </w:t>
+      </w:r>
+      <w:r>
+        <w:rPr>
+          <w:rFonts w:ascii="Calibri" w:hAnsi="Calibri"/>
+        </w:rPr>
+        <w:t>Both use the same finite canvas, operation reducer, saved-board flow, four-editor limit, and JPEG/PDF export. Use one variant and version per test: Tremola and tinySSB do not synchronize with each other.</w:t>
       </w:r>
     </w:p>
     <w:p>
       <w:pPr>
-        <w:pStyle w:val="ListBullet"/>
-        <w:widowControl/>
-        <w:spacing w:before="0" w:after="40" w:line="259" w:lineRule="auto"/>
-        <w:ind w:left="360" w:hanging="216"/>
+        <w:pStyle w:val="Heading1"/>
       </w:pPr>
       <w:r>
-        <w:rPr>
-          <w:rFonts w:ascii="Calibri" w:hAnsi="Calibri" w:eastAsia="Calibri"/>
-          <w:b w:val="0"/>
-          <w:i w:val="0"/>
-          <w:color w:val="1F2937"/>
-          <w:sz w:val="19"/>
-        </w:rPr>
-        <w:t>UI, events and merge: miniApps/collabboard/src/collabboard.js</w:t>
+        <w:t>6. Evidence and Final Test</w:t>
       </w:r>
     </w:p>
     <w:p>
       <w:pPr>
-        <w:pStyle w:val="ListBullet"/>
-        <w:widowControl/>
-        <w:spacing w:before="0" w:after="40" w:line="259" w:lineRule="auto"/>
-        <w:ind w:left="360" w:hanging="216"/>
+        <w:pStyle w:val="Heading2"/>
       </w:pPr>
       <w:r>
-        <w:rPr>
-          <w:rFonts w:ascii="Calibri" w:hAnsi="Calibri" w:eastAsia="Calibri"/>
-          <w:b w:val="0"/>
-          <w:i w:val="0"/>
-          <w:color w:val="1F2937"/>
-          <w:sz w:val="19"/>
-        </w:rPr>
-        <w:t>Code, SHA-256, AES-GCM and signatures: app/src/main/java/nz/scuttlebutt/tremola/ssb/peering/ble/BoardProtocol.kt</w:t>
+        <w:t>Repo source map</w:t>
       </w:r>
     </w:p>
     <w:p>
       <w:pPr>
-        <w:pStyle w:val="ListBullet"/>
-        <w:widowControl/>
-        <w:spacing w:before="0" w:after="40" w:line="259" w:lineRule="auto"/>
-        <w:ind w:left="360" w:hanging="216"/>
+        <w:spacing w:after="80"/>
       </w:pPr>
       <w:r>
         <w:rPr>
-          <w:rFonts w:ascii="Calibri" w:hAnsi="Calibri" w:eastAsia="Calibri"/>
-          <w:b w:val="0"/>
-          <w:i w:val="0"/>
-          <w:color w:val="1F2937"/>
+          <w:rFonts w:ascii="Consolas" w:hAnsi="Consolas"/>
+          <w:b/>
+          <w:color w:val="1F4D78"/>
           <w:sz w:val="19"/>
         </w:rPr>
-        <w:t>BLE ACK, retry, frontier, WANT and roster: app/src/main/java/nz/scuttlebutt/tremola/ssb/peering/ble/BleSync.kt</w:t>
+        <w:t>miniApps/collabboard/</w:t>
+      </w:r>
+      <w:r>
+        <w:rPr>
+          <w:rFonts w:ascii="Calibri" w:hAnsi="Calibri"/>
+          <w:sz w:val="20"/>
+        </w:rPr>
+        <w:t xml:space="preserve"> — shared HTML, CSS, JavaScript UI, operations, merge rules, finite canvas, and local export rendering</w:t>
       </w:r>
     </w:p>
     <w:p>
       <w:pPr>
-        <w:pStyle w:val="ListBullet"/>
-        <w:widowControl/>
-        <w:spacing w:before="0" w:after="40" w:line="259" w:lineRule="auto"/>
-        <w:ind w:left="360" w:hanging="216"/>
+        <w:spacing w:after="80"/>
       </w:pPr>
       <w:r>
         <w:rPr>
-          <w:rFonts w:ascii="Calibri" w:hAnsi="Calibri" w:eastAsia="Calibri"/>
-          <w:b w:val="0"/>
-          <w:i w:val="0"/>
-          <w:color w:val="1F2937"/>
+          <w:rFonts w:ascii="Consolas" w:hAnsi="Consolas"/>
+          <w:b/>
+          <w:color w:val="1F4D78"/>
           <w:sz w:val="19"/>
         </w:rPr>
-        <w:t>Android bridge and storage: WebAppInterface.kt, BoardOperation.kt and BoardOperationDAO.kt</w:t>
+        <w:t>app/.../WebAppInterface.kt</w:t>
+      </w:r>
+      <w:r>
+        <w:rPr>
+          <w:rFonts w:ascii="Calibri" w:hAnsi="Calibri"/>
+          <w:sz w:val="20"/>
+        </w:rPr>
+        <w:t xml:space="preserve"> — Tremola WebView bridge, board commands, clipboard, JPEG/PDF preparation</w:t>
       </w:r>
     </w:p>
     <w:p>
       <w:pPr>
-        <w:pStyle w:val="ListBullet"/>
-        <w:widowControl/>
-        <w:spacing w:before="0" w:after="40" w:line="259" w:lineRule="auto"/>
-        <w:ind w:left="360" w:hanging="216"/>
+        <w:spacing w:after="80"/>
       </w:pPr>
       <w:r>
         <w:rPr>
-          <w:rFonts w:ascii="Calibri" w:hAnsi="Calibri" w:eastAsia="Calibri"/>
-          <w:b w:val="0"/>
-          <w:i w:val="0"/>
-          <w:color w:val="1F2937"/>
+          <w:rFonts w:ascii="Consolas" w:hAnsi="Consolas"/>
+          <w:b/>
+          <w:color w:val="1F4D78"/>
           <w:sz w:val="19"/>
         </w:rPr>
-        <w:t>Automated evidence: tests/collabboard.test.js, app/src/test and app/src/androidTest</w:t>
+        <w:t>app/.../MainActivity.kt</w:t>
+      </w:r>
+      <w:r>
+        <w:rPr>
+          <w:rFonts w:ascii="Calibri" w:hAnsi="Calibri"/>
+          <w:sz w:val="20"/>
+        </w:rPr>
+        <w:t xml:space="preserve"> — Android lifecycle, permissions, file picker, and exported-file writer</w:t>
       </w:r>
     </w:p>
     <w:p>
       <w:pPr>
-        <w:pStyle w:val="ListBullet"/>
-        <w:widowControl/>
-        <w:spacing w:before="0" w:after="40" w:line="259" w:lineRule="auto"/>
-        <w:ind w:left="360" w:hanging="216"/>
+        <w:spacing w:after="80"/>
       </w:pPr>
       <w:r>
         <w:rPr>
-          <w:rFonts w:ascii="Calibri" w:hAnsi="Calibri" w:eastAsia="Calibri"/>
-          <w:b w:val="0"/>
-          <w:i w:val="0"/>
-          <w:color w:val="1F2937"/>
+          <w:rFonts w:ascii="Consolas" w:hAnsi="Consolas"/>
+          <w:b/>
+          <w:color w:val="1F4D78"/>
           <w:sz w:val="19"/>
         </w:rPr>
-        <w:t>tinySSB differences: tinyssb/whiteboard/adapter.js and tinyssb/ble-startup.patch</w:t>
+        <w:t>app/.../ble/</w:t>
+      </w:r>
+      <w:r>
+        <w:rPr>
+          <w:rFonts w:ascii="Calibri" w:hAnsi="Calibri"/>
+          <w:sz w:val="20"/>
+        </w:rPr>
+        <w:t xml:space="preserve"> — BoardProtocol and BleSync: access, crypto, queues, MTU frames, ACK, retry, WANT, relay, and roster</w:t>
       </w:r>
     </w:p>
     <w:p>
       <w:pPr>
-        <w:pStyle w:val="ListBullet"/>
-        <w:widowControl/>
-        <w:spacing w:before="0" w:after="40" w:line="259" w:lineRule="auto"/>
-        <w:ind w:left="360" w:hanging="216"/>
+        <w:spacing w:after="80"/>
       </w:pPr>
       <w:r>
         <w:rPr>
-          <w:rFonts w:ascii="Calibri" w:hAnsi="Calibri" w:eastAsia="Calibri"/>
-          <w:b w:val="0"/>
-          <w:i w:val="0"/>
-          <w:color w:val="1F2937"/>
+          <w:rFonts w:ascii="Consolas" w:hAnsi="Consolas"/>
+          <w:b/>
+          <w:color w:val="1F4D78"/>
           <w:sz w:val="19"/>
         </w:rPr>
-        <w:t>Install and physical test steps: install/README.md</w:t>
+        <w:t>app/.../db/</w:t>
+      </w:r>
+      <w:r>
+        <w:rPr>
+          <w:rFonts w:ascii="Calibri" w:hAnsi="Calibri"/>
+          <w:sz w:val="20"/>
+        </w:rPr>
+        <w:t xml:space="preserve"> — persistent Room board operations and queries</w:t>
       </w:r>
     </w:p>
     <w:p>
       <w:pPr>
-        <w:pStyle w:val="ListBullet"/>
-        <w:widowControl/>
-        <w:spacing w:before="0" w:after="40" w:line="259" w:lineRule="auto"/>
-        <w:ind w:left="360" w:hanging="216"/>
+        <w:spacing w:after="80"/>
       </w:pPr>
       <w:r>
         <w:rPr>
-          <w:rFonts w:ascii="Calibri" w:hAnsi="Calibri" w:eastAsia="Calibri"/>
-          <w:b w:val="0"/>
-          <w:i w:val="0"/>
-          <w:color w:val="1F2937"/>
+          <w:rFonts w:ascii="Consolas" w:hAnsi="Consolas"/>
+          <w:b/>
+          <w:color w:val="1F4D78"/>
           <w:sz w:val="19"/>
         </w:rPr>
-        <w:t>Full technical notes: docs/TECHNICAL_OVERVIEW.md</w:t>
+        <w:t>tinyssb/whiteboard/adapter.js</w:t>
+      </w:r>
+      <w:r>
+        <w:rPr>
+          <w:rFonts w:ascii="Calibri" w:hAnsi="Calibri"/>
+          <w:sz w:val="20"/>
+        </w:rPr>
+        <w:t xml:space="preserve"> — WBD reducer, signed invitations, member selection, and tinySSB host adapter</w:t>
       </w:r>
     </w:p>
-    <w:tbl>
-      <w:tblPr>
-        <w:tblW w:type="dxa" w:w="9360"/>
-        <w:jc w:val="center"/>
-        <w:tblLook w:firstColumn="1" w:firstRow="1" w:lastColumn="0" w:lastRow="0" w:noHBand="0" w:noVBand="1" w:val="04A0"/>
-        <w:tblLayout w:type="fixed"/>
-        <w:tblBorders>
-          <w:top w:val="single" w:sz="6" w:color="9DC3E6"/>
-          <w:left w:val="single" w:sz="6" w:color="9DC3E6"/>
-          <w:bottom w:val="single" w:sz="6" w:color="9DC3E6"/>
-          <w:right w:val="single" w:sz="6" w:color="9DC3E6"/>
-          <w:insideH w:val="single" w:sz="6" w:color="9DC3E6"/>
-          <w:insideV w:val="single" w:sz="6" w:color="9DC3E6"/>
-        </w:tblBorders>
-      </w:tblPr>
-      <w:tblGrid>
-        <w:gridCol w:w="9360"/>
-      </w:tblGrid>
-      <w:tr>
-        <w:tc>
-          <w:tcPr>
-            <w:tcW w:type="dxa" w:w="5943600"/>
-            <w:shd w:fill="EAF2F8"/>
-            <w:vAlign w:val="center"/>
-          </w:tcPr>
-          <w:p>
-            <w:pPr>
-              <w:widowControl/>
-              <w:spacing w:before="40" w:after="40" w:line="259" w:lineRule="auto"/>
-            </w:pPr>
-            <w:r>
-              <w:rPr>
-                <w:rFonts w:ascii="Calibri" w:hAnsi="Calibri" w:eastAsia="Calibri"/>
-                <w:b/>
-                <w:i w:val="0"/>
-                <w:color w:val="2E74B5"/>
-                <w:sz w:val="19"/>
-              </w:rPr>
-              <w:t xml:space="preserve">Submission: </w:t>
-            </w:r>
-            <w:r>
-              <w:rPr>
-                <w:rFonts w:ascii="Calibri" w:hAnsi="Calibri" w:eastAsia="Calibri"/>
-                <w:b w:val="0"/>
-                <w:i w:val="0"/>
-                <w:color w:val="1F2937"/>
-                <w:sz w:val="19"/>
-              </w:rPr>
-              <w:t>Submit the full repository plus the Tremola APK. The mini-app folder alone does not contain native storage, identity or BLE transport.</w:t>
-            </w:r>
-          </w:p>
-        </w:tc>
-      </w:tr>
-    </w:tbl>
+    <w:p>
+      <w:pPr>
+        <w:spacing w:after="80"/>
+      </w:pPr>
+      <w:r>
+        <w:rPr>
+          <w:rFonts w:ascii="Consolas" w:hAnsi="Consolas"/>
+          <w:b/>
+          <w:color w:val="1F4D78"/>
+          <w:sz w:val="19"/>
+        </w:rPr>
+        <w:t>tinyssb/*.patch</w:t>
+      </w:r>
+      <w:r>
+        <w:rPr>
+          <w:rFonts w:ascii="Calibri" w:hAnsi="Calibri"/>
+          <w:sz w:val="20"/>
+        </w:rPr>
+        <w:t xml:space="preserve"> — reproducible official-host integration, BLE startup fix, and native export</w:t>
+      </w:r>
+    </w:p>
+    <w:p>
+      <w:pPr>
+        <w:spacing w:after="80"/>
+      </w:pPr>
+      <w:r>
+        <w:rPr>
+          <w:rFonts w:ascii="Consolas" w:hAnsi="Consolas"/>
+          <w:b/>
+          <w:color w:val="1F4D78"/>
+          <w:sz w:val="19"/>
+        </w:rPr>
+        <w:t>tests/ and app/src/test/</w:t>
+      </w:r>
+      <w:r>
+        <w:rPr>
+          <w:rFonts w:ascii="Calibri" w:hAnsi="Calibri"/>
+          <w:sz w:val="20"/>
+        </w:rPr>
+        <w:t xml:space="preserve"> — merge, UI, protocol, queue, crypto, and compatibility checks</w:t>
+      </w:r>
+    </w:p>
+    <w:p>
+      <w:pPr>
+        <w:spacing w:after="80"/>
+      </w:pPr>
+      <w:r>
+        <w:rPr>
+          <w:rFonts w:ascii="Consolas" w:hAnsi="Consolas"/>
+          <w:b/>
+          <w:color w:val="1F4D78"/>
+          <w:sz w:val="19"/>
+        </w:rPr>
+        <w:t>docs/ and install/README.md</w:t>
+      </w:r>
+      <w:r>
+        <w:rPr>
+          <w:rFonts w:ascii="Calibri" w:hAnsi="Calibri"/>
+          <w:sz w:val="20"/>
+        </w:rPr>
+        <w:t xml:space="preserve"> — verified design notes, report basis, installation, and physical-phone test steps</w:t>
+      </w:r>
+    </w:p>
+    <w:p>
+      <w:pPr>
+        <w:pStyle w:val="Heading2"/>
+      </w:pPr>
+      <w:r>
+        <w:t>Final Galaxy S9/S10 acceptance run</w:t>
+      </w:r>
+    </w:p>
+    <w:p>
+      <w:pPr>
+        <w:numPr>
+          <w:ilvl w:val="0"/>
+          <w:numId w:val="10"/>
+        </w:numPr>
+        <w:spacing w:after="80" w:line="300" w:lineRule="auto"/>
+      </w:pPr>
+      <w:r>
+        <w:rPr>
+          <w:rFonts w:ascii="Calibri" w:hAnsi="Calibri"/>
+        </w:rPr>
+        <w:t>Record APK hash, phone model, Android version, permissions, and test date.</w:t>
+      </w:r>
+    </w:p>
+    <w:p>
+      <w:pPr>
+        <w:numPr>
+          <w:ilvl w:val="0"/>
+          <w:numId w:val="10"/>
+        </w:numPr>
+        <w:spacing w:after="80" w:line="300" w:lineRule="auto"/>
+      </w:pPr>
+      <w:r>
+        <w:rPr>
+          <w:rFonts w:ascii="Calibri" w:hAnsi="Calibri"/>
+        </w:rPr>
+        <w:t>Turn off Wi-Fi and mobile data. Keep Bluetooth on; keep Location on where Android requires it.</w:t>
+      </w:r>
+    </w:p>
+    <w:p>
+      <w:pPr>
+        <w:numPr>
+          <w:ilvl w:val="0"/>
+          <w:numId w:val="10"/>
+        </w:numPr>
+        <w:spacing w:after="80" w:line="300" w:lineRule="auto"/>
+      </w:pPr>
+      <w:r>
+        <w:rPr>
+          <w:rFonts w:ascii="Calibri" w:hAnsi="Calibri"/>
+        </w:rPr>
+        <w:t>Test a long stroke, text, move, resize, recolor, delete, and Clear in both directions.</w:t>
+      </w:r>
+    </w:p>
+    <w:p>
+      <w:pPr>
+        <w:numPr>
+          <w:ilvl w:val="0"/>
+          <w:numId w:val="10"/>
+        </w:numPr>
+        <w:spacing w:after="80" w:line="300" w:lineRule="auto"/>
+      </w:pPr>
+      <w:r>
+        <w:rPr>
+          <w:rFonts w:ascii="Calibri" w:hAnsi="Calibri"/>
+        </w:rPr>
+        <w:t>Edit offline on both phones, reconnect, and confirm convergence after the frontier/WANT cycle.</w:t>
+      </w:r>
+    </w:p>
+    <w:p>
+      <w:pPr>
+        <w:numPr>
+          <w:ilvl w:val="0"/>
+          <w:numId w:val="10"/>
+        </w:numPr>
+        <w:spacing w:after="80" w:line="300" w:lineRule="auto"/>
+      </w:pPr>
+      <w:r>
+        <w:rPr>
+          <w:rFonts w:ascii="Calibri" w:hAnsi="Calibri"/>
+        </w:rPr>
+        <w:t>Close and reopen the app, reopen the saved board, and test late catch-up.</w:t>
+      </w:r>
+    </w:p>
+    <w:p>
+      <w:pPr>
+        <w:numPr>
+          <w:ilvl w:val="0"/>
+          <w:numId w:val="10"/>
+        </w:numPr>
+        <w:spacing w:after="80" w:line="300" w:lineRule="auto"/>
+      </w:pPr>
+      <w:r>
+        <w:rPr>
+          <w:rFonts w:ascii="Calibri" w:hAnsi="Calibri"/>
+        </w:rPr>
+        <w:t>Export JPEG and PDF; verify the entire finite canvas and dark/white background rule.</w:t>
+      </w:r>
+    </w:p>
+    <w:p>
+      <w:pPr>
+        <w:numPr>
+          <w:ilvl w:val="0"/>
+          <w:numId w:val="10"/>
+        </w:numPr>
+        <w:spacing w:after="80" w:line="300" w:lineRule="auto"/>
+      </w:pPr>
+      <w:r>
+        <w:rPr>
+          <w:rFonts w:ascii="Calibri" w:hAnsi="Calibri"/>
+        </w:rPr>
+        <w:t>Run the tinySSB invitation flow separately and record its longer delivery time or disconnects honestly.</w:t>
+      </w:r>
+    </w:p>
+    <w:p>
+      <w:pPr>
+        <w:numPr>
+          <w:ilvl w:val="0"/>
+          <w:numId w:val="10"/>
+        </w:numPr>
+        <w:spacing w:after="80" w:line="300" w:lineRule="auto"/>
+      </w:pPr>
+      <w:r>
+        <w:rPr>
+          <w:rFonts w:ascii="Calibri" w:hAnsi="Calibri"/>
+        </w:rPr>
+        <w:t>Four-member logic has automated coverage, but state clearly if only two physical phones were available.</w:t>
+      </w:r>
+    </w:p>
+    <w:p>
+      <w:pPr>
+        <w:pStyle w:val="Heading2"/>
+      </w:pPr>
+      <w:r>
+        <w:t>Useful primary sources</w:t>
+      </w:r>
+    </w:p>
+    <w:p>
+      <w:pPr>
+        <w:numPr>
+          <w:ilvl w:val="0"/>
+          <w:numId w:val="10"/>
+        </w:numPr>
+        <w:spacing w:after="80" w:line="300" w:lineRule="auto"/>
+      </w:pPr>
+      <w:r>
+        <w:rPr>
+          <w:rFonts w:ascii="Calibri" w:hAnsi="Calibri"/>
+        </w:rPr>
+        <w:t>Project repository: https://github.com/verifizieren/collaboration-board-ble</w:t>
+      </w:r>
+    </w:p>
+    <w:p>
+      <w:pPr>
+        <w:numPr>
+          <w:ilvl w:val="0"/>
+          <w:numId w:val="10"/>
+        </w:numPr>
+        <w:spacing w:after="80" w:line="300" w:lineRule="auto"/>
+      </w:pPr>
+      <w:r>
+        <w:rPr>
+          <w:rFonts w:ascii="Calibri" w:hAnsi="Calibri"/>
+        </w:rPr>
+        <w:t>Uni Basel Tremola: https://github.com/cn-uofbasel/tremola</w:t>
+      </w:r>
+    </w:p>
+    <w:p>
+      <w:pPr>
+        <w:numPr>
+          <w:ilvl w:val="0"/>
+          <w:numId w:val="10"/>
+        </w:numPr>
+        <w:spacing w:after="80" w:line="300" w:lineRule="auto"/>
+      </w:pPr>
+      <w:r>
+        <w:rPr>
+          <w:rFonts w:ascii="Calibri" w:hAnsi="Calibri"/>
+        </w:rPr>
+        <w:t>Official ssbc tinySSB: https://github.com/ssbc/tinyssb</w:t>
+      </w:r>
+    </w:p>
+    <w:p>
+      <w:pPr>
+        <w:numPr>
+          <w:ilvl w:val="0"/>
+          <w:numId w:val="10"/>
+        </w:numPr>
+        <w:spacing w:after="80" w:line="300" w:lineRule="auto"/>
+      </w:pPr>
+      <w:r>
+        <w:rPr>
+          <w:rFonts w:ascii="Calibri" w:hAnsi="Calibri"/>
+        </w:rPr>
+        <w:t>Android BLE permissions: https://developer.android.com/develop/connectivity/bluetooth/bt-permissions</w:t>
+      </w:r>
+    </w:p>
+    <w:p>
+      <w:pPr>
+        <w:numPr>
+          <w:ilvl w:val="0"/>
+          <w:numId w:val="10"/>
+        </w:numPr>
+        <w:spacing w:after="80" w:line="300" w:lineRule="auto"/>
+      </w:pPr>
+      <w:r>
+        <w:rPr>
+          <w:rFonts w:ascii="Calibri" w:hAnsi="Calibri"/>
+        </w:rPr>
+        <w:t>Android BluetoothGatt: https://developer.android.com/reference/android/bluetooth/BluetoothGatt</w:t>
+      </w:r>
+    </w:p>
+    <w:p>
+      <w:pPr>
+        <w:pStyle w:val="Heading2"/>
+      </w:pPr>
+      <w:r>
+        <w:t>Final writing rule</w:t>
+      </w:r>
+    </w:p>
+    <w:p>
+      <w:pPr>
+        <w:spacing w:before="80" w:after="200"/>
+        <w:ind w:left="200" w:right="160"/>
+        <w:shd w:fill="EAF1FB"/>
+        <w:pBdr>
+          <w:left w:val="single" w:sz="20" w:space="8" w:color="2E74B5"/>
+        </w:pBdr>
+      </w:pPr>
+      <w:r>
+        <w:rPr>
+          <w:rFonts w:ascii="Calibri" w:hAnsi="Calibri"/>
+          <w:b/>
+          <w:color w:val="1F4D78"/>
+        </w:rPr>
+        <w:t xml:space="preserve">Be precise. </w:t>
+      </w:r>
+      <w:r>
+        <w:rPr>
+          <w:rFonts w:ascii="Calibri" w:hAnsi="Calibri"/>
+        </w:rPr>
+        <w:t>The current code and automated checks support the architecture description. The final report should only say that end-to-end BLE behavior works after the exact 1.0 APKs pass the documented real-phone test. Keep limitations visible; that makes the report stronger, not weaker.</w:t>
+      </w:r>
+    </w:p>
     <w:sectPr>
       <w:headerReference w:type="default" r:id="rId9"/>
       <w:footerReference w:type="default" r:id="rId10"/>
-      <w:pgSz w:w="12240" w:h="15840"/>
-      <w:pgMar w:top="1037" w:right="1440" w:bottom="893" w:left="1440" w:header="432" w:footer="432" w:gutter="0"/>
+      <w:pgSz w:w="11906" w:h="16838"/>
+      <w:pgMar w:top="1440" w:right="1440" w:bottom="1440" w:left="1440" w:header="576" w:footer="648" w:gutter="0"/>
       <w:cols w:space="720"/>
       <w:docGrid w:linePitch="360"/>
     </w:sectPr>
@@ -1838,15 +2439,22 @@
     </w:pPr>
     <w:r>
       <w:rPr>
-        <w:rFonts w:ascii="Calibri" w:hAnsi="Calibri" w:eastAsia="Calibri"/>
-        <w:b w:val="0"/>
-        <w:i w:val="0"/>
-        <w:color w:val="5B6573"/>
-        <w:sz w:val="15"/>
-      </w:rPr>
-      <w:t xml:space="preserve">University of Basel project  |  </w:t>
+        <w:rFonts w:ascii="Calibri" w:hAnsi="Calibri"/>
+        <w:color w:val="687078"/>
+        <w:sz w:val="17"/>
+      </w:rPr>
+      <w:t xml:space="preserve">Page </w:t>
     </w:r>
     <w:fldSimple w:instr="PAGE"/>
+    <w:r>
+      <w:rPr>
+        <w:rFonts w:ascii="Calibri" w:hAnsi="Calibri"/>
+        <w:color w:val="687078"/>
+        <w:sz w:val="17"/>
+      </w:rPr>
+      <w:t xml:space="preserve"> of </w:t>
+    </w:r>
+    <w:fldSimple w:instr="NUMPAGES"/>
   </w:p>
 </w:ftr>
 </file>
@@ -1856,17 +2464,31 @@
   <w:p>
     <w:pPr>
       <w:pStyle w:val="Header"/>
-      <w:jc w:val="right"/>
+      <w:tabs>
+        <w:tab w:pos="9000" w:val="right"/>
+      </w:tabs>
+      <w:spacing w:after="60"/>
+      <w:pBdr>
+        <w:bottom w:val="single" w:sz="4" w:space="4" w:color="B8C2CC"/>
+      </w:pBdr>
     </w:pPr>
     <w:r>
       <w:rPr>
-        <w:rFonts w:ascii="Calibri" w:hAnsi="Calibri" w:eastAsia="Calibri"/>
-        <w:b/>
-        <w:i w:val="0"/>
-        <w:color w:val="5B6573"/>
-        <w:sz w:val="15"/>
-      </w:rPr>
-      <w:t>COLLABORATION BOARD  |  REPORT GUIDE</w:t>
+        <w:rFonts w:ascii="Calibri" w:hAnsi="Calibri"/>
+        <w:b/>
+        <w:color w:val="687078"/>
+        <w:sz w:val="17"/>
+      </w:rPr>
+      <w:t>Collaboration Board 1.0</w:t>
+    </w:r>
+    <w:r>
+      <w:rPr>
+        <w:rFonts w:ascii="Calibri" w:hAnsi="Calibri"/>
+        <w:color w:val="687078"/>
+        <w:sz w:val="17"/>
+      </w:rPr>
+      <w:tab/>
+      <w:t>Report Update Guide</w:t>
     </w:r>
   </w:p>
 </w:hdr>
@@ -2071,6 +2693,114 @@
   </w:num>
   <w:num w:numId="9">
     <w:abstractNumId w:val="0"/>
+  </w:num>
+  <w:abstractNum w:abstractNumId="9">
+    <w:multiLevelType w:val="singleLevel"/>
+    <w:lvl w:ilvl="0">
+      <w:start w:val="1"/>
+      <w:numFmt w:val="bullet"/>
+      <w:lvlText w:val="•"/>
+      <w:lvlJc w:val="left"/>
+      <w:pPr>
+        <w:tabs>
+          <w:tab w:val="num" w:pos="540"/>
+        </w:tabs>
+        <w:ind w:left="540" w:hanging="271"/>
+      </w:pPr>
+    </w:lvl>
+  </w:abstractNum>
+  <w:num w:numId="10">
+    <w:abstractNumId w:val="9"/>
+  </w:num>
+  <w:abstractNum w:abstractNumId="10">
+    <w:multiLevelType w:val="singleLevel"/>
+    <w:lvl w:ilvl="0">
+      <w:start w:val="1"/>
+      <w:numFmt w:val="decimal"/>
+      <w:lvlText w:val="%1."/>
+      <w:lvlJc w:val="left"/>
+      <w:pPr>
+        <w:tabs>
+          <w:tab w:val="num" w:pos="540"/>
+        </w:tabs>
+        <w:ind w:left="540" w:hanging="271"/>
+      </w:pPr>
+    </w:lvl>
+  </w:abstractNum>
+  <w:num w:numId="11">
+    <w:abstractNumId w:val="10"/>
+  </w:num>
+  <w:abstractNum w:abstractNumId="11">
+    <w:multiLevelType w:val="singleLevel"/>
+    <w:lvl w:ilvl="0">
+      <w:start w:val="1"/>
+      <w:numFmt w:val="decimal"/>
+      <w:lvlText w:val="%1."/>
+      <w:lvlJc w:val="left"/>
+      <w:pPr>
+        <w:tabs>
+          <w:tab w:val="num" w:pos="540"/>
+        </w:tabs>
+        <w:ind w:left="540" w:hanging="271"/>
+      </w:pPr>
+    </w:lvl>
+  </w:abstractNum>
+  <w:num w:numId="12">
+    <w:abstractNumId w:val="11"/>
+  </w:num>
+  <w:abstractNum w:abstractNumId="12">
+    <w:multiLevelType w:val="singleLevel"/>
+    <w:lvl w:ilvl="0">
+      <w:start w:val="1"/>
+      <w:numFmt w:val="decimal"/>
+      <w:lvlText w:val="%1."/>
+      <w:lvlJc w:val="left"/>
+      <w:pPr>
+        <w:tabs>
+          <w:tab w:val="num" w:pos="540"/>
+        </w:tabs>
+        <w:ind w:left="540" w:hanging="271"/>
+      </w:pPr>
+    </w:lvl>
+  </w:abstractNum>
+  <w:num w:numId="13">
+    <w:abstractNumId w:val="12"/>
+  </w:num>
+  <w:abstractNum w:abstractNumId="13">
+    <w:multiLevelType w:val="singleLevel"/>
+    <w:lvl w:ilvl="0">
+      <w:start w:val="1"/>
+      <w:numFmt w:val="decimal"/>
+      <w:lvlText w:val="%1."/>
+      <w:lvlJc w:val="left"/>
+      <w:pPr>
+        <w:tabs>
+          <w:tab w:val="num" w:pos="540"/>
+        </w:tabs>
+        <w:ind w:left="540" w:hanging="271"/>
+      </w:pPr>
+    </w:lvl>
+  </w:abstractNum>
+  <w:num w:numId="14">
+    <w:abstractNumId w:val="13"/>
+  </w:num>
+  <w:abstractNum w:abstractNumId="14">
+    <w:multiLevelType w:val="singleLevel"/>
+    <w:lvl w:ilvl="0">
+      <w:start w:val="1"/>
+      <w:numFmt w:val="decimal"/>
+      <w:lvlText w:val="%1."/>
+      <w:lvlJc w:val="left"/>
+      <w:pPr>
+        <w:tabs>
+          <w:tab w:val="num" w:pos="540"/>
+        </w:tabs>
+        <w:ind w:left="540" w:hanging="271"/>
+      </w:pPr>
+    </w:lvl>
+  </w:abstractNum>
+  <w:num w:numId="15">
+    <w:abstractNumId w:val="14"/>
   </w:num>
 </w:numbering>
 </file>
@@ -2236,12 +2966,12 @@
     <w:qFormat/>
     <w:rsid w:val="00FC693F"/>
     <w:pPr>
-      <w:spacing w:after="60" w:line="269" w:lineRule="auto"/>
+      <w:spacing w:before="0" w:after="120" w:line="300" w:lineRule="auto"/>
     </w:pPr>
     <w:rPr>
-      <w:rFonts w:ascii="Calibri" w:hAnsi="Calibri" w:eastAsia="Calibri"/>
-      <w:color w:val="1F2937"/>
-      <w:sz w:val="20"/>
+      <w:rFonts w:ascii="Calibri" w:hAnsi="Calibri"/>
+      <w:color w:val="1C1D1F"/>
+      <w:sz w:val="22"/>
     </w:rPr>
   </w:style>
   <w:style w:type="paragraph" w:styleId="Header">
@@ -2299,15 +3029,15 @@
     <w:pPr>
       <w:keepNext/>
       <w:keepLines/>
-      <w:spacing w:before="480" w:after="0"/>
+      <w:spacing w:before="360" w:after="200"/>
       <w:outlineLvl w:val="0"/>
     </w:pPr>
     <w:rPr>
-      <w:rFonts w:asciiTheme="majorHAnsi" w:eastAsiaTheme="majorEastAsia" w:hAnsiTheme="majorHAnsi" w:cstheme="majorBidi"/>
+      <w:rFonts w:asciiTheme="majorHAnsi" w:eastAsiaTheme="majorEastAsia" w:hAnsiTheme="majorHAnsi" w:cstheme="majorBidi" w:ascii="Calibri" w:hAnsi="Calibri"/>
       <w:b/>
       <w:bCs/>
-      <w:color w:val="365F91" w:themeColor="accent1" w:themeShade="BF"/>
-      <w:sz w:val="28"/>
+      <w:color w:val="2E74B5"/>
+      <w:sz w:val="32"/>
       <w:szCs w:val="28"/>
     </w:rPr>
   </w:style>
@@ -2323,14 +3053,14 @@
     <w:pPr>
       <w:keepNext/>
       <w:keepLines/>
-      <w:spacing w:before="200" w:after="0"/>
+      <w:spacing w:before="280" w:after="140"/>
       <w:outlineLvl w:val="1"/>
     </w:pPr>
     <w:rPr>
-      <w:rFonts w:asciiTheme="majorHAnsi" w:eastAsiaTheme="majorEastAsia" w:hAnsiTheme="majorHAnsi" w:cstheme="majorBidi"/>
+      <w:rFonts w:asciiTheme="majorHAnsi" w:eastAsiaTheme="majorEastAsia" w:hAnsiTheme="majorHAnsi" w:cstheme="majorBidi" w:ascii="Calibri" w:hAnsi="Calibri"/>
       <w:b/>
       <w:bCs/>
-      <w:color w:val="4F81BD" w:themeColor="accent1"/>
+      <w:color w:val="2E74B5"/>
       <w:sz w:val="26"/>
       <w:szCs w:val="26"/>
     </w:rPr>
@@ -2347,14 +3077,15 @@
     <w:pPr>
       <w:keepNext/>
       <w:keepLines/>
-      <w:spacing w:before="200" w:after="0"/>
+      <w:spacing w:before="200" w:after="100"/>
       <w:outlineLvl w:val="2"/>
     </w:pPr>
     <w:rPr>
-      <w:rFonts w:asciiTheme="majorHAnsi" w:eastAsiaTheme="majorEastAsia" w:hAnsiTheme="majorHAnsi" w:cstheme="majorBidi"/>
+      <w:rFonts w:asciiTheme="majorHAnsi" w:eastAsiaTheme="majorEastAsia" w:hAnsiTheme="majorHAnsi" w:cstheme="majorBidi" w:ascii="Calibri" w:hAnsi="Calibri"/>
       <w:b/>
       <w:bCs/>
-      <w:color w:val="4F81BD" w:themeColor="accent1"/>
+      <w:color w:val="1F4D78"/>
+      <w:sz w:val="24"/>
     </w:rPr>
   </w:style>
   <w:style w:type="paragraph" w:styleId="Heading4">
@@ -2772,11 +3503,6 @@
       </w:numPr>
       <w:contextualSpacing/>
     </w:pPr>
-    <w:rPr>
-      <w:rFonts w:ascii="Calibri" w:hAnsi="Calibri" w:eastAsia="Calibri"/>
-      <w:color w:val="1F2937"/>
-      <w:sz w:val="19"/>
-    </w:rPr>
   </w:style>
   <w:style w:type="paragraph" w:styleId="ListBullet2">
     <w:name w:val="List Bullet 2"/>
@@ -2790,11 +3516,6 @@
       </w:numPr>
       <w:contextualSpacing/>
     </w:pPr>
-    <w:rPr>
-      <w:rFonts w:ascii="Calibri" w:hAnsi="Calibri" w:eastAsia="Calibri"/>
-      <w:color w:val="1F2937"/>
-      <w:sz w:val="19"/>
-    </w:rPr>
   </w:style>
   <w:style w:type="paragraph" w:styleId="ListBullet3">
     <w:name w:val="List Bullet 3"/>
@@ -2821,11 +3542,6 @@
       </w:numPr>
       <w:contextualSpacing/>
     </w:pPr>
-    <w:rPr>
-      <w:rFonts w:ascii="Calibri" w:hAnsi="Calibri" w:eastAsia="Calibri"/>
-      <w:color w:val="1F2937"/>
-      <w:sz w:val="19"/>
-    </w:rPr>
   </w:style>
   <w:style w:type="paragraph" w:styleId="ListNumber2">
     <w:name w:val="List Number 2"/>

</xml_diff>

<commit_message>
Simplify releases and document both sync variants
</commit_message>
<xml_diff>
--- a/docs/Collaboration_Board_Report_Guide.docx
+++ b/docs/Collaboration_Board_Report_Guide.docx
@@ -185,6 +185,17 @@
           <w:sz w:val="22"/>
         </w:rPr>
         <w:t>Use Sections 7 and 8 to write Methodology, Results, and Discussion.</w:t>
+      </w:r>
+    </w:p>
+    <w:p>
+      <w:pPr>
+        <w:numPr>
+          <w:ilvl w:val="0"/>
+          <w:numId w:val="10"/>
+        </w:numPr>
+      </w:pPr>
+      <w:r>
+        <w:t>Use Sections 11-14 for the detailed stroke, event, BLE, tinySSB, merge, and repository walkthrough.</w:t>
       </w:r>
     </w:p>
     <w:p>
@@ -11469,6 +11480,54 @@
           <w:t>tinyssb/whiteboard-export.patch</w:t>
         </w:r>
       </w:hyperlink>
+      <w:r>
+        <w:t xml:space="preserve">  |  </w:t>
+      </w:r>
+      <w:hyperlink r:id="rId45" w:history="1">
+        <w:r>
+          <w:rPr>
+            <w:color w:val="0563C1"/>
+            <w:u w:val="single"/>
+          </w:rPr>
+          <w:t>Tremola guide</w:t>
+        </w:r>
+      </w:hyperlink>
+      <w:r>
+        <w:t xml:space="preserve">  |  </w:t>
+      </w:r>
+      <w:hyperlink r:id="rId46" w:history="1">
+        <w:r>
+          <w:rPr>
+            <w:color w:val="0563C1"/>
+            <w:u w:val="single"/>
+          </w:rPr>
+          <w:t>tinySSB guide</w:t>
+        </w:r>
+      </w:hyperlink>
+      <w:r>
+        <w:t xml:space="preserve">  |  </w:t>
+      </w:r>
+      <w:hyperlink r:id="rId47" w:history="1">
+        <w:r>
+          <w:rPr>
+            <w:color w:val="0563C1"/>
+            <w:u w:val="single"/>
+          </w:rPr>
+          <w:t>Sync and merge guide</w:t>
+        </w:r>
+      </w:hyperlink>
+      <w:r>
+        <w:t xml:space="preserve">  |  </w:t>
+      </w:r>
+      <w:hyperlink r:id="rId48" w:history="1">
+        <w:r>
+          <w:rPr>
+            <w:color w:val="0563C1"/>
+            <w:u w:val="single"/>
+          </w:rPr>
+          <w:t>Repository structure</w:t>
+        </w:r>
+      </w:hyperlink>
     </w:p>
     <w:p>
       <w:pPr>
@@ -11837,6 +11896,3486 @@
         </w:tc>
       </w:tr>
     </w:tbl>
+    <w:p>
+      <w:pPr>
+        <w:pStyle w:val="Heading1"/>
+      </w:pPr>
+      <w:r>
+        <w:t>11. From Finger Movement to One Shared Event</w:t>
+      </w:r>
+    </w:p>
+    <w:p>
+      <w:r>
+        <w:t>This section gives the report team exact words for the units used by the system. The app does not transmit a screen recording or the complete canvas after every change.</w:t>
+      </w:r>
+    </w:p>
+    <w:p>
+      <w:pPr>
+        <w:pStyle w:val="Heading2"/>
+      </w:pPr>
+      <w:r>
+        <w:t>Plain-English glossary</w:t>
+      </w:r>
+    </w:p>
+    <w:tbl>
+      <w:tblPr>
+        <w:tblW w:type="dxa" w:w="9360"/>
+        <w:tblLayout w:type="fixed"/>
+        <w:tblLook w:firstColumn="1" w:firstRow="1" w:lastColumn="0" w:lastRow="0" w:noHBand="0" w:noVBand="1" w:val="04A0"/>
+        <w:tblInd w:w="120" w:type="dxa"/>
+        <w:tblCellMar>
+          <w:top w:w="80" w:type="dxa"/>
+          <w:start w:w="120" w:type="dxa"/>
+          <w:bottom w:w="80" w:type="dxa"/>
+          <w:end w:w="120" w:type="dxa"/>
+        </w:tblCellMar>
+        <w:tblBorders>
+          <w:top w:val="single" w:sz="4" w:space="0" w:color="D5DDE5"/>
+          <w:left w:val="single" w:sz="4" w:space="0" w:color="D5DDE5"/>
+          <w:bottom w:val="single" w:sz="4" w:space="0" w:color="D5DDE5"/>
+          <w:right w:val="single" w:sz="4" w:space="0" w:color="D5DDE5"/>
+          <w:insideH w:val="single" w:sz="4" w:space="0" w:color="D5DDE5"/>
+          <w:insideV w:val="single" w:sz="4" w:space="0" w:color="D5DDE5"/>
+        </w:tblBorders>
+      </w:tblPr>
+      <w:tblGrid>
+        <w:gridCol w:w="1500"/>
+        <w:gridCol w:w="4080"/>
+        <w:gridCol w:w="3780"/>
+      </w:tblGrid>
+      <w:tr>
+        <w:trPr>
+          <w:tblHeader w:val="true"/>
+        </w:trPr>
+        <w:tc>
+          <w:tcPr>
+            <w:tcW w:type="dxa" w:w="1500"/>
+            <w:vAlign w:val="center"/>
+            <w:shd w:fill="E8EEF5"/>
+          </w:tcPr>
+          <w:p>
+            <w:pPr>
+              <w:spacing w:before="0" w:after="0" w:line="269" w:lineRule="auto"/>
+            </w:pPr>
+            <w:r>
+              <w:rPr>
+                <w:rFonts w:ascii="Calibri" w:hAnsi="Calibri"/>
+                <w:b/>
+                <w:color w:val="1F4D78"/>
+                <w:sz w:val="17"/>
+              </w:rPr>
+              <w:t>Term</w:t>
+            </w:r>
+          </w:p>
+        </w:tc>
+        <w:tc>
+          <w:tcPr>
+            <w:tcW w:type="dxa" w:w="4080"/>
+            <w:vAlign w:val="center"/>
+            <w:shd w:fill="E8EEF5"/>
+          </w:tcPr>
+          <w:p>
+            <w:pPr>
+              <w:spacing w:before="0" w:after="0" w:line="269" w:lineRule="auto"/>
+            </w:pPr>
+            <w:r>
+              <w:rPr>
+                <w:rFonts w:ascii="Calibri" w:hAnsi="Calibri"/>
+                <w:b/>
+                <w:color w:val="1F4D78"/>
+                <w:sz w:val="17"/>
+              </w:rPr>
+              <w:t>What it means</w:t>
+            </w:r>
+          </w:p>
+        </w:tc>
+        <w:tc>
+          <w:tcPr>
+            <w:tcW w:type="dxa" w:w="3780"/>
+            <w:vAlign w:val="center"/>
+            <w:shd w:fill="E8EEF5"/>
+          </w:tcPr>
+          <w:p>
+            <w:pPr>
+              <w:spacing w:before="0" w:after="0" w:line="269" w:lineRule="auto"/>
+            </w:pPr>
+            <w:r>
+              <w:rPr>
+                <w:rFonts w:ascii="Calibri" w:hAnsi="Calibri"/>
+                <w:b/>
+                <w:color w:val="1F4D78"/>
+                <w:sz w:val="17"/>
+              </w:rPr>
+              <w:t>Why it matters</w:t>
+            </w:r>
+          </w:p>
+        </w:tc>
+      </w:tr>
+      <w:tr>
+        <w:tc>
+          <w:tcPr>
+            <w:tcW w:type="dxa" w:w="1500"/>
+            <w:vAlign w:val="center"/>
+          </w:tcPr>
+          <w:p>
+            <w:pPr>
+              <w:spacing w:before="0" w:after="0" w:line="269" w:lineRule="auto"/>
+            </w:pPr>
+            <w:r>
+              <w:rPr>
+                <w:rFonts w:ascii="Calibri" w:hAnsi="Calibri"/>
+                <w:b w:val="0"/>
+                <w:color w:val="17242E"/>
+                <w:sz w:val="17"/>
+              </w:rPr>
+              <w:t>Object</w:t>
+            </w:r>
+          </w:p>
+        </w:tc>
+        <w:tc>
+          <w:tcPr>
+            <w:tcW w:type="dxa" w:w="4080"/>
+            <w:vAlign w:val="center"/>
+          </w:tcPr>
+          <w:p>
+            <w:pPr>
+              <w:spacing w:before="0" w:after="0" w:line="269" w:lineRule="auto"/>
+            </w:pPr>
+            <w:r>
+              <w:rPr>
+                <w:rFonts w:ascii="Calibri" w:hAnsi="Calibri"/>
+                <w:b w:val="0"/>
+                <w:color w:val="17242E"/>
+                <w:sz w:val="17"/>
+              </w:rPr>
+              <w:t>A visible stroke or text label on the canvas.</w:t>
+            </w:r>
+          </w:p>
+        </w:tc>
+        <w:tc>
+          <w:tcPr>
+            <w:tcW w:type="dxa" w:w="3780"/>
+            <w:vAlign w:val="center"/>
+          </w:tcPr>
+          <w:p>
+            <w:pPr>
+              <w:spacing w:before="0" w:after="0" w:line="269" w:lineRule="auto"/>
+            </w:pPr>
+            <w:r>
+              <w:rPr>
+                <w:rFonts w:ascii="Calibri" w:hAnsi="Calibri"/>
+                <w:b w:val="0"/>
+                <w:color w:val="17242E"/>
+                <w:sz w:val="17"/>
+              </w:rPr>
+              <w:t>Objects have stable IDs that later edits can target.</w:t>
+            </w:r>
+          </w:p>
+        </w:tc>
+      </w:tr>
+      <w:tr>
+        <w:tc>
+          <w:tcPr>
+            <w:tcW w:type="dxa" w:w="1500"/>
+            <w:vAlign w:val="center"/>
+          </w:tcPr>
+          <w:p>
+            <w:pPr>
+              <w:spacing w:before="0" w:after="0" w:line="269" w:lineRule="auto"/>
+            </w:pPr>
+            <w:r>
+              <w:rPr>
+                <w:rFonts w:ascii="Calibri" w:hAnsi="Calibri"/>
+                <w:b w:val="0"/>
+                <w:color w:val="17242E"/>
+                <w:sz w:val="17"/>
+              </w:rPr>
+              <w:t>Event</w:t>
+            </w:r>
+          </w:p>
+        </w:tc>
+        <w:tc>
+          <w:tcPr>
+            <w:tcW w:type="dxa" w:w="4080"/>
+            <w:vAlign w:val="center"/>
+          </w:tcPr>
+          <w:p>
+            <w:pPr>
+              <w:spacing w:before="0" w:after="0" w:line="269" w:lineRule="auto"/>
+            </w:pPr>
+            <w:r>
+              <w:rPr>
+                <w:rFonts w:ascii="Calibri" w:hAnsi="Calibri"/>
+                <w:b w:val="0"/>
+                <w:color w:val="17242E"/>
+                <w:sz w:val="17"/>
+              </w:rPr>
+              <w:t>One immutable completed action such as create, move, recolor, delete, or clear.</w:t>
+            </w:r>
+          </w:p>
+        </w:tc>
+        <w:tc>
+          <w:tcPr>
+            <w:tcW w:type="dxa" w:w="3780"/>
+            <w:vAlign w:val="center"/>
+          </w:tcPr>
+          <w:p>
+            <w:pPr>
+              <w:spacing w:before="0" w:after="0" w:line="269" w:lineRule="auto"/>
+            </w:pPr>
+            <w:r>
+              <w:rPr>
+                <w:rFonts w:ascii="Calibri" w:hAnsi="Calibri"/>
+                <w:b w:val="0"/>
+                <w:color w:val="17242E"/>
+                <w:sz w:val="17"/>
+              </w:rPr>
+              <w:t>Old events are not overwritten; the current board is calculated from all valid events.</w:t>
+            </w:r>
+          </w:p>
+        </w:tc>
+      </w:tr>
+      <w:tr>
+        <w:tc>
+          <w:tcPr>
+            <w:tcW w:type="dxa" w:w="1500"/>
+            <w:vAlign w:val="center"/>
+          </w:tcPr>
+          <w:p>
+            <w:pPr>
+              <w:spacing w:before="0" w:after="0" w:line="269" w:lineRule="auto"/>
+            </w:pPr>
+            <w:r>
+              <w:rPr>
+                <w:rFonts w:ascii="Calibri" w:hAnsi="Calibri"/>
+                <w:b w:val="0"/>
+                <w:color w:val="17242E"/>
+                <w:sz w:val="17"/>
+              </w:rPr>
+              <w:t>Operation</w:t>
+            </w:r>
+          </w:p>
+        </w:tc>
+        <w:tc>
+          <w:tcPr>
+            <w:tcW w:type="dxa" w:w="4080"/>
+            <w:vAlign w:val="center"/>
+          </w:tcPr>
+          <w:p>
+            <w:pPr>
+              <w:spacing w:before="0" w:after="0" w:line="269" w:lineRule="auto"/>
+            </w:pPr>
+            <w:r>
+              <w:rPr>
+                <w:rFonts w:ascii="Calibri" w:hAnsi="Calibri"/>
+                <w:b w:val="0"/>
+                <w:color w:val="17242E"/>
+                <w:sz w:val="17"/>
+              </w:rPr>
+              <w:t>A Tremola event wrapped with room, author sequence, protection, and signature.</w:t>
+            </w:r>
+          </w:p>
+        </w:tc>
+        <w:tc>
+          <w:tcPr>
+            <w:tcW w:type="dxa" w:w="3780"/>
+            <w:vAlign w:val="center"/>
+          </w:tcPr>
+          <w:p>
+            <w:pPr>
+              <w:spacing w:before="0" w:after="0" w:line="269" w:lineRule="auto"/>
+            </w:pPr>
+            <w:r>
+              <w:rPr>
+                <w:rFonts w:ascii="Calibri" w:hAnsi="Calibri"/>
+                <w:b w:val="0"/>
+                <w:color w:val="17242E"/>
+                <w:sz w:val="17"/>
+              </w:rPr>
+              <w:t>This is the durable unit stored and acknowledged by Android.</w:t>
+            </w:r>
+          </w:p>
+        </w:tc>
+      </w:tr>
+      <w:tr>
+        <w:tc>
+          <w:tcPr>
+            <w:tcW w:type="dxa" w:w="1500"/>
+            <w:vAlign w:val="center"/>
+          </w:tcPr>
+          <w:p>
+            <w:pPr>
+              <w:spacing w:before="0" w:after="0" w:line="269" w:lineRule="auto"/>
+            </w:pPr>
+            <w:r>
+              <w:rPr>
+                <w:rFonts w:ascii="Calibri" w:hAnsi="Calibri"/>
+                <w:b w:val="0"/>
+                <w:color w:val="17242E"/>
+                <w:sz w:val="17"/>
+              </w:rPr>
+              <w:t>BLE frame</w:t>
+            </w:r>
+          </w:p>
+        </w:tc>
+        <w:tc>
+          <w:tcPr>
+            <w:tcW w:type="dxa" w:w="4080"/>
+            <w:vAlign w:val="center"/>
+          </w:tcPr>
+          <w:p>
+            <w:pPr>
+              <w:spacing w:before="0" w:after="0" w:line="269" w:lineRule="auto"/>
+            </w:pPr>
+            <w:r>
+              <w:rPr>
+                <w:rFonts w:ascii="Calibri" w:hAnsi="Calibri"/>
+                <w:b w:val="0"/>
+                <w:color w:val="17242E"/>
+                <w:sz w:val="17"/>
+              </w:rPr>
+              <w:t>One MTU-sized part of a larger protocol message.</w:t>
+            </w:r>
+          </w:p>
+        </w:tc>
+        <w:tc>
+          <w:tcPr>
+            <w:tcW w:type="dxa" w:w="3780"/>
+            <w:vAlign w:val="center"/>
+          </w:tcPr>
+          <w:p>
+            <w:pPr>
+              <w:spacing w:before="0" w:after="0" w:line="269" w:lineRule="auto"/>
+            </w:pPr>
+            <w:r>
+              <w:rPr>
+                <w:rFonts w:ascii="Calibri" w:hAnsi="Calibri"/>
+                <w:b w:val="0"/>
+                <w:color w:val="17242E"/>
+                <w:sz w:val="17"/>
+              </w:rPr>
+              <w:t>A long operation may need many frames before it can be decoded.</w:t>
+            </w:r>
+          </w:p>
+        </w:tc>
+      </w:tr>
+      <w:tr>
+        <w:tc>
+          <w:tcPr>
+            <w:tcW w:type="dxa" w:w="1500"/>
+            <w:vAlign w:val="center"/>
+          </w:tcPr>
+          <w:p>
+            <w:pPr>
+              <w:spacing w:before="0" w:after="0" w:line="269" w:lineRule="auto"/>
+            </w:pPr>
+            <w:r>
+              <w:rPr>
+                <w:rFonts w:ascii="Calibri" w:hAnsi="Calibri"/>
+                <w:b w:val="0"/>
+                <w:color w:val="17242E"/>
+                <w:sz w:val="17"/>
+              </w:rPr>
+              <w:t>Frontier</w:t>
+            </w:r>
+          </w:p>
+        </w:tc>
+        <w:tc>
+          <w:tcPr>
+            <w:tcW w:type="dxa" w:w="4080"/>
+            <w:vAlign w:val="center"/>
+          </w:tcPr>
+          <w:p>
+            <w:pPr>
+              <w:spacing w:before="0" w:after="0" w:line="269" w:lineRule="auto"/>
+            </w:pPr>
+            <w:r>
+              <w:rPr>
+                <w:rFonts w:ascii="Calibri" w:hAnsi="Calibri"/>
+                <w:b w:val="0"/>
+                <w:color w:val="17242E"/>
+                <w:sz w:val="17"/>
+              </w:rPr>
+              <w:t>Highest uninterrupted sequence stored for each author.</w:t>
+            </w:r>
+          </w:p>
+        </w:tc>
+        <w:tc>
+          <w:tcPr>
+            <w:tcW w:type="dxa" w:w="3780"/>
+            <w:vAlign w:val="center"/>
+          </w:tcPr>
+          <w:p>
+            <w:pPr>
+              <w:spacing w:before="0" w:after="0" w:line="269" w:lineRule="auto"/>
+            </w:pPr>
+            <w:r>
+              <w:rPr>
+                <w:rFonts w:ascii="Calibri" w:hAnsi="Calibri"/>
+                <w:b w:val="0"/>
+                <w:color w:val="17242E"/>
+                <w:sz w:val="17"/>
+              </w:rPr>
+              <w:t>It reveals gaps even when a later operation already arrived.</w:t>
+            </w:r>
+          </w:p>
+        </w:tc>
+      </w:tr>
+      <w:tr>
+        <w:tc>
+          <w:tcPr>
+            <w:tcW w:type="dxa" w:w="1500"/>
+            <w:vAlign w:val="center"/>
+          </w:tcPr>
+          <w:p>
+            <w:pPr>
+              <w:spacing w:before="0" w:after="0" w:line="269" w:lineRule="auto"/>
+            </w:pPr>
+            <w:r>
+              <w:rPr>
+                <w:rFonts w:ascii="Calibri" w:hAnsi="Calibri"/>
+                <w:b w:val="0"/>
+                <w:color w:val="17242E"/>
+                <w:sz w:val="17"/>
+              </w:rPr>
+              <w:t>WANT range</w:t>
+            </w:r>
+          </w:p>
+        </w:tc>
+        <w:tc>
+          <w:tcPr>
+            <w:tcW w:type="dxa" w:w="4080"/>
+            <w:vAlign w:val="center"/>
+          </w:tcPr>
+          <w:p>
+            <w:pPr>
+              <w:spacing w:before="0" w:after="0" w:line="269" w:lineRule="auto"/>
+            </w:pPr>
+            <w:r>
+              <w:rPr>
+                <w:rFonts w:ascii="Calibri" w:hAnsi="Calibri"/>
+                <w:b w:val="0"/>
+                <w:color w:val="17242E"/>
+                <w:sz w:val="17"/>
+              </w:rPr>
+              <w:t>Request for named missing author sequences.</w:t>
+            </w:r>
+          </w:p>
+        </w:tc>
+        <w:tc>
+          <w:tcPr>
+            <w:tcW w:type="dxa" w:w="3780"/>
+            <w:vAlign w:val="center"/>
+          </w:tcPr>
+          <w:p>
+            <w:pPr>
+              <w:spacing w:before="0" w:after="0" w:line="269" w:lineRule="auto"/>
+            </w:pPr>
+            <w:r>
+              <w:rPr>
+                <w:rFonts w:ascii="Calibri" w:hAnsi="Calibri"/>
+                <w:b w:val="0"/>
+                <w:color w:val="17242E"/>
+                <w:sz w:val="17"/>
+              </w:rPr>
+              <w:t>It repairs packet loss, reconnects, and late joins.</w:t>
+            </w:r>
+          </w:p>
+        </w:tc>
+      </w:tr>
+      <w:tr>
+        <w:tc>
+          <w:tcPr>
+            <w:tcW w:type="dxa" w:w="1500"/>
+            <w:vAlign w:val="center"/>
+          </w:tcPr>
+          <w:p>
+            <w:pPr>
+              <w:spacing w:before="0" w:after="0" w:line="269" w:lineRule="auto"/>
+            </w:pPr>
+            <w:r>
+              <w:rPr>
+                <w:rFonts w:ascii="Calibri" w:hAnsi="Calibri"/>
+                <w:b w:val="0"/>
+                <w:color w:val="17242E"/>
+                <w:sz w:val="17"/>
+              </w:rPr>
+              <w:t>Merge</w:t>
+            </w:r>
+          </w:p>
+        </w:tc>
+        <w:tc>
+          <w:tcPr>
+            <w:tcW w:type="dxa" w:w="4080"/>
+            <w:vAlign w:val="center"/>
+          </w:tcPr>
+          <w:p>
+            <w:pPr>
+              <w:spacing w:before="0" w:after="0" w:line="269" w:lineRule="auto"/>
+            </w:pPr>
+            <w:r>
+              <w:rPr>
+                <w:rFonts w:ascii="Calibri" w:hAnsi="Calibri"/>
+                <w:b w:val="0"/>
+                <w:color w:val="17242E"/>
+                <w:sz w:val="17"/>
+              </w:rPr>
+              <w:t>Deterministic replay of all valid operations.</w:t>
+            </w:r>
+          </w:p>
+        </w:tc>
+        <w:tc>
+          <w:tcPr>
+            <w:tcW w:type="dxa" w:w="3780"/>
+            <w:vAlign w:val="center"/>
+          </w:tcPr>
+          <w:p>
+            <w:pPr>
+              <w:spacing w:before="0" w:after="0" w:line="269" w:lineRule="auto"/>
+            </w:pPr>
+            <w:r>
+              <w:rPr>
+                <w:rFonts w:ascii="Calibri" w:hAnsi="Calibri"/>
+                <w:b w:val="0"/>
+                <w:color w:val="17242E"/>
+                <w:sz w:val="17"/>
+              </w:rPr>
+              <w:t>There is no master phone that overwrites every other copy.</w:t>
+            </w:r>
+          </w:p>
+        </w:tc>
+      </w:tr>
+    </w:tbl>
+    <w:p>
+      <w:pPr>
+        <w:spacing w:after="0"/>
+      </w:pPr>
+    </w:p>
+    <w:p>
+      <w:pPr>
+        <w:pStyle w:val="Heading2"/>
+      </w:pPr>
+      <w:r>
+        <w:t>One stroke, step by step</w:t>
+      </w:r>
+    </w:p>
+    <w:p>
+      <w:pPr>
+        <w:numPr>
+          <w:ilvl w:val="0"/>
+          <w:numId w:val="17"/>
+        </w:numPr>
+      </w:pPr>
+      <w:r>
+        <w:t>The user touches the canvas in Draw mode.</w:t>
+      </w:r>
+    </w:p>
+    <w:p>
+      <w:pPr>
+        <w:numPr>
+          <w:ilvl w:val="0"/>
+          <w:numId w:val="17"/>
+        </w:numPr>
+      </w:pPr>
+      <w:r>
+        <w:t>The UI converts screen movement into the shared 1800 x 2400 logical coordinate system.</w:t>
+      </w:r>
+    </w:p>
+    <w:p>
+      <w:pPr>
+        <w:numPr>
+          <w:ilvl w:val="0"/>
+          <w:numId w:val="17"/>
+        </w:numPr>
+      </w:pPr>
+      <w:r>
+        <w:t>Points are sampled only after at least three logical units of movement. The line is shown locally, but it is not sent yet.</w:t>
+      </w:r>
+    </w:p>
+    <w:p>
+      <w:pPr>
+        <w:numPr>
+          <w:ilvl w:val="0"/>
+          <w:numId w:val="17"/>
+        </w:numPr>
+      </w:pPr>
+      <w:r>
+        <w:t>When the finger is released, the sampled path is simplified to at most 160 outgoing points.</w:t>
+      </w:r>
+    </w:p>
+    <w:p>
+      <w:pPr>
+        <w:numPr>
+          <w:ilvl w:val="0"/>
+          <w:numId w:val="17"/>
+        </w:numPr>
+      </w:pPr>
+      <w:r>
+        <w:t>JavaScript creates one stroke event with type s, a unique ID, color, width, and ordered point list.</w:t>
+      </w:r>
+    </w:p>
+    <w:p>
+      <w:pPr>
+        <w:numPr>
+          <w:ilvl w:val="0"/>
+          <w:numId w:val="17"/>
+        </w:numPr>
+      </w:pPr>
+      <w:r>
+        <w:t>The event receives the room ID, display label, timestamp, and next Lamport order.</w:t>
+      </w:r>
+    </w:p>
+    <w:p>
+      <w:pPr>
+        <w:numPr>
+          <w:ilvl w:val="0"/>
+          <w:numId w:val="17"/>
+        </w:numPr>
+      </w:pPr>
+      <w:r>
+        <w:t>The local reducer applies the event immediately so the stroke remains visible while transport is pending.</w:t>
+      </w:r>
+    </w:p>
+    <w:p>
+      <w:pPr>
+        <w:numPr>
+          <w:ilvl w:val="0"/>
+          <w:numId w:val="17"/>
+        </w:numPr>
+      </w:pPr>
+      <w:r>
+        <w:t>Tremola passes the event to Android for protected storage and BLE. tinySSB publishes the event as a WBD feed entry.</w:t>
+      </w:r>
+    </w:p>
+    <w:p>
+      <w:pPr>
+        <w:numPr>
+          <w:ilvl w:val="0"/>
+          <w:numId w:val="17"/>
+        </w:numPr>
+      </w:pPr>
+      <w:r>
+        <w:t>The receiving phone validates and stores the complete event before applying the shared reducer.</w:t>
+      </w:r>
+    </w:p>
+    <w:p>
+      <w:pPr>
+        <w:numPr>
+          <w:ilvl w:val="0"/>
+          <w:numId w:val="17"/>
+        </w:numPr>
+      </w:pPr>
+      <w:r>
+        <w:t>Duplicate copies of the same event are ignored by unique event ID.</w:t>
+      </w:r>
+    </w:p>
+    <w:p>
+      <w:pPr>
+        <w:pStyle w:val="Heading2"/>
+      </w:pPr>
+      <w:r>
+        <w:t>What one board event contains</w:t>
+      </w:r>
+    </w:p>
+    <w:tbl>
+      <w:tblPr>
+        <w:tblW w:type="dxa" w:w="9360"/>
+        <w:tblLayout w:type="fixed"/>
+        <w:tblLook w:firstColumn="1" w:firstRow="1" w:lastColumn="0" w:lastRow="0" w:noHBand="0" w:noVBand="1" w:val="04A0"/>
+        <w:tblInd w:w="120" w:type="dxa"/>
+        <w:tblCellMar>
+          <w:top w:w="80" w:type="dxa"/>
+          <w:start w:w="120" w:type="dxa"/>
+          <w:bottom w:w="80" w:type="dxa"/>
+          <w:end w:w="120" w:type="dxa"/>
+        </w:tblCellMar>
+        <w:tblBorders>
+          <w:top w:val="single" w:sz="4" w:space="0" w:color="D5DDE5"/>
+          <w:left w:val="single" w:sz="4" w:space="0" w:color="D5DDE5"/>
+          <w:bottom w:val="single" w:sz="4" w:space="0" w:color="D5DDE5"/>
+          <w:right w:val="single" w:sz="4" w:space="0" w:color="D5DDE5"/>
+          <w:insideH w:val="single" w:sz="4" w:space="0" w:color="D5DDE5"/>
+          <w:insideV w:val="single" w:sz="4" w:space="0" w:color="D5DDE5"/>
+        </w:tblBorders>
+      </w:tblPr>
+      <w:tblGrid>
+        <w:gridCol w:w="1100"/>
+        <w:gridCol w:w="3400"/>
+        <w:gridCol w:w="4860"/>
+      </w:tblGrid>
+      <w:tr>
+        <w:trPr>
+          <w:tblHeader w:val="true"/>
+        </w:trPr>
+        <w:tc>
+          <w:tcPr>
+            <w:tcW w:type="dxa" w:w="1100"/>
+            <w:vAlign w:val="center"/>
+            <w:shd w:fill="E8EEF5"/>
+          </w:tcPr>
+          <w:p>
+            <w:pPr>
+              <w:spacing w:before="0" w:after="0" w:line="269" w:lineRule="auto"/>
+            </w:pPr>
+            <w:r>
+              <w:rPr>
+                <w:rFonts w:ascii="Calibri" w:hAnsi="Calibri"/>
+                <w:b/>
+                <w:color w:val="1F4D78"/>
+                <w:sz w:val="17"/>
+              </w:rPr>
+              <w:t>Field</w:t>
+            </w:r>
+          </w:p>
+        </w:tc>
+        <w:tc>
+          <w:tcPr>
+            <w:tcW w:type="dxa" w:w="3400"/>
+            <w:vAlign w:val="center"/>
+            <w:shd w:fill="E8EEF5"/>
+          </w:tcPr>
+          <w:p>
+            <w:pPr>
+              <w:spacing w:before="0" w:after="0" w:line="269" w:lineRule="auto"/>
+            </w:pPr>
+            <w:r>
+              <w:rPr>
+                <w:rFonts w:ascii="Calibri" w:hAnsi="Calibri"/>
+                <w:b/>
+                <w:color w:val="1F4D78"/>
+                <w:sz w:val="17"/>
+              </w:rPr>
+              <w:t>Meaning</w:t>
+            </w:r>
+          </w:p>
+        </w:tc>
+        <w:tc>
+          <w:tcPr>
+            <w:tcW w:type="dxa" w:w="4860"/>
+            <w:vAlign w:val="center"/>
+            <w:shd w:fill="E8EEF5"/>
+          </w:tcPr>
+          <w:p>
+            <w:pPr>
+              <w:spacing w:before="0" w:after="0" w:line="269" w:lineRule="auto"/>
+            </w:pPr>
+            <w:r>
+              <w:rPr>
+                <w:rFonts w:ascii="Calibri" w:hAnsi="Calibri"/>
+                <w:b/>
+                <w:color w:val="1F4D78"/>
+                <w:sz w:val="17"/>
+              </w:rPr>
+              <w:t>Example or rule</w:t>
+            </w:r>
+          </w:p>
+        </w:tc>
+      </w:tr>
+      <w:tr>
+        <w:tc>
+          <w:tcPr>
+            <w:tcW w:type="dxa" w:w="1100"/>
+            <w:vAlign w:val="center"/>
+          </w:tcPr>
+          <w:p>
+            <w:pPr>
+              <w:spacing w:before="0" w:after="0" w:line="269" w:lineRule="auto"/>
+            </w:pPr>
+            <w:r>
+              <w:rPr>
+                <w:rFonts w:ascii="Calibri" w:hAnsi="Calibri"/>
+                <w:b w:val="0"/>
+                <w:color w:val="17242E"/>
+                <w:sz w:val="17"/>
+              </w:rPr>
+              <w:t>k</w:t>
+            </w:r>
+          </w:p>
+        </w:tc>
+        <w:tc>
+          <w:tcPr>
+            <w:tcW w:type="dxa" w:w="3400"/>
+            <w:vAlign w:val="center"/>
+          </w:tcPr>
+          <w:p>
+            <w:pPr>
+              <w:spacing w:before="0" w:after="0" w:line="269" w:lineRule="auto"/>
+            </w:pPr>
+            <w:r>
+              <w:rPr>
+                <w:rFonts w:ascii="Calibri" w:hAnsi="Calibri"/>
+                <w:b w:val="0"/>
+                <w:color w:val="17242E"/>
+                <w:sz w:val="17"/>
+              </w:rPr>
+              <w:t>Action type</w:t>
+            </w:r>
+          </w:p>
+        </w:tc>
+        <w:tc>
+          <w:tcPr>
+            <w:tcW w:type="dxa" w:w="4860"/>
+            <w:vAlign w:val="center"/>
+          </w:tcPr>
+          <w:p>
+            <w:pPr>
+              <w:spacing w:before="0" w:after="0" w:line="269" w:lineRule="auto"/>
+            </w:pPr>
+            <w:r>
+              <w:rPr>
+                <w:rFonts w:ascii="Calibri" w:hAnsi="Calibri"/>
+                <w:b w:val="0"/>
+                <w:color w:val="17242E"/>
+                <w:sz w:val="17"/>
+              </w:rPr>
+              <w:t>s stroke, t text, m move/resize, k recolor, d delete, c clear, n name</w:t>
+            </w:r>
+          </w:p>
+        </w:tc>
+      </w:tr>
+      <w:tr>
+        <w:tc>
+          <w:tcPr>
+            <w:tcW w:type="dxa" w:w="1100"/>
+            <w:vAlign w:val="center"/>
+          </w:tcPr>
+          <w:p>
+            <w:pPr>
+              <w:spacing w:before="0" w:after="0" w:line="269" w:lineRule="auto"/>
+            </w:pPr>
+            <w:r>
+              <w:rPr>
+                <w:rFonts w:ascii="Calibri" w:hAnsi="Calibri"/>
+                <w:b w:val="0"/>
+                <w:color w:val="17242E"/>
+                <w:sz w:val="17"/>
+              </w:rPr>
+              <w:t>id</w:t>
+            </w:r>
+          </w:p>
+        </w:tc>
+        <w:tc>
+          <w:tcPr>
+            <w:tcW w:type="dxa" w:w="3400"/>
+            <w:vAlign w:val="center"/>
+          </w:tcPr>
+          <w:p>
+            <w:pPr>
+              <w:spacing w:before="0" w:after="0" w:line="269" w:lineRule="auto"/>
+            </w:pPr>
+            <w:r>
+              <w:rPr>
+                <w:rFonts w:ascii="Calibri" w:hAnsi="Calibri"/>
+                <w:b w:val="0"/>
+                <w:color w:val="17242E"/>
+                <w:sz w:val="17"/>
+              </w:rPr>
+              <w:t>Globally unique event ID</w:t>
+            </w:r>
+          </w:p>
+        </w:tc>
+        <w:tc>
+          <w:tcPr>
+            <w:tcW w:type="dxa" w:w="4860"/>
+            <w:vAlign w:val="center"/>
+          </w:tcPr>
+          <w:p>
+            <w:pPr>
+              <w:spacing w:before="0" w:after="0" w:line="269" w:lineRule="auto"/>
+            </w:pPr>
+            <w:r>
+              <w:rPr>
+                <w:rFonts w:ascii="Calibri" w:hAnsi="Calibri"/>
+                <w:b w:val="0"/>
+                <w:color w:val="17242E"/>
+                <w:sz w:val="17"/>
+              </w:rPr>
+              <w:t>Used for deduplication and as a deterministic tie-break</w:t>
+            </w:r>
+          </w:p>
+        </w:tc>
+      </w:tr>
+      <w:tr>
+        <w:tc>
+          <w:tcPr>
+            <w:tcW w:type="dxa" w:w="1100"/>
+            <w:vAlign w:val="center"/>
+          </w:tcPr>
+          <w:p>
+            <w:pPr>
+              <w:spacing w:before="0" w:after="0" w:line="269" w:lineRule="auto"/>
+            </w:pPr>
+            <w:r>
+              <w:rPr>
+                <w:rFonts w:ascii="Calibri" w:hAnsi="Calibri"/>
+                <w:b w:val="0"/>
+                <w:color w:val="17242E"/>
+                <w:sz w:val="17"/>
+              </w:rPr>
+              <w:t>r</w:t>
+            </w:r>
+          </w:p>
+        </w:tc>
+        <w:tc>
+          <w:tcPr>
+            <w:tcW w:type="dxa" w:w="3400"/>
+            <w:vAlign w:val="center"/>
+          </w:tcPr>
+          <w:p>
+            <w:pPr>
+              <w:spacing w:before="0" w:after="0" w:line="269" w:lineRule="auto"/>
+            </w:pPr>
+            <w:r>
+              <w:rPr>
+                <w:rFonts w:ascii="Calibri" w:hAnsi="Calibri"/>
+                <w:b w:val="0"/>
+                <w:color w:val="17242E"/>
+                <w:sz w:val="17"/>
+              </w:rPr>
+              <w:t>Board or room ID</w:t>
+            </w:r>
+          </w:p>
+        </w:tc>
+        <w:tc>
+          <w:tcPr>
+            <w:tcW w:type="dxa" w:w="4860"/>
+            <w:vAlign w:val="center"/>
+          </w:tcPr>
+          <w:p>
+            <w:pPr>
+              <w:spacing w:before="0" w:after="0" w:line="269" w:lineRule="auto"/>
+            </w:pPr>
+            <w:r>
+              <w:rPr>
+                <w:rFonts w:ascii="Calibri" w:hAnsi="Calibri"/>
+                <w:b w:val="0"/>
+                <w:color w:val="17242E"/>
+                <w:sz w:val="17"/>
+              </w:rPr>
+              <w:t>Events for another open board are rejected</w:t>
+            </w:r>
+          </w:p>
+        </w:tc>
+      </w:tr>
+      <w:tr>
+        <w:tc>
+          <w:tcPr>
+            <w:tcW w:type="dxa" w:w="1100"/>
+            <w:vAlign w:val="center"/>
+          </w:tcPr>
+          <w:p>
+            <w:pPr>
+              <w:spacing w:before="0" w:after="0" w:line="269" w:lineRule="auto"/>
+            </w:pPr>
+            <w:r>
+              <w:rPr>
+                <w:rFonts w:ascii="Calibri" w:hAnsi="Calibri"/>
+                <w:b w:val="0"/>
+                <w:color w:val="17242E"/>
+                <w:sz w:val="17"/>
+              </w:rPr>
+              <w:t>l</w:t>
+            </w:r>
+          </w:p>
+        </w:tc>
+        <w:tc>
+          <w:tcPr>
+            <w:tcW w:type="dxa" w:w="3400"/>
+            <w:vAlign w:val="center"/>
+          </w:tcPr>
+          <w:p>
+            <w:pPr>
+              <w:spacing w:before="0" w:after="0" w:line="269" w:lineRule="auto"/>
+            </w:pPr>
+            <w:r>
+              <w:rPr>
+                <w:rFonts w:ascii="Calibri" w:hAnsi="Calibri"/>
+                <w:b w:val="0"/>
+                <w:color w:val="17242E"/>
+                <w:sz w:val="17"/>
+              </w:rPr>
+              <w:t>Lamport order</w:t>
+            </w:r>
+          </w:p>
+        </w:tc>
+        <w:tc>
+          <w:tcPr>
+            <w:tcW w:type="dxa" w:w="4860"/>
+            <w:vAlign w:val="center"/>
+          </w:tcPr>
+          <w:p>
+            <w:pPr>
+              <w:spacing w:before="0" w:after="0" w:line="269" w:lineRule="auto"/>
+            </w:pPr>
+            <w:r>
+              <w:rPr>
+                <w:rFonts w:ascii="Calibri" w:hAnsi="Calibri"/>
+                <w:b w:val="0"/>
+                <w:color w:val="17242E"/>
+                <w:sz w:val="17"/>
+              </w:rPr>
+              <w:t>Logical order independent of different phone clocks</w:t>
+            </w:r>
+          </w:p>
+        </w:tc>
+      </w:tr>
+      <w:tr>
+        <w:tc>
+          <w:tcPr>
+            <w:tcW w:type="dxa" w:w="1100"/>
+            <w:vAlign w:val="center"/>
+          </w:tcPr>
+          <w:p>
+            <w:pPr>
+              <w:spacing w:before="0" w:after="0" w:line="269" w:lineRule="auto"/>
+            </w:pPr>
+            <w:r>
+              <w:rPr>
+                <w:rFonts w:ascii="Calibri" w:hAnsi="Calibri"/>
+                <w:b w:val="0"/>
+                <w:color w:val="17242E"/>
+                <w:sz w:val="17"/>
+              </w:rPr>
+              <w:t>ts</w:t>
+            </w:r>
+          </w:p>
+        </w:tc>
+        <w:tc>
+          <w:tcPr>
+            <w:tcW w:type="dxa" w:w="3400"/>
+            <w:vAlign w:val="center"/>
+          </w:tcPr>
+          <w:p>
+            <w:pPr>
+              <w:spacing w:before="0" w:after="0" w:line="269" w:lineRule="auto"/>
+            </w:pPr>
+            <w:r>
+              <w:rPr>
+                <w:rFonts w:ascii="Calibri" w:hAnsi="Calibri"/>
+                <w:b w:val="0"/>
+                <w:color w:val="17242E"/>
+                <w:sz w:val="17"/>
+              </w:rPr>
+              <w:t>Local creation time</w:t>
+            </w:r>
+          </w:p>
+        </w:tc>
+        <w:tc>
+          <w:tcPr>
+            <w:tcW w:type="dxa" w:w="4860"/>
+            <w:vAlign w:val="center"/>
+          </w:tcPr>
+          <w:p>
+            <w:pPr>
+              <w:spacing w:before="0" w:after="0" w:line="269" w:lineRule="auto"/>
+            </w:pPr>
+            <w:r>
+              <w:rPr>
+                <w:rFonts w:ascii="Calibri" w:hAnsi="Calibri"/>
+                <w:b w:val="0"/>
+                <w:color w:val="17242E"/>
+                <w:sz w:val="17"/>
+              </w:rPr>
+              <w:t>Useful for migration and display, not the only conflict rule</w:t>
+            </w:r>
+          </w:p>
+        </w:tc>
+      </w:tr>
+      <w:tr>
+        <w:tc>
+          <w:tcPr>
+            <w:tcW w:type="dxa" w:w="1100"/>
+            <w:vAlign w:val="center"/>
+          </w:tcPr>
+          <w:p>
+            <w:pPr>
+              <w:spacing w:before="0" w:after="0" w:line="269" w:lineRule="auto"/>
+            </w:pPr>
+            <w:r>
+              <w:rPr>
+                <w:rFonts w:ascii="Calibri" w:hAnsi="Calibri"/>
+                <w:b w:val="0"/>
+                <w:color w:val="17242E"/>
+                <w:sz w:val="17"/>
+              </w:rPr>
+              <w:t>u</w:t>
+            </w:r>
+          </w:p>
+        </w:tc>
+        <w:tc>
+          <w:tcPr>
+            <w:tcW w:type="dxa" w:w="3400"/>
+            <w:vAlign w:val="center"/>
+          </w:tcPr>
+          <w:p>
+            <w:pPr>
+              <w:spacing w:before="0" w:after="0" w:line="269" w:lineRule="auto"/>
+            </w:pPr>
+            <w:r>
+              <w:rPr>
+                <w:rFonts w:ascii="Calibri" w:hAnsi="Calibri"/>
+                <w:b w:val="0"/>
+                <w:color w:val="17242E"/>
+                <w:sz w:val="17"/>
+              </w:rPr>
+              <w:t>Display label</w:t>
+            </w:r>
+          </w:p>
+        </w:tc>
+        <w:tc>
+          <w:tcPr>
+            <w:tcW w:type="dxa" w:w="4860"/>
+            <w:vAlign w:val="center"/>
+          </w:tcPr>
+          <w:p>
+            <w:pPr>
+              <w:spacing w:before="0" w:after="0" w:line="269" w:lineRule="auto"/>
+            </w:pPr>
+            <w:r>
+              <w:rPr>
+                <w:rFonts w:ascii="Calibri" w:hAnsi="Calibri"/>
+                <w:b w:val="0"/>
+                <w:color w:val="17242E"/>
+                <w:sz w:val="17"/>
+              </w:rPr>
+              <w:t>Human-readable name; not the cryptographic identity</w:t>
+            </w:r>
+          </w:p>
+        </w:tc>
+      </w:tr>
+      <w:tr>
+        <w:tc>
+          <w:tcPr>
+            <w:tcW w:type="dxa" w:w="1100"/>
+            <w:vAlign w:val="center"/>
+          </w:tcPr>
+          <w:p>
+            <w:pPr>
+              <w:spacing w:before="0" w:after="0" w:line="269" w:lineRule="auto"/>
+            </w:pPr>
+            <w:r>
+              <w:rPr>
+                <w:rFonts w:ascii="Calibri" w:hAnsi="Calibri"/>
+                <w:b w:val="0"/>
+                <w:color w:val="17242E"/>
+                <w:sz w:val="17"/>
+              </w:rPr>
+              <w:t>Type fields</w:t>
+            </w:r>
+          </w:p>
+        </w:tc>
+        <w:tc>
+          <w:tcPr>
+            <w:tcW w:type="dxa" w:w="3400"/>
+            <w:vAlign w:val="center"/>
+          </w:tcPr>
+          <w:p>
+            <w:pPr>
+              <w:spacing w:before="0" w:after="0" w:line="269" w:lineRule="auto"/>
+            </w:pPr>
+            <w:r>
+              <w:rPr>
+                <w:rFonts w:ascii="Calibri" w:hAnsi="Calibri"/>
+                <w:b w:val="0"/>
+                <w:color w:val="17242E"/>
+                <w:sz w:val="17"/>
+              </w:rPr>
+              <w:t>Action-specific data</w:t>
+            </w:r>
+          </w:p>
+        </w:tc>
+        <w:tc>
+          <w:tcPr>
+            <w:tcW w:type="dxa" w:w="4860"/>
+            <w:vAlign w:val="center"/>
+          </w:tcPr>
+          <w:p>
+            <w:pPr>
+              <w:spacing w:before="0" w:after="0" w:line="269" w:lineRule="auto"/>
+            </w:pPr>
+            <w:r>
+              <w:rPr>
+                <w:rFonts w:ascii="Calibri" w:hAnsi="Calibri"/>
+                <w:b w:val="0"/>
+                <w:color w:val="17242E"/>
+                <w:sz w:val="17"/>
+              </w:rPr>
+              <w:t>Points for s, coordinates/text for t, target and transform for m</w:t>
+            </w:r>
+          </w:p>
+        </w:tc>
+      </w:tr>
+    </w:tbl>
+    <w:p>
+      <w:pPr>
+        <w:spacing w:after="0"/>
+      </w:pPr>
+    </w:p>
+    <w:p>
+      <w:pPr>
+        <w:spacing w:before="100" w:after="140"/>
+        <w:ind w:left="160" w:right="160"/>
+        <w:shd w:fill="EAF3F7"/>
+        <w:pBdr>
+          <w:left w:val="single" w:sz="18" w:space="7" w:color="2F6F83"/>
+        </w:pBdr>
+      </w:pPr>
+      <w:r>
+        <w:rPr>
+          <w:b/>
+        </w:rPr>
+        <w:t>Important distinction</w:t>
+        <w:br/>
+      </w:r>
+      <w:r>
+        <w:t>A move does not resend a stroke. It creates a new m event that refers to the original object's ID. If the move arrives first, it stays in the operation set and becomes visible when the original object is recovered.</w:t>
+      </w:r>
+    </w:p>
+    <w:p>
+      <w:pPr>
+        <w:pStyle w:val="TableSource"/>
+      </w:pPr>
+      <w:r>
+        <w:t xml:space="preserve">Repository: </w:t>
+      </w:r>
+      <w:hyperlink r:id="rId47" w:history="1">
+        <w:r>
+          <w:rPr>
+            <w:color w:val="0563C1"/>
+            <w:u w:val="single"/>
+          </w:rPr>
+          <w:t>Full event and merge guide</w:t>
+        </w:r>
+      </w:hyperlink>
+      <w:r>
+        <w:t xml:space="preserve">  |  </w:t>
+      </w:r>
+      <w:hyperlink r:id="rId15" w:history="1">
+        <w:r>
+          <w:rPr>
+            <w:color w:val="0563C1"/>
+            <w:u w:val="single"/>
+          </w:rPr>
+          <w:t>Shared reducer source</w:t>
+        </w:r>
+      </w:hyperlink>
+    </w:p>
+    <w:p>
+      <w:pPr>
+        <w:pStyle w:val="Heading1"/>
+      </w:pPr>
+      <w:r>
+        <w:t>12. Tremola BLE Transport in Full</w:t>
+      </w:r>
+    </w:p>
+    <w:p>
+      <w:pPr>
+        <w:pStyle w:val="Heading2"/>
+      </w:pPr>
+      <w:r>
+        <w:t>Create and protect the operation</w:t>
+      </w:r>
+    </w:p>
+    <w:p>
+      <w:pPr>
+        <w:numPr>
+          <w:ilvl w:val="0"/>
+          <w:numId w:val="18"/>
+        </w:numPr>
+      </w:pPr>
+      <w:r>
+        <w:t>The WebView bridge checks that the board is open and forwards the encoded JavaScript event to Kotlin.</w:t>
+      </w:r>
+    </w:p>
+    <w:p>
+      <w:pPr>
+        <w:numPr>
+          <w:ilvl w:val="0"/>
+          <w:numId w:val="18"/>
+        </w:numPr>
+      </w:pPr>
+      <w:r>
+        <w:t>Android verifies that the local Tremola feed ID belongs to the board roster.</w:t>
+      </w:r>
+    </w:p>
+    <w:p>
+      <w:pPr>
+        <w:numPr>
+          <w:ilvl w:val="0"/>
+          <w:numId w:val="18"/>
+        </w:numPr>
+      </w:pPr>
+      <w:r>
+        <w:t>Room supplies the next sequence number for this author in this board.</w:t>
+      </w:r>
+    </w:p>
+    <w:p>
+      <w:pPr>
+        <w:numPr>
+          <w:ilvl w:val="0"/>
+          <w:numId w:val="18"/>
+        </w:numPr>
+      </w:pPr>
+      <w:r>
+        <w:t>The JSON payload is rejected if it exceeds 8192 bytes.</w:t>
+      </w:r>
+    </w:p>
+    <w:p>
+      <w:pPr>
+        <w:numPr>
+          <w:ilvl w:val="0"/>
+          <w:numId w:val="18"/>
+        </w:numPr>
+      </w:pPr>
+      <w:r>
+        <w:t>Deflate compression is used when it saves at least 16 bytes.</w:t>
+      </w:r>
+    </w:p>
+    <w:p>
+      <w:pPr>
+        <w:numPr>
+          <w:ilvl w:val="0"/>
+          <w:numId w:val="18"/>
+        </w:numPr>
+      </w:pPr>
+      <w:r>
+        <w:t>AES-256-GCM encrypts the payload with a random 12-byte nonce and binds room, author, sequence, ID, and compression flag as authenticated data.</w:t>
+      </w:r>
+    </w:p>
+    <w:p>
+      <w:pPr>
+        <w:numPr>
+          <w:ilvl w:val="0"/>
+          <w:numId w:val="18"/>
+        </w:numPr>
+      </w:pPr>
+      <w:r>
+        <w:t>The author's Ed25519 feed identity signs the canonical wire values.</w:t>
+      </w:r>
+    </w:p>
+    <w:p>
+      <w:pPr>
+        <w:numPr>
+          <w:ilvl w:val="0"/>
+          <w:numId w:val="18"/>
+        </w:numPr>
+      </w:pPr>
+      <w:r>
+        <w:t>Room stores the operation before BLE delivery is trusted.</w:t>
+      </w:r>
+    </w:p>
+    <w:p>
+      <w:pPr>
+        <w:numPr>
+          <w:ilvl w:val="0"/>
+          <w:numId w:val="18"/>
+        </w:numPr>
+      </w:pPr>
+      <w:r>
+        <w:t>The operation is also appended to Tremola's signed collabboard custom-app log.</w:t>
+      </w:r>
+    </w:p>
+    <w:p>
+      <w:pPr>
+        <w:numPr>
+          <w:ilvl w:val="0"/>
+          <w:numId w:val="18"/>
+        </w:numPr>
+      </w:pPr>
+      <w:r>
+        <w:t>Android queues the operation for each authenticated logical board peer.</w:t>
+      </w:r>
+    </w:p>
+    <w:p>
+      <w:pPr>
+        <w:pStyle w:val="Heading2"/>
+      </w:pPr>
+      <w:r>
+        <w:t>Frame, send, acknowledge, and retry</w:t>
+      </w:r>
+    </w:p>
+    <w:p>
+      <w:pPr>
+        <w:numPr>
+          <w:ilvl w:val="0"/>
+          <w:numId w:val="19"/>
+        </w:numPr>
+      </w:pPr>
+      <w:r>
+        <w:t>BLE discovery creates a GATT route and a signed board hello authenticates a matching room and feed identity.</w:t>
+      </w:r>
+    </w:p>
+    <w:p>
+      <w:pPr>
+        <w:numPr>
+          <w:ilvl w:val="0"/>
+          <w:numId w:val="19"/>
+        </w:numPr>
+      </w:pPr>
+      <w:r>
+        <w:t>The phones prefer MTU 247 and may fall back to MTU 23 on older devices.</w:t>
+      </w:r>
+    </w:p>
+    <w:p>
+      <w:pPr>
+        <w:numPr>
+          <w:ilvl w:val="0"/>
+          <w:numId w:val="19"/>
+        </w:numPr>
+      </w:pPr>
+      <w:r>
+        <w:t>The bo JSON message is optionally compressed and split into numbered frames with an 8-byte header.</w:t>
+      </w:r>
+    </w:p>
+    <w:p>
+      <w:pPr>
+        <w:numPr>
+          <w:ilvl w:val="0"/>
+          <w:numId w:val="19"/>
+        </w:numPr>
+      </w:pPr>
+      <w:r>
+        <w:t>At preferred MTU one frame carries at most 180 message bytes; at fallback MTU only 12 bytes remain after headers.</w:t>
+      </w:r>
+    </w:p>
+    <w:p>
+      <w:pPr>
+        <w:numPr>
+          <w:ilvl w:val="0"/>
+          <w:numId w:val="19"/>
+        </w:numPr>
+      </w:pPr>
+      <w:r>
+        <w:t>A bounded per-link queue holds the frames. Android sends one frame and waits for onCharacteristicWrite or onNotificationSent before the next.</w:t>
+      </w:r>
+    </w:p>
+    <w:p>
+      <w:pPr>
+        <w:numPr>
+          <w:ilvl w:val="0"/>
+          <w:numId w:val="19"/>
+        </w:numPr>
+      </w:pPr>
+      <w:r>
+        <w:t>The receiver groups frames by message ID and waits until every frame number is present.</w:t>
+      </w:r>
+    </w:p>
+    <w:p>
+      <w:pPr>
+        <w:numPr>
+          <w:ilvl w:val="0"/>
+          <w:numId w:val="19"/>
+        </w:numPr>
+      </w:pPr>
+      <w:r>
+        <w:t>It verifies board, member, Ed25519 signature, AES-GCM tag, operation ID, size, and event payload.</w:t>
+      </w:r>
+    </w:p>
+    <w:p>
+      <w:pPr>
+        <w:numPr>
+          <w:ilvl w:val="0"/>
+          <w:numId w:val="19"/>
+        </w:numPr>
+      </w:pPr>
+      <w:r>
+        <w:t>The verified operation is inserted into Room. Duplicate primary keys are ignored.</w:t>
+      </w:r>
+    </w:p>
+    <w:p>
+      <w:pPr>
+        <w:numPr>
+          <w:ilvl w:val="0"/>
+          <w:numId w:val="19"/>
+        </w:numPr>
+      </w:pPr>
+      <w:r>
+        <w:t>The receiver sends ba only for the complete operation, then applies it to the WebView and relays it to other peers.</w:t>
+      </w:r>
+    </w:p>
+    <w:p>
+      <w:pPr>
+        <w:numPr>
+          <w:ilvl w:val="0"/>
+          <w:numId w:val="19"/>
+        </w:numPr>
+      </w:pPr>
+      <w:r>
+        <w:t>Without ba, the sender retries after two seconds, up to 12 direct attempts. Frontier recovery remains available afterward.</w:t>
+      </w:r>
+    </w:p>
+    <w:p>
+      <w:pPr>
+        <w:pStyle w:val="Heading2"/>
+      </w:pPr>
+      <w:r>
+        <w:t>Five-second anti-entropy</w:t>
+      </w:r>
+    </w:p>
+    <w:p>
+      <w:r>
+        <w:t>Every five seconds, authenticated peers exchange the highest contiguous sequence known for each author. This repairs operations missed during direct delivery and also catches up phones that were offline.</w:t>
+      </w:r>
+    </w:p>
+    <w:p>
+      <w:pPr>
+        <w:spacing w:before="100" w:after="140"/>
+        <w:ind w:left="160" w:right="160"/>
+        <w:shd w:fill="EAF3F7"/>
+        <w:pBdr>
+          <w:left w:val="single" w:sz="18" w:space="7" w:color="2F6F83"/>
+        </w:pBdr>
+      </w:pPr>
+      <w:r>
+        <w:rPr>
+          <w:b/>
+        </w:rPr>
+        <w:t>Worked example</w:t>
+        <w:br/>
+      </w:r>
+      <w:r>
+        <w:t>Phone A has Alice 1,2,3,4 and Bob 1,2. Phone B has Alice 1,2,4 and Bob 1,2,3. A reports Alice=4 and Bob=2. B reports Alice=2 and Bob=3 because Alice 3 is missing. B requests Alice 3..4; A requests Bob 3. Alice 4 is harmless when received again because its ID and sequence are already stored.</w:t>
+      </w:r>
+    </w:p>
+    <w:tbl>
+      <w:tblPr>
+        <w:tblW w:type="dxa" w:w="9360"/>
+        <w:tblLayout w:type="fixed"/>
+        <w:tblLook w:firstColumn="1" w:firstRow="1" w:lastColumn="0" w:lastRow="0" w:noHBand="0" w:noVBand="1" w:val="04A0"/>
+        <w:tblInd w:w="120" w:type="dxa"/>
+        <w:tblCellMar>
+          <w:top w:w="80" w:type="dxa"/>
+          <w:start w:w="120" w:type="dxa"/>
+          <w:bottom w:w="80" w:type="dxa"/>
+          <w:end w:w="120" w:type="dxa"/>
+        </w:tblCellMar>
+        <w:tblBorders>
+          <w:top w:val="single" w:sz="4" w:space="0" w:color="D5DDE5"/>
+          <w:left w:val="single" w:sz="4" w:space="0" w:color="D5DDE5"/>
+          <w:bottom w:val="single" w:sz="4" w:space="0" w:color="D5DDE5"/>
+          <w:right w:val="single" w:sz="4" w:space="0" w:color="D5DDE5"/>
+          <w:insideH w:val="single" w:sz="4" w:space="0" w:color="D5DDE5"/>
+          <w:insideV w:val="single" w:sz="4" w:space="0" w:color="D5DDE5"/>
+        </w:tblBorders>
+      </w:tblPr>
+      <w:tblGrid>
+        <w:gridCol w:w="1100"/>
+        <w:gridCol w:w="2760"/>
+        <w:gridCol w:w="5500"/>
+      </w:tblGrid>
+      <w:tr>
+        <w:trPr>
+          <w:tblHeader w:val="true"/>
+        </w:trPr>
+        <w:tc>
+          <w:tcPr>
+            <w:tcW w:type="dxa" w:w="1100"/>
+            <w:vAlign w:val="center"/>
+            <w:shd w:fill="E8EEF5"/>
+          </w:tcPr>
+          <w:p>
+            <w:pPr>
+              <w:spacing w:before="0" w:after="0" w:line="269" w:lineRule="auto"/>
+            </w:pPr>
+            <w:r>
+              <w:rPr>
+                <w:rFonts w:ascii="Calibri" w:hAnsi="Calibri"/>
+                <w:b/>
+                <w:color w:val="1F4D78"/>
+                <w:sz w:val="17"/>
+              </w:rPr>
+              <w:t>Message</w:t>
+            </w:r>
+          </w:p>
+        </w:tc>
+        <w:tc>
+          <w:tcPr>
+            <w:tcW w:type="dxa" w:w="2760"/>
+            <w:vAlign w:val="center"/>
+            <w:shd w:fill="E8EEF5"/>
+          </w:tcPr>
+          <w:p>
+            <w:pPr>
+              <w:spacing w:before="0" w:after="0" w:line="269" w:lineRule="auto"/>
+            </w:pPr>
+            <w:r>
+              <w:rPr>
+                <w:rFonts w:ascii="Calibri" w:hAnsi="Calibri"/>
+                <w:b/>
+                <w:color w:val="1F4D78"/>
+                <w:sz w:val="17"/>
+              </w:rPr>
+              <w:t>Meaning</w:t>
+            </w:r>
+          </w:p>
+        </w:tc>
+        <w:tc>
+          <w:tcPr>
+            <w:tcW w:type="dxa" w:w="5500"/>
+            <w:vAlign w:val="center"/>
+            <w:shd w:fill="E8EEF5"/>
+          </w:tcPr>
+          <w:p>
+            <w:pPr>
+              <w:spacing w:before="0" w:after="0" w:line="269" w:lineRule="auto"/>
+            </w:pPr>
+            <w:r>
+              <w:rPr>
+                <w:rFonts w:ascii="Calibri" w:hAnsi="Calibri"/>
+                <w:b/>
+                <w:color w:val="1F4D78"/>
+                <w:sz w:val="17"/>
+              </w:rPr>
+              <w:t>Report-friendly explanation</w:t>
+            </w:r>
+          </w:p>
+        </w:tc>
+      </w:tr>
+      <w:tr>
+        <w:tc>
+          <w:tcPr>
+            <w:tcW w:type="dxa" w:w="1100"/>
+            <w:vAlign w:val="center"/>
+          </w:tcPr>
+          <w:p>
+            <w:pPr>
+              <w:spacing w:before="0" w:after="0" w:line="269" w:lineRule="auto"/>
+            </w:pPr>
+            <w:r>
+              <w:rPr>
+                <w:rFonts w:ascii="Calibri" w:hAnsi="Calibri"/>
+                <w:b w:val="0"/>
+                <w:color w:val="17242E"/>
+                <w:sz w:val="17"/>
+              </w:rPr>
+              <w:t>bh</w:t>
+            </w:r>
+          </w:p>
+        </w:tc>
+        <w:tc>
+          <w:tcPr>
+            <w:tcW w:type="dxa" w:w="2760"/>
+            <w:vAlign w:val="center"/>
+          </w:tcPr>
+          <w:p>
+            <w:pPr>
+              <w:spacing w:before="0" w:after="0" w:line="269" w:lineRule="auto"/>
+            </w:pPr>
+            <w:r>
+              <w:rPr>
+                <w:rFonts w:ascii="Calibri" w:hAnsi="Calibri"/>
+                <w:b w:val="0"/>
+                <w:color w:val="17242E"/>
+                <w:sz w:val="17"/>
+              </w:rPr>
+              <w:t>Authenticated board hello</w:t>
+            </w:r>
+          </w:p>
+        </w:tc>
+        <w:tc>
+          <w:tcPr>
+            <w:tcW w:type="dxa" w:w="5500"/>
+            <w:vAlign w:val="center"/>
+          </w:tcPr>
+          <w:p>
+            <w:pPr>
+              <w:spacing w:before="0" w:after="0" w:line="269" w:lineRule="auto"/>
+            </w:pPr>
+            <w:r>
+              <w:rPr>
+                <w:rFonts w:ascii="Calibri" w:hAnsi="Calibri"/>
+                <w:b w:val="0"/>
+                <w:color w:val="17242E"/>
+                <w:sz w:val="17"/>
+              </w:rPr>
+              <w:t>Proves matching board access and stable feed identity</w:t>
+            </w:r>
+          </w:p>
+        </w:tc>
+      </w:tr>
+      <w:tr>
+        <w:tc>
+          <w:tcPr>
+            <w:tcW w:type="dxa" w:w="1100"/>
+            <w:vAlign w:val="center"/>
+          </w:tcPr>
+          <w:p>
+            <w:pPr>
+              <w:spacing w:before="0" w:after="0" w:line="269" w:lineRule="auto"/>
+            </w:pPr>
+            <w:r>
+              <w:rPr>
+                <w:rFonts w:ascii="Calibri" w:hAnsi="Calibri"/>
+                <w:b w:val="0"/>
+                <w:color w:val="17242E"/>
+                <w:sz w:val="17"/>
+              </w:rPr>
+              <w:t>bf</w:t>
+            </w:r>
+          </w:p>
+        </w:tc>
+        <w:tc>
+          <w:tcPr>
+            <w:tcW w:type="dxa" w:w="2760"/>
+            <w:vAlign w:val="center"/>
+          </w:tcPr>
+          <w:p>
+            <w:pPr>
+              <w:spacing w:before="0" w:after="0" w:line="269" w:lineRule="auto"/>
+            </w:pPr>
+            <w:r>
+              <w:rPr>
+                <w:rFonts w:ascii="Calibri" w:hAnsi="Calibri"/>
+                <w:b w:val="0"/>
+                <w:color w:val="17242E"/>
+                <w:sz w:val="17"/>
+              </w:rPr>
+              <w:t>Frontier</w:t>
+            </w:r>
+          </w:p>
+        </w:tc>
+        <w:tc>
+          <w:tcPr>
+            <w:tcW w:type="dxa" w:w="5500"/>
+            <w:vAlign w:val="center"/>
+          </w:tcPr>
+          <w:p>
+            <w:pPr>
+              <w:spacing w:before="0" w:after="0" w:line="269" w:lineRule="auto"/>
+            </w:pPr>
+            <w:r>
+              <w:rPr>
+                <w:rFonts w:ascii="Calibri" w:hAnsi="Calibri"/>
+                <w:b w:val="0"/>
+                <w:color w:val="17242E"/>
+                <w:sz w:val="17"/>
+              </w:rPr>
+              <w:t>Announces contiguous per-author progress</w:t>
+            </w:r>
+          </w:p>
+        </w:tc>
+      </w:tr>
+      <w:tr>
+        <w:tc>
+          <w:tcPr>
+            <w:tcW w:type="dxa" w:w="1100"/>
+            <w:vAlign w:val="center"/>
+          </w:tcPr>
+          <w:p>
+            <w:pPr>
+              <w:spacing w:before="0" w:after="0" w:line="269" w:lineRule="auto"/>
+            </w:pPr>
+            <w:r>
+              <w:rPr>
+                <w:rFonts w:ascii="Calibri" w:hAnsi="Calibri"/>
+                <w:b w:val="0"/>
+                <w:color w:val="17242E"/>
+                <w:sz w:val="17"/>
+              </w:rPr>
+              <w:t>bw</w:t>
+            </w:r>
+          </w:p>
+        </w:tc>
+        <w:tc>
+          <w:tcPr>
+            <w:tcW w:type="dxa" w:w="2760"/>
+            <w:vAlign w:val="center"/>
+          </w:tcPr>
+          <w:p>
+            <w:pPr>
+              <w:spacing w:before="0" w:after="0" w:line="269" w:lineRule="auto"/>
+            </w:pPr>
+            <w:r>
+              <w:rPr>
+                <w:rFonts w:ascii="Calibri" w:hAnsi="Calibri"/>
+                <w:b w:val="0"/>
+                <w:color w:val="17242E"/>
+                <w:sz w:val="17"/>
+              </w:rPr>
+              <w:t>WANT</w:t>
+            </w:r>
+          </w:p>
+        </w:tc>
+        <w:tc>
+          <w:tcPr>
+            <w:tcW w:type="dxa" w:w="5500"/>
+            <w:vAlign w:val="center"/>
+          </w:tcPr>
+          <w:p>
+            <w:pPr>
+              <w:spacing w:before="0" w:after="0" w:line="269" w:lineRule="auto"/>
+            </w:pPr>
+            <w:r>
+              <w:rPr>
+                <w:rFonts w:ascii="Calibri" w:hAnsi="Calibri"/>
+                <w:b w:val="0"/>
+                <w:color w:val="17242E"/>
+                <w:sz w:val="17"/>
+              </w:rPr>
+              <w:t>Requests missing author sequence ranges</w:t>
+            </w:r>
+          </w:p>
+        </w:tc>
+      </w:tr>
+      <w:tr>
+        <w:tc>
+          <w:tcPr>
+            <w:tcW w:type="dxa" w:w="1100"/>
+            <w:vAlign w:val="center"/>
+          </w:tcPr>
+          <w:p>
+            <w:pPr>
+              <w:spacing w:before="0" w:after="0" w:line="269" w:lineRule="auto"/>
+            </w:pPr>
+            <w:r>
+              <w:rPr>
+                <w:rFonts w:ascii="Calibri" w:hAnsi="Calibri"/>
+                <w:b w:val="0"/>
+                <w:color w:val="17242E"/>
+                <w:sz w:val="17"/>
+              </w:rPr>
+              <w:t>bo</w:t>
+            </w:r>
+          </w:p>
+        </w:tc>
+        <w:tc>
+          <w:tcPr>
+            <w:tcW w:type="dxa" w:w="2760"/>
+            <w:vAlign w:val="center"/>
+          </w:tcPr>
+          <w:p>
+            <w:pPr>
+              <w:spacing w:before="0" w:after="0" w:line="269" w:lineRule="auto"/>
+            </w:pPr>
+            <w:r>
+              <w:rPr>
+                <w:rFonts w:ascii="Calibri" w:hAnsi="Calibri"/>
+                <w:b w:val="0"/>
+                <w:color w:val="17242E"/>
+                <w:sz w:val="17"/>
+              </w:rPr>
+              <w:t>Board operation</w:t>
+            </w:r>
+          </w:p>
+        </w:tc>
+        <w:tc>
+          <w:tcPr>
+            <w:tcW w:type="dxa" w:w="5500"/>
+            <w:vAlign w:val="center"/>
+          </w:tcPr>
+          <w:p>
+            <w:pPr>
+              <w:spacing w:before="0" w:after="0" w:line="269" w:lineRule="auto"/>
+            </w:pPr>
+            <w:r>
+              <w:rPr>
+                <w:rFonts w:ascii="Calibri" w:hAnsi="Calibri"/>
+                <w:b w:val="0"/>
+                <w:color w:val="17242E"/>
+                <w:sz w:val="17"/>
+              </w:rPr>
+              <w:t>Carries one protected immutable action</w:t>
+            </w:r>
+          </w:p>
+        </w:tc>
+      </w:tr>
+      <w:tr>
+        <w:tc>
+          <w:tcPr>
+            <w:tcW w:type="dxa" w:w="1100"/>
+            <w:vAlign w:val="center"/>
+          </w:tcPr>
+          <w:p>
+            <w:pPr>
+              <w:spacing w:before="0" w:after="0" w:line="269" w:lineRule="auto"/>
+            </w:pPr>
+            <w:r>
+              <w:rPr>
+                <w:rFonts w:ascii="Calibri" w:hAnsi="Calibri"/>
+                <w:b w:val="0"/>
+                <w:color w:val="17242E"/>
+                <w:sz w:val="17"/>
+              </w:rPr>
+              <w:t>ba</w:t>
+            </w:r>
+          </w:p>
+        </w:tc>
+        <w:tc>
+          <w:tcPr>
+            <w:tcW w:type="dxa" w:w="2760"/>
+            <w:vAlign w:val="center"/>
+          </w:tcPr>
+          <w:p>
+            <w:pPr>
+              <w:spacing w:before="0" w:after="0" w:line="269" w:lineRule="auto"/>
+            </w:pPr>
+            <w:r>
+              <w:rPr>
+                <w:rFonts w:ascii="Calibri" w:hAnsi="Calibri"/>
+                <w:b w:val="0"/>
+                <w:color w:val="17242E"/>
+                <w:sz w:val="17"/>
+              </w:rPr>
+              <w:t>Board acknowledgement</w:t>
+            </w:r>
+          </w:p>
+        </w:tc>
+        <w:tc>
+          <w:tcPr>
+            <w:tcW w:type="dxa" w:w="5500"/>
+            <w:vAlign w:val="center"/>
+          </w:tcPr>
+          <w:p>
+            <w:pPr>
+              <w:spacing w:before="0" w:after="0" w:line="269" w:lineRule="auto"/>
+            </w:pPr>
+            <w:r>
+              <w:rPr>
+                <w:rFonts w:ascii="Calibri" w:hAnsi="Calibri"/>
+                <w:b w:val="0"/>
+                <w:color w:val="17242E"/>
+                <w:sz w:val="17"/>
+              </w:rPr>
+              <w:t>Confirms the complete operation was verified and stored</w:t>
+            </w:r>
+          </w:p>
+        </w:tc>
+      </w:tr>
+      <w:tr>
+        <w:tc>
+          <w:tcPr>
+            <w:tcW w:type="dxa" w:w="1100"/>
+            <w:vAlign w:val="center"/>
+          </w:tcPr>
+          <w:p>
+            <w:pPr>
+              <w:spacing w:before="0" w:after="0" w:line="269" w:lineRule="auto"/>
+            </w:pPr>
+            <w:r>
+              <w:rPr>
+                <w:rFonts w:ascii="Calibri" w:hAnsi="Calibri"/>
+                <w:b w:val="0"/>
+                <w:color w:val="17242E"/>
+                <w:sz w:val="17"/>
+              </w:rPr>
+              <w:t>br</w:t>
+            </w:r>
+          </w:p>
+        </w:tc>
+        <w:tc>
+          <w:tcPr>
+            <w:tcW w:type="dxa" w:w="2760"/>
+            <w:vAlign w:val="center"/>
+          </w:tcPr>
+          <w:p>
+            <w:pPr>
+              <w:spacing w:before="0" w:after="0" w:line="269" w:lineRule="auto"/>
+            </w:pPr>
+            <w:r>
+              <w:rPr>
+                <w:rFonts w:ascii="Calibri" w:hAnsi="Calibri"/>
+                <w:b w:val="0"/>
+                <w:color w:val="17242E"/>
+                <w:sz w:val="17"/>
+              </w:rPr>
+              <w:t>Board rejection</w:t>
+            </w:r>
+          </w:p>
+        </w:tc>
+        <w:tc>
+          <w:tcPr>
+            <w:tcW w:type="dxa" w:w="5500"/>
+            <w:vAlign w:val="center"/>
+          </w:tcPr>
+          <w:p>
+            <w:pPr>
+              <w:spacing w:before="0" w:after="0" w:line="269" w:lineRule="auto"/>
+            </w:pPr>
+            <w:r>
+              <w:rPr>
+                <w:rFonts w:ascii="Calibri" w:hAnsi="Calibri"/>
+                <w:b w:val="0"/>
+                <w:color w:val="17242E"/>
+                <w:sz w:val="17"/>
+              </w:rPr>
+              <w:t>Reports Board full or an access problem</w:t>
+            </w:r>
+          </w:p>
+        </w:tc>
+      </w:tr>
+    </w:tbl>
+    <w:p>
+      <w:pPr>
+        <w:spacing w:after="0"/>
+      </w:pPr>
+    </w:p>
+    <w:p>
+      <w:pPr>
+        <w:spacing w:before="100" w:after="140"/>
+        <w:ind w:left="160" w:right="160"/>
+        <w:shd w:fill="EAF3F7"/>
+        <w:pBdr>
+          <w:left w:val="single" w:sz="18" w:space="7" w:color="2F6F83"/>
+        </w:pBdr>
+      </w:pPr>
+      <w:r>
+        <w:rPr>
+          <w:b/>
+        </w:rPr>
+        <w:t>Four-person Tremola rule</w:t>
+        <w:br/>
+      </w:r>
+      <w:r>
+        <w:t>The roster stores at most four distinct Tremola feed identities. Going offline does not free a place, and changing a display name does not use another place. Every accepted identity may edit every object.</w:t>
+      </w:r>
+    </w:p>
+    <w:p>
+      <w:pPr>
+        <w:pStyle w:val="TableSource"/>
+      </w:pPr>
+      <w:r>
+        <w:t xml:space="preserve">Repository: </w:t>
+      </w:r>
+      <w:hyperlink r:id="rId45" w:history="1">
+        <w:r>
+          <w:rPr>
+            <w:color w:val="0563C1"/>
+            <w:u w:val="single"/>
+          </w:rPr>
+          <w:t>Tremola version guide</w:t>
+        </w:r>
+      </w:hyperlink>
+      <w:r>
+        <w:t xml:space="preserve">  |  </w:t>
+      </w:r>
+      <w:hyperlink r:id="rId23" w:history="1">
+        <w:r>
+          <w:rPr>
+            <w:color w:val="0563C1"/>
+            <w:u w:val="single"/>
+          </w:rPr>
+          <w:t>BoardProtocol.kt</w:t>
+        </w:r>
+      </w:hyperlink>
+      <w:r>
+        <w:t xml:space="preserve">  |  </w:t>
+      </w:r>
+      <w:hyperlink r:id="rId24" w:history="1">
+        <w:r>
+          <w:rPr>
+            <w:color w:val="0563C1"/>
+            <w:u w:val="single"/>
+          </w:rPr>
+          <w:t>BleSync.kt</w:t>
+        </w:r>
+      </w:hyperlink>
+    </w:p>
+    <w:p>
+      <w:pPr>
+        <w:pStyle w:val="Heading1"/>
+      </w:pPr>
+      <w:r>
+        <w:t>13. tinySSB Invitations and Synchronization</w:t>
+      </w:r>
+    </w:p>
+    <w:p>
+      <w:pPr>
+        <w:spacing w:before="100" w:after="140"/>
+        <w:ind w:left="160" w:right="160"/>
+        <w:shd w:fill="EAF3F7"/>
+        <w:pBdr>
+          <w:left w:val="single" w:sz="18" w:space="7" w:color="2F6F83"/>
+        </w:pBdr>
+      </w:pPr>
+      <w:r>
+        <w:rPr>
+          <w:b/>
+        </w:rPr>
+        <w:t>Do not confuse the two limits</w:t>
+        <w:br/>
+      </w:r>
+      <w:r>
+        <w:t>The creator may send invitations to eight different verified contacts. The board still has only four editors: the creator plus the first three valid acceptances. Eight is invitation capacity, not board capacity.</w:t>
+      </w:r>
+    </w:p>
+    <w:p>
+      <w:pPr>
+        <w:pStyle w:val="Heading2"/>
+      </w:pPr>
+      <w:r>
+        <w:t>Invitation and editor selection</w:t>
+      </w:r>
+    </w:p>
+    <w:p>
+      <w:pPr>
+        <w:numPr>
+          <w:ilvl w:val="0"/>
+          <w:numId w:val="20"/>
+        </w:numPr>
+      </w:pPr>
+      <w:r>
+        <w:t>People first add and verify each other in tinySSB Contacts.</w:t>
+      </w:r>
+    </w:p>
+    <w:p>
+      <w:pPr>
+        <w:numPr>
+          <w:ilvl w:val="0"/>
+          <w:numId w:val="20"/>
+        </w:numPr>
+      </w:pPr>
+      <w:r>
+        <w:t>The creator makes a board with a random room ID and a six-digit display code.</w:t>
+      </w:r>
+    </w:p>
+    <w:p>
+      <w:pPr>
+        <w:numPr>
+          <w:ilvl w:val="0"/>
+          <w:numId w:val="20"/>
+        </w:numPr>
+      </w:pPr>
+      <w:r>
+        <w:t>A signed wc event announces the board and identifies the creator.</w:t>
+      </w:r>
+    </w:p>
+    <w:p>
+      <w:pPr>
+        <w:numPr>
+          <w:ilvl w:val="0"/>
+          <w:numId w:val="20"/>
+        </w:numPr>
+      </w:pPr>
+      <w:r>
+        <w:t>From the open board, the creator taps + and selects a verified contact.</w:t>
+      </w:r>
+    </w:p>
+    <w:p>
+      <w:pPr>
+        <w:numPr>
+          <w:ilvl w:val="0"/>
+          <w:numId w:val="20"/>
+        </w:numPr>
+      </w:pPr>
+      <w:r>
+        <w:t>A signed wi event addresses that contact's feed ID. One creator may target eight different contacts.</w:t>
+      </w:r>
+    </w:p>
+    <w:p>
+      <w:pPr>
+        <w:numPr>
+          <w:ilvl w:val="0"/>
+          <w:numId w:val="20"/>
+        </w:numPr>
+      </w:pPr>
+      <w:r>
+        <w:t>The receiver sees the signed invitation and answers with wa for Accept or wd for Decline.</w:t>
+      </w:r>
+    </w:p>
+    <w:p>
+      <w:pPr>
+        <w:numPr>
+          <w:ilvl w:val="0"/>
+          <w:numId w:val="20"/>
+        </w:numPr>
+      </w:pPr>
+      <w:r>
+        <w:t>The app sorts valid acceptance events deterministically. Creator plus the first three accepted feed IDs become editors.</w:t>
+      </w:r>
+    </w:p>
+    <w:p>
+      <w:pPr>
+        <w:numPr>
+          <w:ilvl w:val="0"/>
+          <w:numId w:val="20"/>
+        </w:numPr>
+      </w:pPr>
+      <w:r>
+        <w:t>A later acceptance is shown as Board full and its author cannot change the board.</w:t>
+      </w:r>
+    </w:p>
+    <w:p>
+      <w:pPr>
+        <w:numPr>
+          <w:ilvl w:val="0"/>
+          <w:numId w:val="20"/>
+        </w:numPr>
+      </w:pPr>
+      <w:r>
+        <w:t>A wp profile event may update the display label without changing the signed feed identity.</w:t>
+      </w:r>
+    </w:p>
+    <w:p>
+      <w:pPr>
+        <w:numPr>
+          <w:ilvl w:val="0"/>
+          <w:numId w:val="20"/>
+        </w:numPr>
+      </w:pPr>
+      <w:r>
+        <w:t>The six-digit code can select an invitation already present on a phone, but it cannot discover a board by itself.</w:t>
+      </w:r>
+    </w:p>
+    <w:tbl>
+      <w:tblPr>
+        <w:tblW w:type="dxa" w:w="9360"/>
+        <w:tblLayout w:type="fixed"/>
+        <w:tblLook w:firstColumn="1" w:firstRow="1" w:lastColumn="0" w:lastRow="0" w:noHBand="0" w:noVBand="1" w:val="04A0"/>
+        <w:tblInd w:w="120" w:type="dxa"/>
+        <w:tblCellMar>
+          <w:top w:w="80" w:type="dxa"/>
+          <w:start w:w="120" w:type="dxa"/>
+          <w:bottom w:w="80" w:type="dxa"/>
+          <w:end w:w="120" w:type="dxa"/>
+        </w:tblCellMar>
+        <w:tblBorders>
+          <w:top w:val="single" w:sz="4" w:space="0" w:color="D5DDE5"/>
+          <w:left w:val="single" w:sz="4" w:space="0" w:color="D5DDE5"/>
+          <w:bottom w:val="single" w:sz="4" w:space="0" w:color="D5DDE5"/>
+          <w:right w:val="single" w:sz="4" w:space="0" w:color="D5DDE5"/>
+          <w:insideH w:val="single" w:sz="4" w:space="0" w:color="D5DDE5"/>
+          <w:insideV w:val="single" w:sz="4" w:space="0" w:color="D5DDE5"/>
+        </w:tblBorders>
+      </w:tblPr>
+      <w:tblGrid>
+        <w:gridCol w:w="1400"/>
+        <w:gridCol w:w="4900"/>
+        <w:gridCol w:w="3060"/>
+      </w:tblGrid>
+      <w:tr>
+        <w:trPr>
+          <w:tblHeader w:val="true"/>
+        </w:trPr>
+        <w:tc>
+          <w:tcPr>
+            <w:tcW w:type="dxa" w:w="1400"/>
+            <w:vAlign w:val="center"/>
+            <w:shd w:fill="E8EEF5"/>
+          </w:tcPr>
+          <w:p>
+            <w:pPr>
+              <w:spacing w:before="0" w:after="0" w:line="269" w:lineRule="auto"/>
+            </w:pPr>
+            <w:r>
+              <w:rPr>
+                <w:rFonts w:ascii="Calibri" w:hAnsi="Calibri"/>
+                <w:b/>
+                <w:color w:val="1F4D78"/>
+                <w:sz w:val="17"/>
+              </w:rPr>
+              <w:t>Meta event</w:t>
+            </w:r>
+          </w:p>
+        </w:tc>
+        <w:tc>
+          <w:tcPr>
+            <w:tcW w:type="dxa" w:w="4900"/>
+            <w:vAlign w:val="center"/>
+            <w:shd w:fill="E8EEF5"/>
+          </w:tcPr>
+          <w:p>
+            <w:pPr>
+              <w:spacing w:before="0" w:after="0" w:line="269" w:lineRule="auto"/>
+            </w:pPr>
+            <w:r>
+              <w:rPr>
+                <w:rFonts w:ascii="Calibri" w:hAnsi="Calibri"/>
+                <w:b/>
+                <w:color w:val="1F4D78"/>
+                <w:sz w:val="17"/>
+              </w:rPr>
+              <w:t>Meaning</w:t>
+            </w:r>
+          </w:p>
+        </w:tc>
+        <w:tc>
+          <w:tcPr>
+            <w:tcW w:type="dxa" w:w="3060"/>
+            <w:vAlign w:val="center"/>
+            <w:shd w:fill="E8EEF5"/>
+          </w:tcPr>
+          <w:p>
+            <w:pPr>
+              <w:spacing w:before="0" w:after="0" w:line="269" w:lineRule="auto"/>
+            </w:pPr>
+            <w:r>
+              <w:rPr>
+                <w:rFonts w:ascii="Calibri" w:hAnsi="Calibri"/>
+                <w:b/>
+                <w:color w:val="1F4D78"/>
+                <w:sz w:val="17"/>
+              </w:rPr>
+              <w:t>Who creates it</w:t>
+            </w:r>
+          </w:p>
+        </w:tc>
+      </w:tr>
+      <w:tr>
+        <w:tc>
+          <w:tcPr>
+            <w:tcW w:type="dxa" w:w="1400"/>
+            <w:vAlign w:val="center"/>
+          </w:tcPr>
+          <w:p>
+            <w:pPr>
+              <w:spacing w:before="0" w:after="0" w:line="269" w:lineRule="auto"/>
+            </w:pPr>
+            <w:r>
+              <w:rPr>
+                <w:rFonts w:ascii="Calibri" w:hAnsi="Calibri"/>
+                <w:b w:val="0"/>
+                <w:color w:val="17242E"/>
+                <w:sz w:val="17"/>
+              </w:rPr>
+              <w:t>wc</w:t>
+            </w:r>
+          </w:p>
+        </w:tc>
+        <w:tc>
+          <w:tcPr>
+            <w:tcW w:type="dxa" w:w="4900"/>
+            <w:vAlign w:val="center"/>
+          </w:tcPr>
+          <w:p>
+            <w:pPr>
+              <w:spacing w:before="0" w:after="0" w:line="269" w:lineRule="auto"/>
+            </w:pPr>
+            <w:r>
+              <w:rPr>
+                <w:rFonts w:ascii="Calibri" w:hAnsi="Calibri"/>
+                <w:b w:val="0"/>
+                <w:color w:val="17242E"/>
+                <w:sz w:val="17"/>
+              </w:rPr>
+              <w:t>Create board and publish random room ID</w:t>
+            </w:r>
+          </w:p>
+        </w:tc>
+        <w:tc>
+          <w:tcPr>
+            <w:tcW w:type="dxa" w:w="3060"/>
+            <w:vAlign w:val="center"/>
+          </w:tcPr>
+          <w:p>
+            <w:pPr>
+              <w:spacing w:before="0" w:after="0" w:line="269" w:lineRule="auto"/>
+            </w:pPr>
+            <w:r>
+              <w:rPr>
+                <w:rFonts w:ascii="Calibri" w:hAnsi="Calibri"/>
+                <w:b w:val="0"/>
+                <w:color w:val="17242E"/>
+                <w:sz w:val="17"/>
+              </w:rPr>
+              <w:t>Creator</w:t>
+            </w:r>
+          </w:p>
+        </w:tc>
+      </w:tr>
+      <w:tr>
+        <w:tc>
+          <w:tcPr>
+            <w:tcW w:type="dxa" w:w="1400"/>
+            <w:vAlign w:val="center"/>
+          </w:tcPr>
+          <w:p>
+            <w:pPr>
+              <w:spacing w:before="0" w:after="0" w:line="269" w:lineRule="auto"/>
+            </w:pPr>
+            <w:r>
+              <w:rPr>
+                <w:rFonts w:ascii="Calibri" w:hAnsi="Calibri"/>
+                <w:b w:val="0"/>
+                <w:color w:val="17242E"/>
+                <w:sz w:val="17"/>
+              </w:rPr>
+              <w:t>wi</w:t>
+            </w:r>
+          </w:p>
+        </w:tc>
+        <w:tc>
+          <w:tcPr>
+            <w:tcW w:type="dxa" w:w="4900"/>
+            <w:vAlign w:val="center"/>
+          </w:tcPr>
+          <w:p>
+            <w:pPr>
+              <w:spacing w:before="0" w:after="0" w:line="269" w:lineRule="auto"/>
+            </w:pPr>
+            <w:r>
+              <w:rPr>
+                <w:rFonts w:ascii="Calibri" w:hAnsi="Calibri"/>
+                <w:b w:val="0"/>
+                <w:color w:val="17242E"/>
+                <w:sz w:val="17"/>
+              </w:rPr>
+              <w:t>Invite one verified contact feed ID</w:t>
+            </w:r>
+          </w:p>
+        </w:tc>
+        <w:tc>
+          <w:tcPr>
+            <w:tcW w:type="dxa" w:w="3060"/>
+            <w:vAlign w:val="center"/>
+          </w:tcPr>
+          <w:p>
+            <w:pPr>
+              <w:spacing w:before="0" w:after="0" w:line="269" w:lineRule="auto"/>
+            </w:pPr>
+            <w:r>
+              <w:rPr>
+                <w:rFonts w:ascii="Calibri" w:hAnsi="Calibri"/>
+                <w:b w:val="0"/>
+                <w:color w:val="17242E"/>
+                <w:sz w:val="17"/>
+              </w:rPr>
+              <w:t>Creator</w:t>
+            </w:r>
+          </w:p>
+        </w:tc>
+      </w:tr>
+      <w:tr>
+        <w:tc>
+          <w:tcPr>
+            <w:tcW w:type="dxa" w:w="1400"/>
+            <w:vAlign w:val="center"/>
+          </w:tcPr>
+          <w:p>
+            <w:pPr>
+              <w:spacing w:before="0" w:after="0" w:line="269" w:lineRule="auto"/>
+            </w:pPr>
+            <w:r>
+              <w:rPr>
+                <w:rFonts w:ascii="Calibri" w:hAnsi="Calibri"/>
+                <w:b w:val="0"/>
+                <w:color w:val="17242E"/>
+                <w:sz w:val="17"/>
+              </w:rPr>
+              <w:t>wa</w:t>
+            </w:r>
+          </w:p>
+        </w:tc>
+        <w:tc>
+          <w:tcPr>
+            <w:tcW w:type="dxa" w:w="4900"/>
+            <w:vAlign w:val="center"/>
+          </w:tcPr>
+          <w:p>
+            <w:pPr>
+              <w:spacing w:before="0" w:after="0" w:line="269" w:lineRule="auto"/>
+            </w:pPr>
+            <w:r>
+              <w:rPr>
+                <w:rFonts w:ascii="Calibri" w:hAnsi="Calibri"/>
+                <w:b w:val="0"/>
+                <w:color w:val="17242E"/>
+                <w:sz w:val="17"/>
+              </w:rPr>
+              <w:t>Accept a named invitation</w:t>
+            </w:r>
+          </w:p>
+        </w:tc>
+        <w:tc>
+          <w:tcPr>
+            <w:tcW w:type="dxa" w:w="3060"/>
+            <w:vAlign w:val="center"/>
+          </w:tcPr>
+          <w:p>
+            <w:pPr>
+              <w:spacing w:before="0" w:after="0" w:line="269" w:lineRule="auto"/>
+            </w:pPr>
+            <w:r>
+              <w:rPr>
+                <w:rFonts w:ascii="Calibri" w:hAnsi="Calibri"/>
+                <w:b w:val="0"/>
+                <w:color w:val="17242E"/>
+                <w:sz w:val="17"/>
+              </w:rPr>
+              <w:t>Invited contact</w:t>
+            </w:r>
+          </w:p>
+        </w:tc>
+      </w:tr>
+      <w:tr>
+        <w:tc>
+          <w:tcPr>
+            <w:tcW w:type="dxa" w:w="1400"/>
+            <w:vAlign w:val="center"/>
+          </w:tcPr>
+          <w:p>
+            <w:pPr>
+              <w:spacing w:before="0" w:after="0" w:line="269" w:lineRule="auto"/>
+            </w:pPr>
+            <w:r>
+              <w:rPr>
+                <w:rFonts w:ascii="Calibri" w:hAnsi="Calibri"/>
+                <w:b w:val="0"/>
+                <w:color w:val="17242E"/>
+                <w:sz w:val="17"/>
+              </w:rPr>
+              <w:t>wd</w:t>
+            </w:r>
+          </w:p>
+        </w:tc>
+        <w:tc>
+          <w:tcPr>
+            <w:tcW w:type="dxa" w:w="4900"/>
+            <w:vAlign w:val="center"/>
+          </w:tcPr>
+          <w:p>
+            <w:pPr>
+              <w:spacing w:before="0" w:after="0" w:line="269" w:lineRule="auto"/>
+            </w:pPr>
+            <w:r>
+              <w:rPr>
+                <w:rFonts w:ascii="Calibri" w:hAnsi="Calibri"/>
+                <w:b w:val="0"/>
+                <w:color w:val="17242E"/>
+                <w:sz w:val="17"/>
+              </w:rPr>
+              <w:t>Decline a named invitation</w:t>
+            </w:r>
+          </w:p>
+        </w:tc>
+        <w:tc>
+          <w:tcPr>
+            <w:tcW w:type="dxa" w:w="3060"/>
+            <w:vAlign w:val="center"/>
+          </w:tcPr>
+          <w:p>
+            <w:pPr>
+              <w:spacing w:before="0" w:after="0" w:line="269" w:lineRule="auto"/>
+            </w:pPr>
+            <w:r>
+              <w:rPr>
+                <w:rFonts w:ascii="Calibri" w:hAnsi="Calibri"/>
+                <w:b w:val="0"/>
+                <w:color w:val="17242E"/>
+                <w:sz w:val="17"/>
+              </w:rPr>
+              <w:t>Invited contact</w:t>
+            </w:r>
+          </w:p>
+        </w:tc>
+      </w:tr>
+      <w:tr>
+        <w:tc>
+          <w:tcPr>
+            <w:tcW w:type="dxa" w:w="1400"/>
+            <w:vAlign w:val="center"/>
+          </w:tcPr>
+          <w:p>
+            <w:pPr>
+              <w:spacing w:before="0" w:after="0" w:line="269" w:lineRule="auto"/>
+            </w:pPr>
+            <w:r>
+              <w:rPr>
+                <w:rFonts w:ascii="Calibri" w:hAnsi="Calibri"/>
+                <w:b w:val="0"/>
+                <w:color w:val="17242E"/>
+                <w:sz w:val="17"/>
+              </w:rPr>
+              <w:t>wp</w:t>
+            </w:r>
+          </w:p>
+        </w:tc>
+        <w:tc>
+          <w:tcPr>
+            <w:tcW w:type="dxa" w:w="4900"/>
+            <w:vAlign w:val="center"/>
+          </w:tcPr>
+          <w:p>
+            <w:pPr>
+              <w:spacing w:before="0" w:after="0" w:line="269" w:lineRule="auto"/>
+            </w:pPr>
+            <w:r>
+              <w:rPr>
+                <w:rFonts w:ascii="Calibri" w:hAnsi="Calibri"/>
+                <w:b w:val="0"/>
+                <w:color w:val="17242E"/>
+                <w:sz w:val="17"/>
+              </w:rPr>
+              <w:t>Update a member display label</w:t>
+            </w:r>
+          </w:p>
+        </w:tc>
+        <w:tc>
+          <w:tcPr>
+            <w:tcW w:type="dxa" w:w="3060"/>
+            <w:vAlign w:val="center"/>
+          </w:tcPr>
+          <w:p>
+            <w:pPr>
+              <w:spacing w:before="0" w:after="0" w:line="269" w:lineRule="auto"/>
+            </w:pPr>
+            <w:r>
+              <w:rPr>
+                <w:rFonts w:ascii="Calibri" w:hAnsi="Calibri"/>
+                <w:b w:val="0"/>
+                <w:color w:val="17242E"/>
+                <w:sz w:val="17"/>
+              </w:rPr>
+              <w:t>Accepted member</w:t>
+            </w:r>
+          </w:p>
+        </w:tc>
+      </w:tr>
+    </w:tbl>
+    <w:p>
+      <w:pPr>
+        <w:spacing w:after="0"/>
+      </w:pPr>
+    </w:p>
+    <w:p>
+      <w:pPr>
+        <w:pStyle w:val="Heading2"/>
+      </w:pPr>
+      <w:r>
+        <w:t>tinySSB transport</w:t>
+      </w:r>
+    </w:p>
+    <w:p>
+      <w:pPr>
+        <w:numPr>
+          <w:ilvl w:val="0"/>
+          <w:numId w:val="21"/>
+        </w:numPr>
+      </w:pPr>
+      <w:r>
+        <w:t>The shared whiteboard creates the same s, t, m, k, d, c, and n events as Tremola.</w:t>
+      </w:r>
+    </w:p>
+    <w:p>
+      <w:pPr>
+        <w:numPr>
+          <w:ilvl w:val="0"/>
+          <w:numId w:val="21"/>
+        </w:numPr>
+      </w:pPr>
+      <w:r>
+        <w:t>The adapter publishes each event as a public WBD entry in the author's signed append-only tinySSB feed.</w:t>
+      </w:r>
+    </w:p>
+    <w:p>
+      <w:pPr>
+        <w:numPr>
+          <w:ilvl w:val="0"/>
+          <w:numId w:val="21"/>
+        </w:numPr>
+      </w:pPr>
+      <w:r>
+        <w:t>The official tinySSB host divides feed data into compact packets and linked chunks.</w:t>
+      </w:r>
+    </w:p>
+    <w:p>
+      <w:pPr>
+        <w:numPr>
+          <w:ilvl w:val="0"/>
+          <w:numId w:val="21"/>
+        </w:numPr>
+      </w:pPr>
+      <w:r>
+        <w:t>BLE peers compare feed state and request missing packets or chunks.</w:t>
+      </w:r>
+    </w:p>
+    <w:p>
+      <w:pPr>
+        <w:numPr>
+          <w:ilvl w:val="0"/>
+          <w:numId w:val="21"/>
+        </w:numPr>
+      </w:pPr>
+      <w:r>
+        <w:t>The adapter receives an event only after the complete signed feed entry is reconstructed.</w:t>
+      </w:r>
+    </w:p>
+    <w:p>
+      <w:pPr>
+        <w:numPr>
+          <w:ilvl w:val="0"/>
+          <w:numId w:val="21"/>
+        </w:numPr>
+      </w:pPr>
+      <w:r>
+        <w:t>It checks that the author belongs to the deterministic four-editor list, stores the event, and applies the shared reducer.</w:t>
+      </w:r>
+    </w:p>
+    <w:p>
+      <w:pPr>
+        <w:spacing w:before="100" w:after="140"/>
+        <w:ind w:left="160" w:right="160"/>
+        <w:shd w:fill="EAF3F7"/>
+        <w:pBdr>
+          <w:left w:val="single" w:sz="18" w:space="7" w:color="2F6F83"/>
+        </w:pBdr>
+      </w:pPr>
+      <w:r>
+        <w:rPr>
+          <w:b/>
+        </w:rPr>
+        <w:t>Privacy and compatibility</w:t>
+        <w:br/>
+      </w:r>
+      <w:r>
+        <w:t>Verified-contact invitations restrict the whiteboard UI, but WBD feed events are public and not encrypted. A tinySSB board cannot synchronize with a Tremola board because the hosts and log formats are different.</w:t>
+      </w:r>
+    </w:p>
+    <w:p>
+      <w:pPr>
+        <w:pStyle w:val="TableSource"/>
+      </w:pPr>
+      <w:r>
+        <w:t xml:space="preserve">Repository: </w:t>
+      </w:r>
+      <w:hyperlink r:id="rId46" w:history="1">
+        <w:r>
+          <w:rPr>
+            <w:color w:val="0563C1"/>
+            <w:u w:val="single"/>
+          </w:rPr>
+          <w:t>tinySSB version guide</w:t>
+        </w:r>
+      </w:hyperlink>
+      <w:r>
+        <w:t xml:space="preserve">  |  </w:t>
+      </w:r>
+      <w:hyperlink r:id="rId21" w:history="1">
+        <w:r>
+          <w:rPr>
+            <w:color w:val="0563C1"/>
+            <w:u w:val="single"/>
+          </w:rPr>
+          <w:t>tinySSB adapter</w:t>
+        </w:r>
+      </w:hyperlink>
+      <w:r>
+        <w:t xml:space="preserve">  |  </w:t>
+      </w:r>
+      <w:hyperlink r:id="rId33" w:history="1">
+        <w:r>
+          <w:rPr>
+            <w:color w:val="0563C1"/>
+            <w:u w:val="single"/>
+          </w:rPr>
+          <w:t>Reproducible build</w:t>
+        </w:r>
+      </w:hyperlink>
+    </w:p>
+    <w:p>
+      <w:pPr>
+        <w:pStyle w:val="Heading1"/>
+      </w:pPr>
+      <w:r>
+        <w:t>14. Merge Examples and Repository Integration</w:t>
+      </w:r>
+    </w:p>
+    <w:p>
+      <w:pPr>
+        <w:pStyle w:val="Heading2"/>
+      </w:pPr>
+      <w:r>
+        <w:t>How the same event set becomes the same canvas</w:t>
+      </w:r>
+    </w:p>
+    <w:tbl>
+      <w:tblPr>
+        <w:tblW w:type="dxa" w:w="9360"/>
+        <w:tblLayout w:type="fixed"/>
+        <w:tblLook w:firstColumn="1" w:firstRow="1" w:lastColumn="0" w:lastRow="0" w:noHBand="0" w:noVBand="1" w:val="04A0"/>
+        <w:tblInd w:w="120" w:type="dxa"/>
+        <w:tblCellMar>
+          <w:top w:w="80" w:type="dxa"/>
+          <w:start w:w="120" w:type="dxa"/>
+          <w:bottom w:w="80" w:type="dxa"/>
+          <w:end w:w="120" w:type="dxa"/>
+        </w:tblCellMar>
+        <w:tblBorders>
+          <w:top w:val="single" w:sz="4" w:space="0" w:color="D5DDE5"/>
+          <w:left w:val="single" w:sz="4" w:space="0" w:color="D5DDE5"/>
+          <w:bottom w:val="single" w:sz="4" w:space="0" w:color="D5DDE5"/>
+          <w:right w:val="single" w:sz="4" w:space="0" w:color="D5DDE5"/>
+          <w:insideH w:val="single" w:sz="4" w:space="0" w:color="D5DDE5"/>
+          <w:insideV w:val="single" w:sz="4" w:space="0" w:color="D5DDE5"/>
+        </w:tblBorders>
+      </w:tblPr>
+      <w:tblGrid>
+        <w:gridCol w:w="2400"/>
+        <w:gridCol w:w="4100"/>
+        <w:gridCol w:w="2860"/>
+      </w:tblGrid>
+      <w:tr>
+        <w:trPr>
+          <w:tblHeader w:val="true"/>
+        </w:trPr>
+        <w:tc>
+          <w:tcPr>
+            <w:tcW w:type="dxa" w:w="2400"/>
+            <w:vAlign w:val="center"/>
+            <w:shd w:fill="E8EEF5"/>
+          </w:tcPr>
+          <w:p>
+            <w:pPr>
+              <w:spacing w:before="0" w:after="0" w:line="269" w:lineRule="auto"/>
+            </w:pPr>
+            <w:r>
+              <w:rPr>
+                <w:rFonts w:ascii="Calibri" w:hAnsi="Calibri"/>
+                <w:b/>
+                <w:color w:val="1F4D78"/>
+                <w:sz w:val="17"/>
+              </w:rPr>
+              <w:t>Situation</w:t>
+            </w:r>
+          </w:p>
+        </w:tc>
+        <w:tc>
+          <w:tcPr>
+            <w:tcW w:type="dxa" w:w="4100"/>
+            <w:vAlign w:val="center"/>
+            <w:shd w:fill="E8EEF5"/>
+          </w:tcPr>
+          <w:p>
+            <w:pPr>
+              <w:spacing w:before="0" w:after="0" w:line="269" w:lineRule="auto"/>
+            </w:pPr>
+            <w:r>
+              <w:rPr>
+                <w:rFonts w:ascii="Calibri" w:hAnsi="Calibri"/>
+                <w:b/>
+                <w:color w:val="1F4D78"/>
+                <w:sz w:val="17"/>
+              </w:rPr>
+              <w:t>Deterministic rule</w:t>
+            </w:r>
+          </w:p>
+        </w:tc>
+        <w:tc>
+          <w:tcPr>
+            <w:tcW w:type="dxa" w:w="2860"/>
+            <w:vAlign w:val="center"/>
+            <w:shd w:fill="E8EEF5"/>
+          </w:tcPr>
+          <w:p>
+            <w:pPr>
+              <w:spacing w:before="0" w:after="0" w:line="269" w:lineRule="auto"/>
+            </w:pPr>
+            <w:r>
+              <w:rPr>
+                <w:rFonts w:ascii="Calibri" w:hAnsi="Calibri"/>
+                <w:b/>
+                <w:color w:val="1F4D78"/>
+                <w:sz w:val="17"/>
+              </w:rPr>
+              <w:t>Visible result</w:t>
+            </w:r>
+          </w:p>
+        </w:tc>
+      </w:tr>
+      <w:tr>
+        <w:tc>
+          <w:tcPr>
+            <w:tcW w:type="dxa" w:w="2400"/>
+            <w:vAlign w:val="center"/>
+          </w:tcPr>
+          <w:p>
+            <w:pPr>
+              <w:spacing w:before="0" w:after="0" w:line="269" w:lineRule="auto"/>
+            </w:pPr>
+            <w:r>
+              <w:rPr>
+                <w:rFonts w:ascii="Calibri" w:hAnsi="Calibri"/>
+                <w:b w:val="0"/>
+                <w:color w:val="17242E"/>
+                <w:sz w:val="17"/>
+              </w:rPr>
+              <w:t>Two people draw at once</w:t>
+            </w:r>
+          </w:p>
+        </w:tc>
+        <w:tc>
+          <w:tcPr>
+            <w:tcW w:type="dxa" w:w="4100"/>
+            <w:vAlign w:val="center"/>
+          </w:tcPr>
+          <w:p>
+            <w:pPr>
+              <w:spacing w:before="0" w:after="0" w:line="269" w:lineRule="auto"/>
+            </w:pPr>
+            <w:r>
+              <w:rPr>
+                <w:rFonts w:ascii="Calibri" w:hAnsi="Calibri"/>
+                <w:b w:val="0"/>
+                <w:color w:val="17242E"/>
+                <w:sz w:val="17"/>
+              </w:rPr>
+              <w:t>Different object IDs are both retained.</w:t>
+            </w:r>
+          </w:p>
+        </w:tc>
+        <w:tc>
+          <w:tcPr>
+            <w:tcW w:type="dxa" w:w="2860"/>
+            <w:vAlign w:val="center"/>
+          </w:tcPr>
+          <w:p>
+            <w:pPr>
+              <w:spacing w:before="0" w:after="0" w:line="269" w:lineRule="auto"/>
+            </w:pPr>
+            <w:r>
+              <w:rPr>
+                <w:rFonts w:ascii="Calibri" w:hAnsi="Calibri"/>
+                <w:b w:val="0"/>
+                <w:color w:val="17242E"/>
+                <w:sz w:val="17"/>
+              </w:rPr>
+              <w:t>Both strokes remain.</w:t>
+            </w:r>
+          </w:p>
+        </w:tc>
+      </w:tr>
+      <w:tr>
+        <w:tc>
+          <w:tcPr>
+            <w:tcW w:type="dxa" w:w="2400"/>
+            <w:vAlign w:val="center"/>
+          </w:tcPr>
+          <w:p>
+            <w:pPr>
+              <w:spacing w:before="0" w:after="0" w:line="269" w:lineRule="auto"/>
+            </w:pPr>
+            <w:r>
+              <w:rPr>
+                <w:rFonts w:ascii="Calibri" w:hAnsi="Calibri"/>
+                <w:b w:val="0"/>
+                <w:color w:val="17242E"/>
+                <w:sz w:val="17"/>
+              </w:rPr>
+              <w:t>One event arrives twice</w:t>
+            </w:r>
+          </w:p>
+        </w:tc>
+        <w:tc>
+          <w:tcPr>
+            <w:tcW w:type="dxa" w:w="4100"/>
+            <w:vAlign w:val="center"/>
+          </w:tcPr>
+          <w:p>
+            <w:pPr>
+              <w:spacing w:before="0" w:after="0" w:line="269" w:lineRule="auto"/>
+            </w:pPr>
+            <w:r>
+              <w:rPr>
+                <w:rFonts w:ascii="Calibri" w:hAnsi="Calibri"/>
+                <w:b w:val="0"/>
+                <w:color w:val="17242E"/>
+                <w:sz w:val="17"/>
+              </w:rPr>
+              <w:t>Seen ID and Room indexes reject duplicates.</w:t>
+            </w:r>
+          </w:p>
+        </w:tc>
+        <w:tc>
+          <w:tcPr>
+            <w:tcW w:type="dxa" w:w="2860"/>
+            <w:vAlign w:val="center"/>
+          </w:tcPr>
+          <w:p>
+            <w:pPr>
+              <w:spacing w:before="0" w:after="0" w:line="269" w:lineRule="auto"/>
+            </w:pPr>
+            <w:r>
+              <w:rPr>
+                <w:rFonts w:ascii="Calibri" w:hAnsi="Calibri"/>
+                <w:b w:val="0"/>
+                <w:color w:val="17242E"/>
+                <w:sz w:val="17"/>
+              </w:rPr>
+              <w:t>It appears once.</w:t>
+            </w:r>
+          </w:p>
+        </w:tc>
+      </w:tr>
+      <w:tr>
+        <w:tc>
+          <w:tcPr>
+            <w:tcW w:type="dxa" w:w="2400"/>
+            <w:vAlign w:val="center"/>
+          </w:tcPr>
+          <w:p>
+            <w:pPr>
+              <w:spacing w:before="0" w:after="0" w:line="269" w:lineRule="auto"/>
+            </w:pPr>
+            <w:r>
+              <w:rPr>
+                <w:rFonts w:ascii="Calibri" w:hAnsi="Calibri"/>
+                <w:b w:val="0"/>
+                <w:color w:val="17242E"/>
+                <w:sz w:val="17"/>
+              </w:rPr>
+              <w:t>Two people move one object</w:t>
+            </w:r>
+          </w:p>
+        </w:tc>
+        <w:tc>
+          <w:tcPr>
+            <w:tcW w:type="dxa" w:w="4100"/>
+            <w:vAlign w:val="center"/>
+          </w:tcPr>
+          <w:p>
+            <w:pPr>
+              <w:spacing w:before="0" w:after="0" w:line="269" w:lineRule="auto"/>
+            </w:pPr>
+            <w:r>
+              <w:rPr>
+                <w:rFonts w:ascii="Calibri" w:hAnsi="Calibri"/>
+                <w:b w:val="0"/>
+                <w:color w:val="17242E"/>
+                <w:sz w:val="17"/>
+              </w:rPr>
+              <w:t>Greater Lamport order wins; event ID breaks a tie.</w:t>
+            </w:r>
+          </w:p>
+        </w:tc>
+        <w:tc>
+          <w:tcPr>
+            <w:tcW w:type="dxa" w:w="2860"/>
+            <w:vAlign w:val="center"/>
+          </w:tcPr>
+          <w:p>
+            <w:pPr>
+              <w:spacing w:before="0" w:after="0" w:line="269" w:lineRule="auto"/>
+            </w:pPr>
+            <w:r>
+              <w:rPr>
+                <w:rFonts w:ascii="Calibri" w:hAnsi="Calibri"/>
+                <w:b w:val="0"/>
+                <w:color w:val="17242E"/>
+                <w:sz w:val="17"/>
+              </w:rPr>
+              <w:t>Both phones select the same final transform.</w:t>
+            </w:r>
+          </w:p>
+        </w:tc>
+      </w:tr>
+      <w:tr>
+        <w:tc>
+          <w:tcPr>
+            <w:tcW w:type="dxa" w:w="2400"/>
+            <w:vAlign w:val="center"/>
+          </w:tcPr>
+          <w:p>
+            <w:pPr>
+              <w:spacing w:before="0" w:after="0" w:line="269" w:lineRule="auto"/>
+            </w:pPr>
+            <w:r>
+              <w:rPr>
+                <w:rFonts w:ascii="Calibri" w:hAnsi="Calibri"/>
+                <w:b w:val="0"/>
+                <w:color w:val="17242E"/>
+                <w:sz w:val="17"/>
+              </w:rPr>
+              <w:t>Move arrives before stroke</w:t>
+            </w:r>
+          </w:p>
+        </w:tc>
+        <w:tc>
+          <w:tcPr>
+            <w:tcW w:type="dxa" w:w="4100"/>
+            <w:vAlign w:val="center"/>
+          </w:tcPr>
+          <w:p>
+            <w:pPr>
+              <w:spacing w:before="0" w:after="0" w:line="269" w:lineRule="auto"/>
+            </w:pPr>
+            <w:r>
+              <w:rPr>
+                <w:rFonts w:ascii="Calibri" w:hAnsi="Calibri"/>
+                <w:b w:val="0"/>
+                <w:color w:val="17242E"/>
+                <w:sz w:val="17"/>
+              </w:rPr>
+              <w:t>Transform remains stored by target ID.</w:t>
+            </w:r>
+          </w:p>
+        </w:tc>
+        <w:tc>
+          <w:tcPr>
+            <w:tcW w:type="dxa" w:w="2860"/>
+            <w:vAlign w:val="center"/>
+          </w:tcPr>
+          <w:p>
+            <w:pPr>
+              <w:spacing w:before="0" w:after="0" w:line="269" w:lineRule="auto"/>
+            </w:pPr>
+            <w:r>
+              <w:rPr>
+                <w:rFonts w:ascii="Calibri" w:hAnsi="Calibri"/>
+                <w:b w:val="0"/>
+                <w:color w:val="17242E"/>
+                <w:sz w:val="17"/>
+              </w:rPr>
+              <w:t>It appears after the stroke is recovered.</w:t>
+            </w:r>
+          </w:p>
+        </w:tc>
+      </w:tr>
+      <w:tr>
+        <w:tc>
+          <w:tcPr>
+            <w:tcW w:type="dxa" w:w="2400"/>
+            <w:vAlign w:val="center"/>
+          </w:tcPr>
+          <w:p>
+            <w:pPr>
+              <w:spacing w:before="0" w:after="0" w:line="269" w:lineRule="auto"/>
+            </w:pPr>
+            <w:r>
+              <w:rPr>
+                <w:rFonts w:ascii="Calibri" w:hAnsi="Calibri"/>
+                <w:b w:val="0"/>
+                <w:color w:val="17242E"/>
+                <w:sz w:val="17"/>
+              </w:rPr>
+              <w:t>Delete competes with an older object</w:t>
+            </w:r>
+          </w:p>
+        </w:tc>
+        <w:tc>
+          <w:tcPr>
+            <w:tcW w:type="dxa" w:w="4100"/>
+            <w:vAlign w:val="center"/>
+          </w:tcPr>
+          <w:p>
+            <w:pPr>
+              <w:spacing w:before="0" w:after="0" w:line="269" w:lineRule="auto"/>
+            </w:pPr>
+            <w:r>
+              <w:rPr>
+                <w:rFonts w:ascii="Calibri" w:hAnsi="Calibri"/>
+                <w:b w:val="0"/>
+                <w:color w:val="17242E"/>
+                <w:sz w:val="17"/>
+              </w:rPr>
+              <w:t>A later valid delete hides the target.</w:t>
+            </w:r>
+          </w:p>
+        </w:tc>
+        <w:tc>
+          <w:tcPr>
+            <w:tcW w:type="dxa" w:w="2860"/>
+            <w:vAlign w:val="center"/>
+          </w:tcPr>
+          <w:p>
+            <w:pPr>
+              <w:spacing w:before="0" w:after="0" w:line="269" w:lineRule="auto"/>
+            </w:pPr>
+            <w:r>
+              <w:rPr>
+                <w:rFonts w:ascii="Calibri" w:hAnsi="Calibri"/>
+                <w:b w:val="0"/>
+                <w:color w:val="17242E"/>
+                <w:sz w:val="17"/>
+              </w:rPr>
+              <w:t>The object is absent on every converged peer.</w:t>
+            </w:r>
+          </w:p>
+        </w:tc>
+      </w:tr>
+      <w:tr>
+        <w:tc>
+          <w:tcPr>
+            <w:tcW w:type="dxa" w:w="2400"/>
+            <w:vAlign w:val="center"/>
+          </w:tcPr>
+          <w:p>
+            <w:pPr>
+              <w:spacing w:before="0" w:after="0" w:line="269" w:lineRule="auto"/>
+            </w:pPr>
+            <w:r>
+              <w:rPr>
+                <w:rFonts w:ascii="Calibri" w:hAnsi="Calibri"/>
+                <w:b w:val="0"/>
+                <w:color w:val="17242E"/>
+                <w:sz w:val="17"/>
+              </w:rPr>
+              <w:t>Clear is received</w:t>
+            </w:r>
+          </w:p>
+        </w:tc>
+        <w:tc>
+          <w:tcPr>
+            <w:tcW w:type="dxa" w:w="4100"/>
+            <w:vAlign w:val="center"/>
+          </w:tcPr>
+          <w:p>
+            <w:pPr>
+              <w:spacing w:before="0" w:after="0" w:line="269" w:lineRule="auto"/>
+            </w:pPr>
+            <w:r>
+              <w:rPr>
+                <w:rFonts w:ascii="Calibri" w:hAnsi="Calibri"/>
+                <w:b w:val="0"/>
+                <w:color w:val="17242E"/>
+                <w:sz w:val="17"/>
+              </w:rPr>
+              <w:t>Latest clear hides objects ordered at or before it.</w:t>
+            </w:r>
+          </w:p>
+        </w:tc>
+        <w:tc>
+          <w:tcPr>
+            <w:tcW w:type="dxa" w:w="2860"/>
+            <w:vAlign w:val="center"/>
+          </w:tcPr>
+          <w:p>
+            <w:pPr>
+              <w:spacing w:before="0" w:after="0" w:line="269" w:lineRule="auto"/>
+            </w:pPr>
+            <w:r>
+              <w:rPr>
+                <w:rFonts w:ascii="Calibri" w:hAnsi="Calibri"/>
+                <w:b w:val="0"/>
+                <w:color w:val="17242E"/>
+                <w:sz w:val="17"/>
+              </w:rPr>
+              <w:t>Older work disappears; later work remains.</w:t>
+            </w:r>
+          </w:p>
+        </w:tc>
+      </w:tr>
+      <w:tr>
+        <w:tc>
+          <w:tcPr>
+            <w:tcW w:type="dxa" w:w="2400"/>
+            <w:vAlign w:val="center"/>
+          </w:tcPr>
+          <w:p>
+            <w:pPr>
+              <w:spacing w:before="0" w:after="0" w:line="269" w:lineRule="auto"/>
+            </w:pPr>
+            <w:r>
+              <w:rPr>
+                <w:rFonts w:ascii="Calibri" w:hAnsi="Calibri"/>
+                <w:b w:val="0"/>
+                <w:color w:val="17242E"/>
+                <w:sz w:val="17"/>
+              </w:rPr>
+              <w:t>Phones edit while disconnected</w:t>
+            </w:r>
+          </w:p>
+        </w:tc>
+        <w:tc>
+          <w:tcPr>
+            <w:tcW w:type="dxa" w:w="4100"/>
+            <w:vAlign w:val="center"/>
+          </w:tcPr>
+          <w:p>
+            <w:pPr>
+              <w:spacing w:before="0" w:after="0" w:line="269" w:lineRule="auto"/>
+            </w:pPr>
+            <w:r>
+              <w:rPr>
+                <w:rFonts w:ascii="Calibri" w:hAnsi="Calibri"/>
+                <w:b w:val="0"/>
+                <w:color w:val="17242E"/>
+                <w:sz w:val="17"/>
+              </w:rPr>
+              <w:t>Each saves locally; frontier/WANT later unions missing valid events.</w:t>
+            </w:r>
+          </w:p>
+        </w:tc>
+        <w:tc>
+          <w:tcPr>
+            <w:tcW w:type="dxa" w:w="2860"/>
+            <w:vAlign w:val="center"/>
+          </w:tcPr>
+          <w:p>
+            <w:pPr>
+              <w:spacing w:before="0" w:after="0" w:line="269" w:lineRule="auto"/>
+            </w:pPr>
+            <w:r>
+              <w:rPr>
+                <w:rFonts w:ascii="Calibri" w:hAnsi="Calibri"/>
+                <w:b w:val="0"/>
+                <w:color w:val="17242E"/>
+                <w:sz w:val="17"/>
+              </w:rPr>
+              <w:t>Boards converge after recovery.</w:t>
+            </w:r>
+          </w:p>
+        </w:tc>
+      </w:tr>
+    </w:tbl>
+    <w:p>
+      <w:pPr>
+        <w:spacing w:after="0"/>
+      </w:pPr>
+    </w:p>
+    <w:p>
+      <w:pPr>
+        <w:pStyle w:val="Heading2"/>
+      </w:pPr>
+      <w:r>
+        <w:t>What remains in the repository and why</w:t>
+      </w:r>
+    </w:p>
+    <w:p>
+      <w:pPr>
+        <w:numPr>
+          <w:ilvl w:val="0"/>
+          <w:numId w:val="10"/>
+        </w:numPr>
+      </w:pPr>
+      <w:r>
+        <w:t>The full app/ tree remains because the Tremola APK needs native Android identity, Room, BLE, permissions, lifecycle, and export code.</w:t>
+      </w:r>
+    </w:p>
+    <w:p>
+      <w:pPr>
+        <w:numPr>
+          <w:ilvl w:val="0"/>
+          <w:numId w:val="10"/>
+        </w:numPr>
+      </w:pPr>
+      <w:r>
+        <w:t>miniApps/collabboard remains the shared UI and reducer used by both variants.</w:t>
+      </w:r>
+    </w:p>
+    <w:p>
+      <w:pPr>
+        <w:numPr>
+          <w:ilvl w:val="0"/>
+          <w:numId w:val="10"/>
+        </w:numPr>
+      </w:pPr>
+      <w:r>
+        <w:t>The browser preview remains because it provides fast UI and deterministic merge tests; it is not an obsolete APK.</w:t>
+      </w:r>
+    </w:p>
+    <w:p>
+      <w:pPr>
+        <w:numPr>
+          <w:ilvl w:val="0"/>
+          <w:numId w:val="10"/>
+        </w:numPr>
+      </w:pPr>
+      <w:r>
+        <w:t>tinyssb/*.patch, its adapter, preparation script, and pinned build script remain because they are the reviewable integration layer for the official tinySSB host.</w:t>
+      </w:r>
+    </w:p>
+    <w:p>
+      <w:pPr>
+        <w:numPr>
+          <w:ilvl w:val="0"/>
+          <w:numId w:val="10"/>
+        </w:numPr>
+      </w:pPr>
+      <w:r>
+        <w:t>Gradle, wrapper, tests, assets, and scripts remain because they are required to reproduce and verify the two APKs.</w:t>
+      </w:r>
+    </w:p>
+    <w:p>
+      <w:pPr>
+        <w:numPr>
+          <w:ilvl w:val="0"/>
+          <w:numId w:val="10"/>
+        </w:numPr>
+      </w:pPr>
+      <w:r>
+        <w:t>Only four duplicate or experimental APK files were removed. The canonical binaries are install/tremola/whiteboard.apk and install/tinyssb/whiteboard.apk.</w:t>
+      </w:r>
+    </w:p>
+    <w:p>
+      <w:pPr>
+        <w:pStyle w:val="Heading2"/>
+      </w:pPr>
+      <w:r>
+        <w:t>How a future Uni merge would work</w:t>
+      </w:r>
+    </w:p>
+    <w:p>
+      <w:r>
+        <w:t>The Tremola repository contains the complete modified host and can be compared with cn-uofbasel/tremola. A reviewed integration must carry the mini-app, WebView bridge, Room schema, board protocol, BLE transport, permissions, activity, tests, and build files together.</w:t>
+      </w:r>
+    </w:p>
+    <w:p>
+      <w:r>
+        <w:t>The tinySSB integration is intentionally patch-based. Its build script checks out pinned official commit 39896b72, applies the local integration, BLE startup, and export patches, adds the shared board files, and produces the APK. This makes future upstream updates easier to review without storing a second full generated source tree.</w:t>
+      </w:r>
+    </w:p>
+    <w:p>
+      <w:pPr>
+        <w:spacing w:before="100" w:after="140"/>
+        <w:ind w:left="160" w:right="160"/>
+        <w:shd w:fill="EAF3F7"/>
+        <w:pBdr>
+          <w:left w:val="single" w:sz="18" w:space="7" w:color="2F6F83"/>
+        </w:pBdr>
+      </w:pPr>
+      <w:r>
+        <w:rPr>
+          <w:b/>
+        </w:rPr>
+        <w:t>Submission rule</w:t>
+        <w:br/>
+      </w:r>
+      <w:r>
+        <w:t>Submit the full repository and identify the exact tested APK hash. The mini-app folder alone is not a complete Android or BLE implementation.</w:t>
+      </w:r>
+    </w:p>
+    <w:p>
+      <w:pPr>
+        <w:pStyle w:val="TableSource"/>
+      </w:pPr>
+      <w:r>
+        <w:t xml:space="preserve">Repository: </w:t>
+      </w:r>
+      <w:hyperlink r:id="rId48" w:history="1">
+        <w:r>
+          <w:rPr>
+            <w:color w:val="0563C1"/>
+            <w:u w:val="single"/>
+          </w:rPr>
+          <w:t>Repository structure and merge guide</w:t>
+        </w:r>
+      </w:hyperlink>
+      <w:r>
+        <w:t xml:space="preserve">  |  </w:t>
+      </w:r>
+      <w:hyperlink r:id="rId18" w:history="1">
+        <w:r>
+          <w:rPr>
+            <w:color w:val="0563C1"/>
+            <w:u w:val="single"/>
+          </w:rPr>
+          <w:t>Install and physical test guide</w:t>
+        </w:r>
+      </w:hyperlink>
+      <w:r>
+        <w:t xml:space="preserve">  |  </w:t>
+      </w:r>
+      <w:hyperlink r:id="rId14" w:history="1">
+        <w:r>
+          <w:rPr>
+            <w:color w:val="0563C1"/>
+            <w:u w:val="single"/>
+          </w:rPr>
+          <w:t>Technical overview</w:t>
+        </w:r>
+      </w:hyperlink>
+      <w:r>
+        <w:t xml:space="preserve">  |  </w:t>
+      </w:r>
+      <w:hyperlink r:id="rId30" w:history="1">
+        <w:r>
+          <w:rPr>
+            <w:color w:val="0563C1"/>
+            <w:u w:val="single"/>
+          </w:rPr>
+          <w:t>Report basis</w:t>
+        </w:r>
+      </w:hyperlink>
+    </w:p>
     <w:sectPr>
       <w:headerReference w:type="default" r:id="rId9"/>
       <w:headerReference w:type="first" r:id="rId10"/>
@@ -12303,6 +15842,36 @@
   </w:abstractNum>
   <w:num w:numId="16">
     <w:abstractNumId w:val="15"/>
+  </w:num>
+  <w:num w:numId="17">
+    <w:abstractNumId w:val="13"/>
+    <w:lvlOverride w:ilvl="0">
+      <w:startOverride w:val="1"/>
+    </w:lvlOverride>
+  </w:num>
+  <w:num w:numId="18">
+    <w:abstractNumId w:val="13"/>
+    <w:lvlOverride w:ilvl="0">
+      <w:startOverride w:val="1"/>
+    </w:lvlOverride>
+  </w:num>
+  <w:num w:numId="19">
+    <w:abstractNumId w:val="13"/>
+    <w:lvlOverride w:ilvl="0">
+      <w:startOverride w:val="1"/>
+    </w:lvlOverride>
+  </w:num>
+  <w:num w:numId="20">
+    <w:abstractNumId w:val="13"/>
+    <w:lvlOverride w:ilvl="0">
+      <w:startOverride w:val="1"/>
+    </w:lvlOverride>
+  </w:num>
+  <w:num w:numId="21">
+    <w:abstractNumId w:val="13"/>
+    <w:lvlOverride w:ilvl="0">
+      <w:startOverride w:val="1"/>
+    </w:lvlOverride>
   </w:num>
 </w:numbering>
 </file>

</xml_diff>